<commit_message>
TC-02 - Eliminar de verdad y responder con semantica HTTP
</commit_message>
<xml_diff>
--- a/TacoCloud - Pruebas funcionales.docx
+++ b/TacoCloud - Pruebas funcionales.docx
@@ -11,23 +11,13 @@
           <w:szCs w:val="48"/>
         </w:rPr>
       </w:pPr>
-      <w:proofErr w:type="spellStart"/>
       <w:r>
         <w:rPr>
           <w:rFonts w:asciiTheme="majorHAnsi" w:hAnsiTheme="majorHAnsi"/>
           <w:sz w:val="48"/>
           <w:szCs w:val="48"/>
         </w:rPr>
-        <w:t>TacoCloud</w:t>
-      </w:r>
-      <w:proofErr w:type="spellEnd"/>
-      <w:r>
-        <w:rPr>
-          <w:rFonts w:asciiTheme="majorHAnsi" w:hAnsiTheme="majorHAnsi"/>
-          <w:sz w:val="48"/>
-          <w:szCs w:val="48"/>
-        </w:rPr>
-        <w:t xml:space="preserve"> – Retos Funcionales</w:t>
+        <w:t>TacoCloud – Retos Funcionales</w:t>
       </w:r>
     </w:p>
     <w:p>
@@ -53,7 +43,13 @@
     <w:sdt>
       <w:sdtPr>
         <w:rPr>
-          <w:lang w:val="es-ES"/>
+          <w:rFonts w:asciiTheme="minorHAnsi" w:eastAsiaTheme="minorHAnsi" w:hAnsiTheme="minorHAnsi" w:cstheme="minorBidi"/>
+          <w:color w:val="auto"/>
+          <w:kern w:val="2"/>
+          <w:sz w:val="22"/>
+          <w:szCs w:val="22"/>
+          <w:lang w:val="es-ES" w:eastAsia="en-US"/>
+          <w14:ligatures w14:val="standardContextual"/>
         </w:rPr>
         <w:id w:val="502853618"/>
         <w:docPartObj>
@@ -63,15 +59,8 @@
       </w:sdtPr>
       <w:sdtEndPr>
         <w:rPr>
-          <w:rFonts w:asciiTheme="minorHAnsi" w:eastAsiaTheme="minorHAnsi" w:hAnsiTheme="minorHAnsi" w:cstheme="minorBidi"/>
           <w:b/>
           <w:bCs/>
-          <w:color w:val="auto"/>
-          <w:kern w:val="2"/>
-          <w:sz w:val="22"/>
-          <w:szCs w:val="22"/>
-          <w:lang w:eastAsia="en-US"/>
-          <w14:ligatures w14:val="standardContextual"/>
         </w:rPr>
       </w:sdtEndPr>
       <w:sdtContent>
@@ -272,15 +261,7 @@
     </w:p>
     <w:p>
       <w:r>
-        <w:t xml:space="preserve">Dentro de tacocloud-api/src/main/java/tacos/web/api/IngredientController.java se modificó la petición </w:t>
-      </w:r>
-      <w:proofErr w:type="spellStart"/>
-      <w:r>
-        <w:t>put</w:t>
-      </w:r>
-      <w:proofErr w:type="spellEnd"/>
-      <w:r>
-        <w:t xml:space="preserve"> para cumplir con las pruebas de integración:</w:t>
+        <w:t>Dentro de tacocloud-api/src/main/java/tacos/web/api/IngredientController.java se modificó la petición put para cumplir con las pruebas de integración:</w:t>
       </w:r>
     </w:p>
     <w:p>
@@ -294,16 +275,8 @@
         <w:rPr>
           <w:rFonts w:ascii="Arial" w:hAnsi="Arial" w:cs="Arial"/>
         </w:rPr>
-        <w:t xml:space="preserve">//TC-01 - Actualizar un ingrediente sin perder el </w:t>
-      </w:r>
-      <w:proofErr w:type="spellStart"/>
-      <w:r>
-        <w:rPr>
-          <w:rFonts w:ascii="Arial" w:hAnsi="Arial" w:cs="Arial"/>
-        </w:rPr>
-        <w:t>publisher</w:t>
-      </w:r>
-      <w:proofErr w:type="spellEnd"/>
+        <w:t>//TC-01 - Actualizar un ingrediente sin perder el publisher</w:t>
+      </w:r>
     </w:p>
     <w:p>
       <w:pPr>
@@ -319,21 +292,12 @@
         </w:rPr>
         <w:t xml:space="preserve">  </w:t>
       </w:r>
-      <w:proofErr w:type="gramStart"/>
-      <w:r>
-        <w:rPr>
-          <w:rFonts w:ascii="Arial" w:hAnsi="Arial" w:cs="Arial"/>
-          <w:lang w:val="en-US"/>
-        </w:rPr>
-        <w:t>@PutMapping</w:t>
-      </w:r>
-      <w:proofErr w:type="gramEnd"/>
-      <w:r>
-        <w:rPr>
-          <w:rFonts w:ascii="Arial" w:hAnsi="Arial" w:cs="Arial"/>
-          <w:lang w:val="en-US"/>
-        </w:rPr>
-        <w:t>("/{id}")</w:t>
+      <w:r>
+        <w:rPr>
+          <w:rFonts w:ascii="Arial" w:hAnsi="Arial" w:cs="Arial"/>
+          <w:lang w:val="en-US"/>
+        </w:rPr>
+        <w:t>@PutMapping("/{id}")</w:t>
       </w:r>
     </w:p>
     <w:p>
@@ -349,39 +313,7 @@
           <w:rFonts w:ascii="Arial" w:hAnsi="Arial" w:cs="Arial"/>
           <w:lang w:val="en-US"/>
         </w:rPr>
-        <w:t xml:space="preserve">  public Mono&lt;</w:t>
-      </w:r>
-      <w:proofErr w:type="spellStart"/>
-      <w:r>
-        <w:rPr>
-          <w:rFonts w:ascii="Arial" w:hAnsi="Arial" w:cs="Arial"/>
-          <w:lang w:val="en-US"/>
-        </w:rPr>
-        <w:t>ResponseEntity</w:t>
-      </w:r>
-      <w:proofErr w:type="spellEnd"/>
-      <w:r>
-        <w:rPr>
-          <w:rFonts w:ascii="Arial" w:hAnsi="Arial" w:cs="Arial"/>
-          <w:lang w:val="en-US"/>
-        </w:rPr>
-        <w:t xml:space="preserve">&lt;Ingredient&gt;&gt; </w:t>
-      </w:r>
-      <w:proofErr w:type="spellStart"/>
-      <w:r>
-        <w:rPr>
-          <w:rFonts w:ascii="Arial" w:hAnsi="Arial" w:cs="Arial"/>
-          <w:lang w:val="en-US"/>
-        </w:rPr>
-        <w:t>updateIngredient</w:t>
-      </w:r>
-      <w:proofErr w:type="spellEnd"/>
-      <w:r>
-        <w:rPr>
-          <w:rFonts w:ascii="Arial" w:hAnsi="Arial" w:cs="Arial"/>
-          <w:lang w:val="en-US"/>
-        </w:rPr>
-        <w:t>(@PathVariable String id, @RequestBody Ingredient ingredient) {</w:t>
+        <w:t xml:space="preserve">  public Mono&lt;ResponseEntity&lt;Ingredient&gt;&gt; updateIngredient(@PathVariable String id, @RequestBody Ingredient ingredient) {</w:t>
       </w:r>
     </w:p>
     <w:p>
@@ -397,39 +329,7 @@
           <w:rFonts w:ascii="Arial" w:hAnsi="Arial" w:cs="Arial"/>
           <w:lang w:val="en-US"/>
         </w:rPr>
-        <w:t xml:space="preserve">    if (</w:t>
-      </w:r>
-      <w:proofErr w:type="spellStart"/>
-      <w:r>
-        <w:rPr>
-          <w:rFonts w:ascii="Arial" w:hAnsi="Arial" w:cs="Arial"/>
-          <w:lang w:val="en-US"/>
-        </w:rPr>
-        <w:t>ingredient.getId</w:t>
-      </w:r>
-      <w:proofErr w:type="spellEnd"/>
-      <w:r>
-        <w:rPr>
-          <w:rFonts w:ascii="Arial" w:hAnsi="Arial" w:cs="Arial"/>
-          <w:lang w:val="en-US"/>
-        </w:rPr>
-        <w:t>() != null &amp;&amp; !</w:t>
-      </w:r>
-      <w:proofErr w:type="spellStart"/>
-      <w:r>
-        <w:rPr>
-          <w:rFonts w:ascii="Arial" w:hAnsi="Arial" w:cs="Arial"/>
-          <w:lang w:val="en-US"/>
-        </w:rPr>
-        <w:t>ingredient.getId</w:t>
-      </w:r>
-      <w:proofErr w:type="spellEnd"/>
-      <w:r>
-        <w:rPr>
-          <w:rFonts w:ascii="Arial" w:hAnsi="Arial" w:cs="Arial"/>
-          <w:lang w:val="en-US"/>
-        </w:rPr>
-        <w:t>().equals(id)) {</w:t>
+        <w:t xml:space="preserve">    if (ingredient.getId() != null &amp;&amp; !ingredient.getId().equals(id)) {</w:t>
       </w:r>
     </w:p>
     <w:p>
@@ -445,39 +345,7 @@
           <w:rFonts w:ascii="Arial" w:hAnsi="Arial" w:cs="Arial"/>
           <w:lang w:val="en-US"/>
         </w:rPr>
-        <w:t xml:space="preserve">      return </w:t>
-      </w:r>
-      <w:proofErr w:type="spellStart"/>
-      <w:r>
-        <w:rPr>
-          <w:rFonts w:ascii="Arial" w:hAnsi="Arial" w:cs="Arial"/>
-          <w:lang w:val="en-US"/>
-        </w:rPr>
-        <w:t>Mono.just</w:t>
-      </w:r>
-      <w:proofErr w:type="spellEnd"/>
-      <w:r>
-        <w:rPr>
-          <w:rFonts w:ascii="Arial" w:hAnsi="Arial" w:cs="Arial"/>
-          <w:lang w:val="en-US"/>
-        </w:rPr>
-        <w:t>(</w:t>
-      </w:r>
-      <w:proofErr w:type="spellStart"/>
-      <w:r>
-        <w:rPr>
-          <w:rFonts w:ascii="Arial" w:hAnsi="Arial" w:cs="Arial"/>
-          <w:lang w:val="en-US"/>
-        </w:rPr>
-        <w:t>ResponseEntity.badRequest</w:t>
-      </w:r>
-      <w:proofErr w:type="spellEnd"/>
-      <w:r>
-        <w:rPr>
-          <w:rFonts w:ascii="Arial" w:hAnsi="Arial" w:cs="Arial"/>
-          <w:lang w:val="en-US"/>
-        </w:rPr>
-        <w:t>().build());</w:t>
+        <w:t xml:space="preserve">      return Mono.just(ResponseEntity.badRequest().build());</w:t>
       </w:r>
     </w:p>
     <w:p>
@@ -509,23 +377,7 @@
           <w:rFonts w:ascii="Arial" w:hAnsi="Arial" w:cs="Arial"/>
           <w:lang w:val="en-US"/>
         </w:rPr>
-        <w:t xml:space="preserve">    </w:t>
-      </w:r>
-      <w:proofErr w:type="spellStart"/>
-      <w:r>
-        <w:rPr>
-          <w:rFonts w:ascii="Arial" w:hAnsi="Arial" w:cs="Arial"/>
-          <w:lang w:val="en-US"/>
-        </w:rPr>
-        <w:t>ingredient.setId</w:t>
-      </w:r>
-      <w:proofErr w:type="spellEnd"/>
-      <w:r>
-        <w:rPr>
-          <w:rFonts w:ascii="Arial" w:hAnsi="Arial" w:cs="Arial"/>
-          <w:lang w:val="en-US"/>
-        </w:rPr>
-        <w:t>(id);</w:t>
+        <w:t xml:space="preserve">    ingredient.setId(id);</w:t>
       </w:r>
     </w:p>
     <w:p>
@@ -541,23 +393,7 @@
           <w:rFonts w:ascii="Arial" w:hAnsi="Arial" w:cs="Arial"/>
           <w:lang w:val="en-US"/>
         </w:rPr>
-        <w:t xml:space="preserve">    return </w:t>
-      </w:r>
-      <w:proofErr w:type="spellStart"/>
-      <w:r>
-        <w:rPr>
-          <w:rFonts w:ascii="Arial" w:hAnsi="Arial" w:cs="Arial"/>
-          <w:lang w:val="en-US"/>
-        </w:rPr>
-        <w:t>repo.findById</w:t>
-      </w:r>
-      <w:proofErr w:type="spellEnd"/>
-      <w:r>
-        <w:rPr>
-          <w:rFonts w:ascii="Arial" w:hAnsi="Arial" w:cs="Arial"/>
-          <w:lang w:val="en-US"/>
-        </w:rPr>
-        <w:t>(id)</w:t>
+        <w:t xml:space="preserve">    return repo.findById(id)</w:t>
       </w:r>
     </w:p>
     <w:p>
@@ -573,55 +409,7 @@
           <w:rFonts w:ascii="Arial" w:hAnsi="Arial" w:cs="Arial"/>
           <w:lang w:val="en-US"/>
         </w:rPr>
-        <w:t xml:space="preserve">        .</w:t>
-      </w:r>
-      <w:proofErr w:type="spellStart"/>
-      <w:r>
-        <w:rPr>
-          <w:rFonts w:ascii="Arial" w:hAnsi="Arial" w:cs="Arial"/>
-          <w:lang w:val="en-US"/>
-        </w:rPr>
-        <w:t>flatMap</w:t>
-      </w:r>
-      <w:proofErr w:type="spellEnd"/>
-      <w:r>
-        <w:rPr>
-          <w:rFonts w:ascii="Arial" w:hAnsi="Arial" w:cs="Arial"/>
-          <w:lang w:val="en-US"/>
-        </w:rPr>
-        <w:t>(</w:t>
-      </w:r>
-      <w:proofErr w:type="spellStart"/>
-      <w:r>
-        <w:rPr>
-          <w:rFonts w:ascii="Arial" w:hAnsi="Arial" w:cs="Arial"/>
-          <w:lang w:val="en-US"/>
-        </w:rPr>
-        <w:t>updatedIngredient</w:t>
-      </w:r>
-      <w:proofErr w:type="spellEnd"/>
-      <w:r>
-        <w:rPr>
-          <w:rFonts w:ascii="Arial" w:hAnsi="Arial" w:cs="Arial"/>
-          <w:lang w:val="en-US"/>
-        </w:rPr>
-        <w:t xml:space="preserve"> -&gt; </w:t>
-      </w:r>
-      <w:proofErr w:type="spellStart"/>
-      <w:r>
-        <w:rPr>
-          <w:rFonts w:ascii="Arial" w:hAnsi="Arial" w:cs="Arial"/>
-          <w:lang w:val="en-US"/>
-        </w:rPr>
-        <w:t>repo.save</w:t>
-      </w:r>
-      <w:proofErr w:type="spellEnd"/>
-      <w:r>
-        <w:rPr>
-          <w:rFonts w:ascii="Arial" w:hAnsi="Arial" w:cs="Arial"/>
-          <w:lang w:val="en-US"/>
-        </w:rPr>
-        <w:t>(ingredient))</w:t>
+        <w:t xml:space="preserve">        .flatMap(updatedIngredient -&gt; repo.save(ingredient))</w:t>
       </w:r>
     </w:p>
     <w:p>
@@ -637,23 +425,7 @@
           <w:rFonts w:ascii="Arial" w:hAnsi="Arial" w:cs="Arial"/>
           <w:lang w:val="en-US"/>
         </w:rPr>
-        <w:t xml:space="preserve">        .map(</w:t>
-      </w:r>
-      <w:proofErr w:type="spellStart"/>
-      <w:r>
-        <w:rPr>
-          <w:rFonts w:ascii="Arial" w:hAnsi="Arial" w:cs="Arial"/>
-          <w:lang w:val="en-US"/>
-        </w:rPr>
-        <w:t>ResponseEntity</w:t>
-      </w:r>
-      <w:proofErr w:type="spellEnd"/>
-      <w:r>
-        <w:rPr>
-          <w:rFonts w:ascii="Arial" w:hAnsi="Arial" w:cs="Arial"/>
-          <w:lang w:val="en-US"/>
-        </w:rPr>
-        <w:t>::ok)</w:t>
+        <w:t xml:space="preserve">        .map(ResponseEntity::ok)</w:t>
       </w:r>
     </w:p>
     <w:p>
@@ -669,39 +441,7 @@
           <w:rFonts w:ascii="Arial" w:hAnsi="Arial" w:cs="Arial"/>
           <w:lang w:val="en-US"/>
         </w:rPr>
-        <w:t xml:space="preserve">        .</w:t>
-      </w:r>
-      <w:proofErr w:type="spellStart"/>
-      <w:r>
-        <w:rPr>
-          <w:rFonts w:ascii="Arial" w:hAnsi="Arial" w:cs="Arial"/>
-          <w:lang w:val="en-US"/>
-        </w:rPr>
-        <w:t>defaultIfEmpty</w:t>
-      </w:r>
-      <w:proofErr w:type="spellEnd"/>
-      <w:r>
-        <w:rPr>
-          <w:rFonts w:ascii="Arial" w:hAnsi="Arial" w:cs="Arial"/>
-          <w:lang w:val="en-US"/>
-        </w:rPr>
-        <w:t>(</w:t>
-      </w:r>
-      <w:proofErr w:type="spellStart"/>
-      <w:r>
-        <w:rPr>
-          <w:rFonts w:ascii="Arial" w:hAnsi="Arial" w:cs="Arial"/>
-          <w:lang w:val="en-US"/>
-        </w:rPr>
-        <w:t>ResponseEntity.notFound</w:t>
-      </w:r>
-      <w:proofErr w:type="spellEnd"/>
-      <w:r>
-        <w:rPr>
-          <w:rFonts w:ascii="Arial" w:hAnsi="Arial" w:cs="Arial"/>
-          <w:lang w:val="en-US"/>
-        </w:rPr>
-        <w:t>().build());</w:t>
+        <w:t xml:space="preserve">        .defaultIfEmpty(ResponseEntity.notFound().build());</w:t>
       </w:r>
     </w:p>
     <w:p>
@@ -782,7 +522,7 @@
                     <pic:cNvPicPr/>
                   </pic:nvPicPr>
                   <pic:blipFill rotWithShape="1">
-                    <a:blip r:embed="rId5"/>
+                    <a:blip r:embed="rId6"/>
                     <a:srcRect l="25000" t="12065" b="21335"/>
                     <a:stretch>
                       <a:fillRect/>
@@ -842,7 +582,7 @@
                     <pic:cNvPicPr/>
                   </pic:nvPicPr>
                   <pic:blipFill rotWithShape="1">
-                    <a:blip r:embed="rId6"/>
+                    <a:blip r:embed="rId7"/>
                     <a:srcRect l="25000" t="8205" b="30660"/>
                     <a:stretch>
                       <a:fillRect/>
@@ -882,6 +622,9 @@
         <w:jc w:val="center"/>
       </w:pPr>
       <w:r>
+        <w:rPr>
+          <w:noProof/>
+        </w:rPr>
         <w:drawing>
           <wp:inline distT="0" distB="0" distL="0" distR="0" wp14:anchorId="017A19CE" wp14:editId="0E167889">
             <wp:extent cx="5561553" cy="2499360"/>
@@ -898,7 +641,7 @@
                     <pic:cNvPicPr/>
                   </pic:nvPicPr>
                   <pic:blipFill rotWithShape="1">
-                    <a:blip r:embed="rId7"/>
+                    <a:blip r:embed="rId8"/>
                     <a:srcRect l="25256" t="8929" b="27850"/>
                     <a:stretch>
                       <a:fillRect/>
@@ -929,7 +672,410 @@
       </w:r>
     </w:p>
     <w:p/>
-    <w:p/>
+    <w:p>
+      <w:pPr>
+        <w:pStyle w:val="Ttulo2"/>
+      </w:pPr>
+      <w:r>
+        <w:t>TC-02 – Eliminar de verdad y responder con semántica HTTP</w:t>
+      </w:r>
+    </w:p>
+    <w:p>
+      <w:pPr>
+        <w:spacing w:after="0"/>
+        <w:rPr>
+          <w:rFonts w:ascii="Arial" w:hAnsi="Arial" w:cs="Arial"/>
+        </w:rPr>
+      </w:pPr>
+      <w:r>
+        <w:rPr>
+          <w:rFonts w:ascii="Arial" w:hAnsi="Arial" w:cs="Arial"/>
+        </w:rPr>
+        <w:t>//TC-02 - Eliminar de verdad y responder con semantica HTTP</w:t>
+      </w:r>
+    </w:p>
+    <w:p>
+      <w:pPr>
+        <w:spacing w:after="0"/>
+        <w:rPr>
+          <w:rFonts w:ascii="Arial" w:hAnsi="Arial" w:cs="Arial"/>
+          <w:lang w:val="en-US"/>
+        </w:rPr>
+      </w:pPr>
+      <w:r>
+        <w:rPr>
+          <w:rFonts w:ascii="Arial" w:hAnsi="Arial" w:cs="Arial"/>
+        </w:rPr>
+        <w:t xml:space="preserve">  </w:t>
+      </w:r>
+      <w:r>
+        <w:rPr>
+          <w:rFonts w:ascii="Arial" w:hAnsi="Arial" w:cs="Arial"/>
+          <w:lang w:val="en-US"/>
+        </w:rPr>
+        <w:t>@DeleteMapping("/{id}")</w:t>
+      </w:r>
+    </w:p>
+    <w:p>
+      <w:pPr>
+        <w:spacing w:after="0"/>
+        <w:rPr>
+          <w:rFonts w:ascii="Arial" w:hAnsi="Arial" w:cs="Arial"/>
+          <w:lang w:val="en-US"/>
+        </w:rPr>
+      </w:pPr>
+      <w:r>
+        <w:rPr>
+          <w:rFonts w:ascii="Arial" w:hAnsi="Arial" w:cs="Arial"/>
+          <w:lang w:val="en-US"/>
+        </w:rPr>
+        <w:t xml:space="preserve">  public Mono&lt;ResponseEntity&lt;Void&gt;&gt; deleteIngredient(@PathVariable String id){</w:t>
+      </w:r>
+    </w:p>
+    <w:p>
+      <w:pPr>
+        <w:spacing w:after="0"/>
+        <w:rPr>
+          <w:rFonts w:ascii="Arial" w:hAnsi="Arial" w:cs="Arial"/>
+          <w:lang w:val="en-US"/>
+        </w:rPr>
+      </w:pPr>
+      <w:r>
+        <w:rPr>
+          <w:rFonts w:ascii="Arial" w:hAnsi="Arial" w:cs="Arial"/>
+          <w:lang w:val="en-US"/>
+        </w:rPr>
+        <w:t xml:space="preserve">    if(id == null || id.isEmpty()){</w:t>
+      </w:r>
+    </w:p>
+    <w:p>
+      <w:pPr>
+        <w:spacing w:after="0"/>
+        <w:rPr>
+          <w:rFonts w:ascii="Arial" w:hAnsi="Arial" w:cs="Arial"/>
+          <w:lang w:val="en-US"/>
+        </w:rPr>
+      </w:pPr>
+      <w:r>
+        <w:rPr>
+          <w:rFonts w:ascii="Arial" w:hAnsi="Arial" w:cs="Arial"/>
+          <w:lang w:val="en-US"/>
+        </w:rPr>
+        <w:t xml:space="preserve">      return Mono.just(ResponseEntity.badRequest().build());</w:t>
+      </w:r>
+    </w:p>
+    <w:p>
+      <w:pPr>
+        <w:spacing w:after="0"/>
+        <w:rPr>
+          <w:rFonts w:ascii="Arial" w:hAnsi="Arial" w:cs="Arial"/>
+          <w:lang w:val="en-US"/>
+        </w:rPr>
+      </w:pPr>
+      <w:r>
+        <w:rPr>
+          <w:rFonts w:ascii="Arial" w:hAnsi="Arial" w:cs="Arial"/>
+          <w:lang w:val="en-US"/>
+        </w:rPr>
+        <w:t xml:space="preserve">    }</w:t>
+      </w:r>
+    </w:p>
+    <w:p>
+      <w:pPr>
+        <w:spacing w:after="0"/>
+        <w:rPr>
+          <w:rFonts w:ascii="Arial" w:hAnsi="Arial" w:cs="Arial"/>
+          <w:lang w:val="en-US"/>
+        </w:rPr>
+      </w:pPr>
+      <w:r>
+        <w:rPr>
+          <w:rFonts w:ascii="Arial" w:hAnsi="Arial" w:cs="Arial"/>
+          <w:lang w:val="en-US"/>
+        </w:rPr>
+        <w:t xml:space="preserve">    return repo.findById(id)</w:t>
+      </w:r>
+    </w:p>
+    <w:p>
+      <w:pPr>
+        <w:spacing w:after="0"/>
+        <w:rPr>
+          <w:rFonts w:ascii="Arial" w:hAnsi="Arial" w:cs="Arial"/>
+          <w:lang w:val="en-US"/>
+        </w:rPr>
+      </w:pPr>
+      <w:r>
+        <w:rPr>
+          <w:rFonts w:ascii="Arial" w:hAnsi="Arial" w:cs="Arial"/>
+          <w:lang w:val="en-US"/>
+        </w:rPr>
+        <w:t xml:space="preserve">        .flatMap(ingredient -&gt; repo.delete</w:t>
+      </w:r>
+      <w:r>
+        <w:rPr>
+          <w:rFonts w:ascii="Arial" w:hAnsi="Arial" w:cs="Arial"/>
+          <w:lang w:val="en-US"/>
+        </w:rPr>
+        <w:t>ById</w:t>
+      </w:r>
+      <w:r>
+        <w:rPr>
+          <w:rFonts w:ascii="Arial" w:hAnsi="Arial" w:cs="Arial"/>
+          <w:lang w:val="en-US"/>
+        </w:rPr>
+        <w:t>(ingredient</w:t>
+      </w:r>
+      <w:r>
+        <w:rPr>
+          <w:rFonts w:ascii="Arial" w:hAnsi="Arial" w:cs="Arial"/>
+          <w:lang w:val="en-US"/>
+        </w:rPr>
+        <w:t>.getId()</w:t>
+      </w:r>
+      <w:r>
+        <w:rPr>
+          <w:rFonts w:ascii="Arial" w:hAnsi="Arial" w:cs="Arial"/>
+          <w:lang w:val="en-US"/>
+        </w:rPr>
+        <w:t>)</w:t>
+      </w:r>
+    </w:p>
+    <w:p>
+      <w:pPr>
+        <w:spacing w:after="0"/>
+        <w:rPr>
+          <w:rFonts w:ascii="Arial" w:hAnsi="Arial" w:cs="Arial"/>
+          <w:lang w:val="en-US"/>
+        </w:rPr>
+      </w:pPr>
+      <w:r>
+        <w:rPr>
+          <w:rFonts w:ascii="Arial" w:hAnsi="Arial" w:cs="Arial"/>
+          <w:lang w:val="en-US"/>
+        </w:rPr>
+        <w:t xml:space="preserve">            .then(Mono.just(ResponseEntity.noContent().&lt;Void&gt;build())))</w:t>
+      </w:r>
+    </w:p>
+    <w:p>
+      <w:pPr>
+        <w:spacing w:after="0"/>
+        <w:rPr>
+          <w:rFonts w:ascii="Arial" w:hAnsi="Arial" w:cs="Arial"/>
+          <w:lang w:val="en-US"/>
+        </w:rPr>
+      </w:pPr>
+      <w:r>
+        <w:rPr>
+          <w:rFonts w:ascii="Arial" w:hAnsi="Arial" w:cs="Arial"/>
+          <w:lang w:val="en-US"/>
+        </w:rPr>
+        <w:t xml:space="preserve">        .defaultIfEmpty(ResponseEntity.notFound().build());</w:t>
+      </w:r>
+    </w:p>
+    <w:p>
+      <w:pPr>
+        <w:spacing w:after="0"/>
+        <w:rPr>
+          <w:rFonts w:ascii="Arial" w:hAnsi="Arial" w:cs="Arial"/>
+          <w:lang w:val="en-US"/>
+        </w:rPr>
+      </w:pPr>
+      <w:r>
+        <w:rPr>
+          <w:rFonts w:ascii="Arial" w:hAnsi="Arial" w:cs="Arial"/>
+          <w:lang w:val="en-US"/>
+        </w:rPr>
+        <w:t xml:space="preserve">  }</w:t>
+      </w:r>
+    </w:p>
+    <w:p>
+      <w:pPr>
+        <w:rPr>
+          <w:lang w:val="en-US"/>
+        </w:rPr>
+      </w:pPr>
+      <w:r>
+        <w:rPr>
+          <w:rFonts w:ascii="Arial" w:hAnsi="Arial" w:cs="Arial"/>
+          <w:lang w:val="en-US"/>
+        </w:rPr>
+        <w:t xml:space="preserve">  //TC-02 - Fin</w:t>
+      </w:r>
+    </w:p>
+    <w:p>
+      <w:r>
+        <w:lastRenderedPageBreak/>
+        <w:t>Eliminando ingrediente TMTO (mostrando su existencia)</w:t>
+      </w:r>
+    </w:p>
+    <w:p>
+      <w:pPr>
+        <w:jc w:val="center"/>
+      </w:pPr>
+      <w:r>
+        <w:rPr>
+          <w:noProof/>
+        </w:rPr>
+        <w:drawing>
+          <wp:inline distT="0" distB="0" distL="0" distR="0" wp14:anchorId="4FE6A9E0" wp14:editId="7A5751AF">
+            <wp:extent cx="5539524" cy="2736506"/>
+            <wp:effectExtent l="0" t="0" r="4445" b="6985"/>
+            <wp:docPr id="121220391" name="Imagen 1"/>
+            <wp:cNvGraphicFramePr>
+              <a:graphicFrameLocks xmlns:a="http://schemas.openxmlformats.org/drawingml/2006/main" noChangeAspect="1"/>
+            </wp:cNvGraphicFramePr>
+            <a:graphic xmlns:a="http://schemas.openxmlformats.org/drawingml/2006/main">
+              <a:graphicData uri="http://schemas.openxmlformats.org/drawingml/2006/picture">
+                <pic:pic xmlns:pic="http://schemas.openxmlformats.org/drawingml/2006/picture">
+                  <pic:nvPicPr>
+                    <pic:cNvPr id="121220391" name=""/>
+                    <pic:cNvPicPr/>
+                  </pic:nvPicPr>
+                  <pic:blipFill rotWithShape="1">
+                    <a:blip r:embed="rId9"/>
+                    <a:srcRect l="25256" t="8928" b="21576"/>
+                    <a:stretch>
+                      <a:fillRect/>
+                    </a:stretch>
+                  </pic:blipFill>
+                  <pic:spPr bwMode="auto">
+                    <a:xfrm>
+                      <a:off x="0" y="0"/>
+                      <a:ext cx="5553928" cy="2743622"/>
+                    </a:xfrm>
+                    <a:prstGeom prst="rect">
+                      <a:avLst/>
+                    </a:prstGeom>
+                    <a:ln>
+                      <a:noFill/>
+                    </a:ln>
+                    <a:extLst>
+                      <a:ext uri="{53640926-AAD7-44D8-BBD7-CCE9431645EC}">
+                        <a14:shadowObscured xmlns:a14="http://schemas.microsoft.com/office/drawing/2010/main"/>
+                      </a:ext>
+                    </a:extLst>
+                  </pic:spPr>
+                </pic:pic>
+              </a:graphicData>
+            </a:graphic>
+          </wp:inline>
+        </w:drawing>
+      </w:r>
+    </w:p>
+    <w:p>
+      <w:pPr>
+        <w:jc w:val="center"/>
+      </w:pPr>
+      <w:r>
+        <w:rPr>
+          <w:noProof/>
+        </w:rPr>
+        <w:drawing>
+          <wp:inline distT="0" distB="0" distL="0" distR="0" wp14:anchorId="66F54353" wp14:editId="70A8F679">
+            <wp:extent cx="5557298" cy="2506980"/>
+            <wp:effectExtent l="0" t="0" r="5715" b="7620"/>
+            <wp:docPr id="1729889096" name="Imagen 1"/>
+            <wp:cNvGraphicFramePr>
+              <a:graphicFrameLocks xmlns:a="http://schemas.openxmlformats.org/drawingml/2006/main" noChangeAspect="1"/>
+            </wp:cNvGraphicFramePr>
+            <a:graphic xmlns:a="http://schemas.openxmlformats.org/drawingml/2006/main">
+              <a:graphicData uri="http://schemas.openxmlformats.org/drawingml/2006/picture">
+                <pic:pic xmlns:pic="http://schemas.openxmlformats.org/drawingml/2006/picture">
+                  <pic:nvPicPr>
+                    <pic:cNvPr id="1729889096" name=""/>
+                    <pic:cNvPicPr/>
+                  </pic:nvPicPr>
+                  <pic:blipFill rotWithShape="1">
+                    <a:blip r:embed="rId10"/>
+                    <a:srcRect l="25256" t="8204" b="28333"/>
+                    <a:stretch>
+                      <a:fillRect/>
+                    </a:stretch>
+                  </pic:blipFill>
+                  <pic:spPr bwMode="auto">
+                    <a:xfrm>
+                      <a:off x="0" y="0"/>
+                      <a:ext cx="5562977" cy="2509542"/>
+                    </a:xfrm>
+                    <a:prstGeom prst="rect">
+                      <a:avLst/>
+                    </a:prstGeom>
+                    <a:ln>
+                      <a:noFill/>
+                    </a:ln>
+                    <a:extLst>
+                      <a:ext uri="{53640926-AAD7-44D8-BBD7-CCE9431645EC}">
+                        <a14:shadowObscured xmlns:a14="http://schemas.microsoft.com/office/drawing/2010/main"/>
+                      </a:ext>
+                    </a:extLst>
+                  </pic:spPr>
+                </pic:pic>
+              </a:graphicData>
+            </a:graphic>
+          </wp:inline>
+        </w:drawing>
+      </w:r>
+    </w:p>
+    <w:p>
+      <w:r>
+        <w:t>Eliminando un ingrediente que no existe</w:t>
+      </w:r>
+    </w:p>
+    <w:p>
+      <w:pPr>
+        <w:jc w:val="center"/>
+      </w:pPr>
+      <w:r>
+        <w:rPr>
+          <w:noProof/>
+        </w:rPr>
+        <w:lastRenderedPageBreak/>
+        <w:drawing>
+          <wp:inline distT="0" distB="0" distL="0" distR="0" wp14:anchorId="1ED123D3" wp14:editId="113B7B13">
+            <wp:extent cx="5512754" cy="2438400"/>
+            <wp:effectExtent l="0" t="0" r="0" b="0"/>
+            <wp:docPr id="2080191831" name="Imagen 1"/>
+            <wp:cNvGraphicFramePr>
+              <a:graphicFrameLocks xmlns:a="http://schemas.openxmlformats.org/drawingml/2006/main" noChangeAspect="1"/>
+            </wp:cNvGraphicFramePr>
+            <a:graphic xmlns:a="http://schemas.openxmlformats.org/drawingml/2006/main">
+              <a:graphicData uri="http://schemas.openxmlformats.org/drawingml/2006/picture">
+                <pic:pic xmlns:pic="http://schemas.openxmlformats.org/drawingml/2006/picture">
+                  <pic:nvPicPr>
+                    <pic:cNvPr id="2080191831" name=""/>
+                    <pic:cNvPicPr/>
+                  </pic:nvPicPr>
+                  <pic:blipFill rotWithShape="1">
+                    <a:blip r:embed="rId11"/>
+                    <a:srcRect l="24872" t="8445" b="29009"/>
+                    <a:stretch>
+                      <a:fillRect/>
+                    </a:stretch>
+                  </pic:blipFill>
+                  <pic:spPr bwMode="auto">
+                    <a:xfrm>
+                      <a:off x="0" y="0"/>
+                      <a:ext cx="5518901" cy="2441119"/>
+                    </a:xfrm>
+                    <a:prstGeom prst="rect">
+                      <a:avLst/>
+                    </a:prstGeom>
+                    <a:ln>
+                      <a:noFill/>
+                    </a:ln>
+                    <a:extLst>
+                      <a:ext uri="{53640926-AAD7-44D8-BBD7-CCE9431645EC}">
+                        <a14:shadowObscured xmlns:a14="http://schemas.microsoft.com/office/drawing/2010/main"/>
+                      </a:ext>
+                    </a:extLst>
+                  </pic:spPr>
+                </pic:pic>
+              </a:graphicData>
+            </a:graphic>
+          </wp:inline>
+        </w:drawing>
+      </w:r>
+    </w:p>
     <w:sectPr>
       <w:pgSz w:w="12240" w:h="15840"/>
       <w:pgMar w:top="1440" w:right="1440" w:bottom="1440" w:left="1440" w:header="708" w:footer="708" w:gutter="0"/>
@@ -938,6 +1084,241 @@
     </w:sectPr>
   </w:body>
 </w:document>
+</file>
+
+<file path=word/numbering.xml><?xml version="1.0" encoding="utf-8"?>
+<w:numbering xmlns:wpc="http://schemas.microsoft.com/office/word/2010/wordprocessingCanvas" xmlns:cx="http://schemas.microsoft.com/office/drawing/2014/chartex" xmlns:cx1="http://schemas.microsoft.com/office/drawing/2015/9/8/chartex" xmlns:cx2="http://schemas.microsoft.com/office/drawing/2015/10/21/chartex" xmlns:cx3="http://schemas.microsoft.com/office/drawing/2016/5/9/chartex" xmlns:cx4="http://schemas.microsoft.com/office/drawing/2016/5/10/chartex" xmlns:cx5="http://schemas.microsoft.com/office/drawing/2016/5/11/chartex" xmlns:cx6="http://schemas.microsoft.com/office/drawing/2016/5/12/chartex" xmlns:cx7="http://schemas.microsoft.com/office/drawing/2016/5/13/chartex" xmlns:cx8="http://schemas.microsoft.com/office/drawing/2016/5/14/chartex" xmlns:mc="http://schemas.openxmlformats.org/markup-compatibility/2006" xmlns:aink="http://schemas.microsoft.com/office/drawing/2016/ink" xmlns:am3d="http://schemas.microsoft.com/office/drawing/2017/model3d" xmlns:o="urn:schemas-microsoft-com:office:office" xmlns:oel="http://schemas.microsoft.com/office/2019/extlst" xmlns:r="http://schemas.openxmlformats.org/officeDocument/2006/relationships" xmlns:m="http://schemas.openxmlformats.org/officeDocument/2006/math" xmlns:v="urn:schemas-microsoft-com:vml" xmlns:wp14="http://schemas.microsoft.com/office/word/2010/wordprocessingDrawing" xmlns:wp="http://schemas.openxmlformats.org/drawingml/2006/wordprocessingDrawing" xmlns:w10="urn:schemas-microsoft-com:office:word" xmlns:w="http://schemas.openxmlformats.org/wordprocessingml/2006/main" xmlns:w14="http://schemas.microsoft.com/office/word/2010/wordml" xmlns:w15="http://schemas.microsoft.com/office/word/2012/wordml" xmlns:w16cex="http://schemas.microsoft.com/office/word/2018/wordml/cex" xmlns:w16cid="http://schemas.microsoft.com/office/word/2016/wordml/cid" xmlns:w16="http://schemas.microsoft.com/office/word/2018/wordml" xmlns:w16du="http://schemas.microsoft.com/office/word/2023/wordml/word16du" xmlns:w16sdtdh="http://schemas.microsoft.com/office/word/2020/wordml/sdtdatahash" xmlns:w16sdtfl="http://schemas.microsoft.com/office/word/2024/wordml/sdtformatlock" xmlns:w16se="http://schemas.microsoft.com/office/word/2015/wordml/symex" xmlns:wpg="http://schemas.microsoft.com/office/word/2010/wordprocessingGroup" xmlns:wpi="http://schemas.microsoft.com/office/word/2010/wordprocessingInk" xmlns:wne="http://schemas.microsoft.com/office/word/2006/wordml" xmlns:wps="http://schemas.microsoft.com/office/word/2010/wordprocessingShape" mc:Ignorable="w14 w15 w16se w16cid w16 w16cex w16sdtdh w16sdtfl w16du wp14">
+  <w:abstractNum w:abstractNumId="0" w15:restartNumberingAfterBreak="0">
+    <w:nsid w:val="432C348C"/>
+    <w:multiLevelType w:val="hybridMultilevel"/>
+    <w:tmpl w:val="12BE6C9E"/>
+    <w:lvl w:ilvl="0" w:tplc="1492A950">
+      <w:numFmt w:val="bullet"/>
+      <w:lvlText w:val=""/>
+      <w:lvlJc w:val="left"/>
+      <w:pPr>
+        <w:ind w:left="720" w:hanging="360"/>
+      </w:pPr>
+      <w:rPr>
+        <w:rFonts w:ascii="Wingdings" w:eastAsiaTheme="minorHAnsi" w:hAnsi="Wingdings" w:cstheme="minorBidi" w:hint="default"/>
+      </w:rPr>
+    </w:lvl>
+    <w:lvl w:ilvl="1" w:tplc="080A0003" w:tentative="1">
+      <w:start w:val="1"/>
+      <w:numFmt w:val="bullet"/>
+      <w:lvlText w:val="o"/>
+      <w:lvlJc w:val="left"/>
+      <w:pPr>
+        <w:ind w:left="1440" w:hanging="360"/>
+      </w:pPr>
+      <w:rPr>
+        <w:rFonts w:ascii="Courier New" w:hAnsi="Courier New" w:cs="Courier New" w:hint="default"/>
+      </w:rPr>
+    </w:lvl>
+    <w:lvl w:ilvl="2" w:tplc="080A0005" w:tentative="1">
+      <w:start w:val="1"/>
+      <w:numFmt w:val="bullet"/>
+      <w:lvlText w:val=""/>
+      <w:lvlJc w:val="left"/>
+      <w:pPr>
+        <w:ind w:left="2160" w:hanging="360"/>
+      </w:pPr>
+      <w:rPr>
+        <w:rFonts w:ascii="Wingdings" w:hAnsi="Wingdings" w:hint="default"/>
+      </w:rPr>
+    </w:lvl>
+    <w:lvl w:ilvl="3" w:tplc="080A0001" w:tentative="1">
+      <w:start w:val="1"/>
+      <w:numFmt w:val="bullet"/>
+      <w:lvlText w:val=""/>
+      <w:lvlJc w:val="left"/>
+      <w:pPr>
+        <w:ind w:left="2880" w:hanging="360"/>
+      </w:pPr>
+      <w:rPr>
+        <w:rFonts w:ascii="Symbol" w:hAnsi="Symbol" w:hint="default"/>
+      </w:rPr>
+    </w:lvl>
+    <w:lvl w:ilvl="4" w:tplc="080A0003" w:tentative="1">
+      <w:start w:val="1"/>
+      <w:numFmt w:val="bullet"/>
+      <w:lvlText w:val="o"/>
+      <w:lvlJc w:val="left"/>
+      <w:pPr>
+        <w:ind w:left="3600" w:hanging="360"/>
+      </w:pPr>
+      <w:rPr>
+        <w:rFonts w:ascii="Courier New" w:hAnsi="Courier New" w:cs="Courier New" w:hint="default"/>
+      </w:rPr>
+    </w:lvl>
+    <w:lvl w:ilvl="5" w:tplc="080A0005" w:tentative="1">
+      <w:start w:val="1"/>
+      <w:numFmt w:val="bullet"/>
+      <w:lvlText w:val=""/>
+      <w:lvlJc w:val="left"/>
+      <w:pPr>
+        <w:ind w:left="4320" w:hanging="360"/>
+      </w:pPr>
+      <w:rPr>
+        <w:rFonts w:ascii="Wingdings" w:hAnsi="Wingdings" w:hint="default"/>
+      </w:rPr>
+    </w:lvl>
+    <w:lvl w:ilvl="6" w:tplc="080A0001" w:tentative="1">
+      <w:start w:val="1"/>
+      <w:numFmt w:val="bullet"/>
+      <w:lvlText w:val=""/>
+      <w:lvlJc w:val="left"/>
+      <w:pPr>
+        <w:ind w:left="5040" w:hanging="360"/>
+      </w:pPr>
+      <w:rPr>
+        <w:rFonts w:ascii="Symbol" w:hAnsi="Symbol" w:hint="default"/>
+      </w:rPr>
+    </w:lvl>
+    <w:lvl w:ilvl="7" w:tplc="080A0003" w:tentative="1">
+      <w:start w:val="1"/>
+      <w:numFmt w:val="bullet"/>
+      <w:lvlText w:val="o"/>
+      <w:lvlJc w:val="left"/>
+      <w:pPr>
+        <w:ind w:left="5760" w:hanging="360"/>
+      </w:pPr>
+      <w:rPr>
+        <w:rFonts w:ascii="Courier New" w:hAnsi="Courier New" w:cs="Courier New" w:hint="default"/>
+      </w:rPr>
+    </w:lvl>
+    <w:lvl w:ilvl="8" w:tplc="080A0005" w:tentative="1">
+      <w:start w:val="1"/>
+      <w:numFmt w:val="bullet"/>
+      <w:lvlText w:val=""/>
+      <w:lvlJc w:val="left"/>
+      <w:pPr>
+        <w:ind w:left="6480" w:hanging="360"/>
+      </w:pPr>
+      <w:rPr>
+        <w:rFonts w:ascii="Wingdings" w:hAnsi="Wingdings" w:hint="default"/>
+      </w:rPr>
+    </w:lvl>
+  </w:abstractNum>
+  <w:abstractNum w:abstractNumId="1" w15:restartNumberingAfterBreak="0">
+    <w:nsid w:val="65762FE4"/>
+    <w:multiLevelType w:val="hybridMultilevel"/>
+    <w:tmpl w:val="AD4A672E"/>
+    <w:lvl w:ilvl="0" w:tplc="E4124A8E">
+      <w:numFmt w:val="bullet"/>
+      <w:lvlText w:val=""/>
+      <w:lvlJc w:val="left"/>
+      <w:pPr>
+        <w:ind w:left="408" w:hanging="360"/>
+      </w:pPr>
+      <w:rPr>
+        <w:rFonts w:ascii="Wingdings" w:eastAsiaTheme="minorHAnsi" w:hAnsi="Wingdings" w:cstheme="minorBidi" w:hint="default"/>
+      </w:rPr>
+    </w:lvl>
+    <w:lvl w:ilvl="1" w:tplc="080A0003" w:tentative="1">
+      <w:start w:val="1"/>
+      <w:numFmt w:val="bullet"/>
+      <w:lvlText w:val="o"/>
+      <w:lvlJc w:val="left"/>
+      <w:pPr>
+        <w:ind w:left="1128" w:hanging="360"/>
+      </w:pPr>
+      <w:rPr>
+        <w:rFonts w:ascii="Courier New" w:hAnsi="Courier New" w:cs="Courier New" w:hint="default"/>
+      </w:rPr>
+    </w:lvl>
+    <w:lvl w:ilvl="2" w:tplc="080A0005" w:tentative="1">
+      <w:start w:val="1"/>
+      <w:numFmt w:val="bullet"/>
+      <w:lvlText w:val=""/>
+      <w:lvlJc w:val="left"/>
+      <w:pPr>
+        <w:ind w:left="1848" w:hanging="360"/>
+      </w:pPr>
+      <w:rPr>
+        <w:rFonts w:ascii="Wingdings" w:hAnsi="Wingdings" w:hint="default"/>
+      </w:rPr>
+    </w:lvl>
+    <w:lvl w:ilvl="3" w:tplc="080A0001" w:tentative="1">
+      <w:start w:val="1"/>
+      <w:numFmt w:val="bullet"/>
+      <w:lvlText w:val=""/>
+      <w:lvlJc w:val="left"/>
+      <w:pPr>
+        <w:ind w:left="2568" w:hanging="360"/>
+      </w:pPr>
+      <w:rPr>
+        <w:rFonts w:ascii="Symbol" w:hAnsi="Symbol" w:hint="default"/>
+      </w:rPr>
+    </w:lvl>
+    <w:lvl w:ilvl="4" w:tplc="080A0003" w:tentative="1">
+      <w:start w:val="1"/>
+      <w:numFmt w:val="bullet"/>
+      <w:lvlText w:val="o"/>
+      <w:lvlJc w:val="left"/>
+      <w:pPr>
+        <w:ind w:left="3288" w:hanging="360"/>
+      </w:pPr>
+      <w:rPr>
+        <w:rFonts w:ascii="Courier New" w:hAnsi="Courier New" w:cs="Courier New" w:hint="default"/>
+      </w:rPr>
+    </w:lvl>
+    <w:lvl w:ilvl="5" w:tplc="080A0005" w:tentative="1">
+      <w:start w:val="1"/>
+      <w:numFmt w:val="bullet"/>
+      <w:lvlText w:val=""/>
+      <w:lvlJc w:val="left"/>
+      <w:pPr>
+        <w:ind w:left="4008" w:hanging="360"/>
+      </w:pPr>
+      <w:rPr>
+        <w:rFonts w:ascii="Wingdings" w:hAnsi="Wingdings" w:hint="default"/>
+      </w:rPr>
+    </w:lvl>
+    <w:lvl w:ilvl="6" w:tplc="080A0001" w:tentative="1">
+      <w:start w:val="1"/>
+      <w:numFmt w:val="bullet"/>
+      <w:lvlText w:val=""/>
+      <w:lvlJc w:val="left"/>
+      <w:pPr>
+        <w:ind w:left="4728" w:hanging="360"/>
+      </w:pPr>
+      <w:rPr>
+        <w:rFonts w:ascii="Symbol" w:hAnsi="Symbol" w:hint="default"/>
+      </w:rPr>
+    </w:lvl>
+    <w:lvl w:ilvl="7" w:tplc="080A0003" w:tentative="1">
+      <w:start w:val="1"/>
+      <w:numFmt w:val="bullet"/>
+      <w:lvlText w:val="o"/>
+      <w:lvlJc w:val="left"/>
+      <w:pPr>
+        <w:ind w:left="5448" w:hanging="360"/>
+      </w:pPr>
+      <w:rPr>
+        <w:rFonts w:ascii="Courier New" w:hAnsi="Courier New" w:cs="Courier New" w:hint="default"/>
+      </w:rPr>
+    </w:lvl>
+    <w:lvl w:ilvl="8" w:tplc="080A0005" w:tentative="1">
+      <w:start w:val="1"/>
+      <w:numFmt w:val="bullet"/>
+      <w:lvlText w:val=""/>
+      <w:lvlJc w:val="left"/>
+      <w:pPr>
+        <w:ind w:left="6168" w:hanging="360"/>
+      </w:pPr>
+      <w:rPr>
+        <w:rFonts w:ascii="Wingdings" w:hAnsi="Wingdings" w:hint="default"/>
+      </w:rPr>
+    </w:lvl>
+  </w:abstractNum>
+  <w:num w:numId="1" w16cid:durableId="15934979">
+    <w:abstractNumId w:val="1"/>
+  </w:num>
+  <w:num w:numId="2" w16cid:durableId="2142651890">
+    <w:abstractNumId w:val="0"/>
+  </w:num>
+</w:numbering>
 </file>
 
 <file path=word/styles.xml><?xml version="1.0" encoding="utf-8"?>

</xml_diff>

<commit_message>
(feat) TC-03 - Construir Location sin localhost ni rutas locales
</commit_message>
<xml_diff>
--- a/TacoCloud - Pruebas funcionales.docx
+++ b/TacoCloud - Pruebas funcionales.docx
@@ -11,13 +11,23 @@
           <w:szCs w:val="48"/>
         </w:rPr>
       </w:pPr>
+      <w:proofErr w:type="spellStart"/>
       <w:r>
         <w:rPr>
           <w:rFonts w:asciiTheme="majorHAnsi" w:hAnsiTheme="majorHAnsi"/>
           <w:sz w:val="48"/>
           <w:szCs w:val="48"/>
         </w:rPr>
-        <w:t>TacoCloud – Retos Funcionales</w:t>
+        <w:t>TacoCloud</w:t>
+      </w:r>
+      <w:proofErr w:type="spellEnd"/>
+      <w:r>
+        <w:rPr>
+          <w:rFonts w:asciiTheme="majorHAnsi" w:hAnsiTheme="majorHAnsi"/>
+          <w:sz w:val="48"/>
+          <w:szCs w:val="48"/>
+        </w:rPr>
+        <w:t xml:space="preserve"> – Retos Funcionales</w:t>
       </w:r>
     </w:p>
     <w:p>
@@ -261,7 +271,15 @@
     </w:p>
     <w:p>
       <w:r>
-        <w:t>Dentro de tacocloud-api/src/main/java/tacos/web/api/IngredientController.java se modificó la petición put para cumplir con las pruebas de integración:</w:t>
+        <w:t xml:space="preserve">Dentro de tacocloud-api/src/main/java/tacos/web/api/IngredientController.java se modificó la petición </w:t>
+      </w:r>
+      <w:proofErr w:type="spellStart"/>
+      <w:r>
+        <w:t>put</w:t>
+      </w:r>
+      <w:proofErr w:type="spellEnd"/>
+      <w:r>
+        <w:t xml:space="preserve"> para cumplir con las pruebas de integración:</w:t>
       </w:r>
     </w:p>
     <w:p>
@@ -275,8 +293,16 @@
         <w:rPr>
           <w:rFonts w:ascii="Arial" w:hAnsi="Arial" w:cs="Arial"/>
         </w:rPr>
-        <w:t>//TC-01 - Actualizar un ingrediente sin perder el publisher</w:t>
-      </w:r>
+        <w:t xml:space="preserve">//TC-01 - Actualizar un ingrediente sin perder el </w:t>
+      </w:r>
+      <w:proofErr w:type="spellStart"/>
+      <w:r>
+        <w:rPr>
+          <w:rFonts w:ascii="Arial" w:hAnsi="Arial" w:cs="Arial"/>
+        </w:rPr>
+        <w:t>publisher</w:t>
+      </w:r>
+      <w:proofErr w:type="spellEnd"/>
     </w:p>
     <w:p>
       <w:pPr>
@@ -292,12 +318,21 @@
         </w:rPr>
         <w:t xml:space="preserve">  </w:t>
       </w:r>
-      <w:r>
-        <w:rPr>
-          <w:rFonts w:ascii="Arial" w:hAnsi="Arial" w:cs="Arial"/>
-          <w:lang w:val="en-US"/>
-        </w:rPr>
-        <w:t>@PutMapping("/{id}")</w:t>
+      <w:proofErr w:type="gramStart"/>
+      <w:r>
+        <w:rPr>
+          <w:rFonts w:ascii="Arial" w:hAnsi="Arial" w:cs="Arial"/>
+          <w:lang w:val="en-US"/>
+        </w:rPr>
+        <w:t>@PutMapping</w:t>
+      </w:r>
+      <w:proofErr w:type="gramEnd"/>
+      <w:r>
+        <w:rPr>
+          <w:rFonts w:ascii="Arial" w:hAnsi="Arial" w:cs="Arial"/>
+          <w:lang w:val="en-US"/>
+        </w:rPr>
+        <w:t>("/{id}")</w:t>
       </w:r>
     </w:p>
     <w:p>
@@ -313,7 +348,39 @@
           <w:rFonts w:ascii="Arial" w:hAnsi="Arial" w:cs="Arial"/>
           <w:lang w:val="en-US"/>
         </w:rPr>
-        <w:t xml:space="preserve">  public Mono&lt;ResponseEntity&lt;Ingredient&gt;&gt; updateIngredient(@PathVariable String id, @RequestBody Ingredient ingredient) {</w:t>
+        <w:t xml:space="preserve">  public Mono&lt;</w:t>
+      </w:r>
+      <w:proofErr w:type="spellStart"/>
+      <w:r>
+        <w:rPr>
+          <w:rFonts w:ascii="Arial" w:hAnsi="Arial" w:cs="Arial"/>
+          <w:lang w:val="en-US"/>
+        </w:rPr>
+        <w:t>ResponseEntity</w:t>
+      </w:r>
+      <w:proofErr w:type="spellEnd"/>
+      <w:r>
+        <w:rPr>
+          <w:rFonts w:ascii="Arial" w:hAnsi="Arial" w:cs="Arial"/>
+          <w:lang w:val="en-US"/>
+        </w:rPr>
+        <w:t xml:space="preserve">&lt;Ingredient&gt;&gt; </w:t>
+      </w:r>
+      <w:proofErr w:type="spellStart"/>
+      <w:r>
+        <w:rPr>
+          <w:rFonts w:ascii="Arial" w:hAnsi="Arial" w:cs="Arial"/>
+          <w:lang w:val="en-US"/>
+        </w:rPr>
+        <w:t>updateIngredient</w:t>
+      </w:r>
+      <w:proofErr w:type="spellEnd"/>
+      <w:r>
+        <w:rPr>
+          <w:rFonts w:ascii="Arial" w:hAnsi="Arial" w:cs="Arial"/>
+          <w:lang w:val="en-US"/>
+        </w:rPr>
+        <w:t>(@PathVariable String id, @RequestBody Ingredient ingredient) {</w:t>
       </w:r>
     </w:p>
     <w:p>
@@ -329,7 +396,39 @@
           <w:rFonts w:ascii="Arial" w:hAnsi="Arial" w:cs="Arial"/>
           <w:lang w:val="en-US"/>
         </w:rPr>
-        <w:t xml:space="preserve">    if (ingredient.getId() != null &amp;&amp; !ingredient.getId().equals(id)) {</w:t>
+        <w:t xml:space="preserve">    if (</w:t>
+      </w:r>
+      <w:proofErr w:type="spellStart"/>
+      <w:r>
+        <w:rPr>
+          <w:rFonts w:ascii="Arial" w:hAnsi="Arial" w:cs="Arial"/>
+          <w:lang w:val="en-US"/>
+        </w:rPr>
+        <w:t>ingredient.getId</w:t>
+      </w:r>
+      <w:proofErr w:type="spellEnd"/>
+      <w:r>
+        <w:rPr>
+          <w:rFonts w:ascii="Arial" w:hAnsi="Arial" w:cs="Arial"/>
+          <w:lang w:val="en-US"/>
+        </w:rPr>
+        <w:t>() != null &amp;&amp; !</w:t>
+      </w:r>
+      <w:proofErr w:type="spellStart"/>
+      <w:r>
+        <w:rPr>
+          <w:rFonts w:ascii="Arial" w:hAnsi="Arial" w:cs="Arial"/>
+          <w:lang w:val="en-US"/>
+        </w:rPr>
+        <w:t>ingredient.getId</w:t>
+      </w:r>
+      <w:proofErr w:type="spellEnd"/>
+      <w:r>
+        <w:rPr>
+          <w:rFonts w:ascii="Arial" w:hAnsi="Arial" w:cs="Arial"/>
+          <w:lang w:val="en-US"/>
+        </w:rPr>
+        <w:t>().equals(id)) {</w:t>
       </w:r>
     </w:p>
     <w:p>
@@ -345,7 +444,39 @@
           <w:rFonts w:ascii="Arial" w:hAnsi="Arial" w:cs="Arial"/>
           <w:lang w:val="en-US"/>
         </w:rPr>
-        <w:t xml:space="preserve">      return Mono.just(ResponseEntity.badRequest().build());</w:t>
+        <w:t xml:space="preserve">      return </w:t>
+      </w:r>
+      <w:proofErr w:type="spellStart"/>
+      <w:r>
+        <w:rPr>
+          <w:rFonts w:ascii="Arial" w:hAnsi="Arial" w:cs="Arial"/>
+          <w:lang w:val="en-US"/>
+        </w:rPr>
+        <w:t>Mono.just</w:t>
+      </w:r>
+      <w:proofErr w:type="spellEnd"/>
+      <w:r>
+        <w:rPr>
+          <w:rFonts w:ascii="Arial" w:hAnsi="Arial" w:cs="Arial"/>
+          <w:lang w:val="en-US"/>
+        </w:rPr>
+        <w:t>(</w:t>
+      </w:r>
+      <w:proofErr w:type="spellStart"/>
+      <w:r>
+        <w:rPr>
+          <w:rFonts w:ascii="Arial" w:hAnsi="Arial" w:cs="Arial"/>
+          <w:lang w:val="en-US"/>
+        </w:rPr>
+        <w:t>ResponseEntity.badRequest</w:t>
+      </w:r>
+      <w:proofErr w:type="spellEnd"/>
+      <w:r>
+        <w:rPr>
+          <w:rFonts w:ascii="Arial" w:hAnsi="Arial" w:cs="Arial"/>
+          <w:lang w:val="en-US"/>
+        </w:rPr>
+        <w:t>().build());</w:t>
       </w:r>
     </w:p>
     <w:p>
@@ -377,7 +508,23 @@
           <w:rFonts w:ascii="Arial" w:hAnsi="Arial" w:cs="Arial"/>
           <w:lang w:val="en-US"/>
         </w:rPr>
-        <w:t xml:space="preserve">    ingredient.setId(id);</w:t>
+        <w:t xml:space="preserve">    </w:t>
+      </w:r>
+      <w:proofErr w:type="spellStart"/>
+      <w:r>
+        <w:rPr>
+          <w:rFonts w:ascii="Arial" w:hAnsi="Arial" w:cs="Arial"/>
+          <w:lang w:val="en-US"/>
+        </w:rPr>
+        <w:t>ingredient.setId</w:t>
+      </w:r>
+      <w:proofErr w:type="spellEnd"/>
+      <w:r>
+        <w:rPr>
+          <w:rFonts w:ascii="Arial" w:hAnsi="Arial" w:cs="Arial"/>
+          <w:lang w:val="en-US"/>
+        </w:rPr>
+        <w:t>(id);</w:t>
       </w:r>
     </w:p>
     <w:p>
@@ -393,7 +540,23 @@
           <w:rFonts w:ascii="Arial" w:hAnsi="Arial" w:cs="Arial"/>
           <w:lang w:val="en-US"/>
         </w:rPr>
-        <w:t xml:space="preserve">    return repo.findById(id)</w:t>
+        <w:t xml:space="preserve">    return </w:t>
+      </w:r>
+      <w:proofErr w:type="spellStart"/>
+      <w:r>
+        <w:rPr>
+          <w:rFonts w:ascii="Arial" w:hAnsi="Arial" w:cs="Arial"/>
+          <w:lang w:val="en-US"/>
+        </w:rPr>
+        <w:t>repo.findById</w:t>
+      </w:r>
+      <w:proofErr w:type="spellEnd"/>
+      <w:r>
+        <w:rPr>
+          <w:rFonts w:ascii="Arial" w:hAnsi="Arial" w:cs="Arial"/>
+          <w:lang w:val="en-US"/>
+        </w:rPr>
+        <w:t>(id)</w:t>
       </w:r>
     </w:p>
     <w:p>
@@ -409,7 +572,55 @@
           <w:rFonts w:ascii="Arial" w:hAnsi="Arial" w:cs="Arial"/>
           <w:lang w:val="en-US"/>
         </w:rPr>
-        <w:t xml:space="preserve">        .flatMap(updatedIngredient -&gt; repo.save(ingredient))</w:t>
+        <w:t xml:space="preserve">        .</w:t>
+      </w:r>
+      <w:proofErr w:type="spellStart"/>
+      <w:r>
+        <w:rPr>
+          <w:rFonts w:ascii="Arial" w:hAnsi="Arial" w:cs="Arial"/>
+          <w:lang w:val="en-US"/>
+        </w:rPr>
+        <w:t>flatMap</w:t>
+      </w:r>
+      <w:proofErr w:type="spellEnd"/>
+      <w:r>
+        <w:rPr>
+          <w:rFonts w:ascii="Arial" w:hAnsi="Arial" w:cs="Arial"/>
+          <w:lang w:val="en-US"/>
+        </w:rPr>
+        <w:t>(</w:t>
+      </w:r>
+      <w:proofErr w:type="spellStart"/>
+      <w:r>
+        <w:rPr>
+          <w:rFonts w:ascii="Arial" w:hAnsi="Arial" w:cs="Arial"/>
+          <w:lang w:val="en-US"/>
+        </w:rPr>
+        <w:t>updatedIngredient</w:t>
+      </w:r>
+      <w:proofErr w:type="spellEnd"/>
+      <w:r>
+        <w:rPr>
+          <w:rFonts w:ascii="Arial" w:hAnsi="Arial" w:cs="Arial"/>
+          <w:lang w:val="en-US"/>
+        </w:rPr>
+        <w:t xml:space="preserve"> -&gt; </w:t>
+      </w:r>
+      <w:proofErr w:type="spellStart"/>
+      <w:r>
+        <w:rPr>
+          <w:rFonts w:ascii="Arial" w:hAnsi="Arial" w:cs="Arial"/>
+          <w:lang w:val="en-US"/>
+        </w:rPr>
+        <w:t>repo.save</w:t>
+      </w:r>
+      <w:proofErr w:type="spellEnd"/>
+      <w:r>
+        <w:rPr>
+          <w:rFonts w:ascii="Arial" w:hAnsi="Arial" w:cs="Arial"/>
+          <w:lang w:val="en-US"/>
+        </w:rPr>
+        <w:t>(ingredient))</w:t>
       </w:r>
     </w:p>
     <w:p>
@@ -425,7 +636,23 @@
           <w:rFonts w:ascii="Arial" w:hAnsi="Arial" w:cs="Arial"/>
           <w:lang w:val="en-US"/>
         </w:rPr>
-        <w:t xml:space="preserve">        .map(ResponseEntity::ok)</w:t>
+        <w:t xml:space="preserve">        .map(</w:t>
+      </w:r>
+      <w:proofErr w:type="spellStart"/>
+      <w:r>
+        <w:rPr>
+          <w:rFonts w:ascii="Arial" w:hAnsi="Arial" w:cs="Arial"/>
+          <w:lang w:val="en-US"/>
+        </w:rPr>
+        <w:t>ResponseEntity</w:t>
+      </w:r>
+      <w:proofErr w:type="spellEnd"/>
+      <w:r>
+        <w:rPr>
+          <w:rFonts w:ascii="Arial" w:hAnsi="Arial" w:cs="Arial"/>
+          <w:lang w:val="en-US"/>
+        </w:rPr>
+        <w:t>::ok)</w:t>
       </w:r>
     </w:p>
     <w:p>
@@ -441,7 +668,39 @@
           <w:rFonts w:ascii="Arial" w:hAnsi="Arial" w:cs="Arial"/>
           <w:lang w:val="en-US"/>
         </w:rPr>
-        <w:t xml:space="preserve">        .defaultIfEmpty(ResponseEntity.notFound().build());</w:t>
+        <w:t xml:space="preserve">        .</w:t>
+      </w:r>
+      <w:proofErr w:type="spellStart"/>
+      <w:r>
+        <w:rPr>
+          <w:rFonts w:ascii="Arial" w:hAnsi="Arial" w:cs="Arial"/>
+          <w:lang w:val="en-US"/>
+        </w:rPr>
+        <w:t>defaultIfEmpty</w:t>
+      </w:r>
+      <w:proofErr w:type="spellEnd"/>
+      <w:r>
+        <w:rPr>
+          <w:rFonts w:ascii="Arial" w:hAnsi="Arial" w:cs="Arial"/>
+          <w:lang w:val="en-US"/>
+        </w:rPr>
+        <w:t>(</w:t>
+      </w:r>
+      <w:proofErr w:type="spellStart"/>
+      <w:r>
+        <w:rPr>
+          <w:rFonts w:ascii="Arial" w:hAnsi="Arial" w:cs="Arial"/>
+          <w:lang w:val="en-US"/>
+        </w:rPr>
+        <w:t>ResponseEntity.notFound</w:t>
+      </w:r>
+      <w:proofErr w:type="spellEnd"/>
+      <w:r>
+        <w:rPr>
+          <w:rFonts w:ascii="Arial" w:hAnsi="Arial" w:cs="Arial"/>
+          <w:lang w:val="en-US"/>
+        </w:rPr>
+        <w:t>().build());</w:t>
       </w:r>
     </w:p>
     <w:p>
@@ -691,7 +950,21 @@
         <w:rPr>
           <w:rFonts w:ascii="Arial" w:hAnsi="Arial" w:cs="Arial"/>
         </w:rPr>
-        <w:t>//TC-02 - Eliminar de verdad y responder con semantica HTTP</w:t>
+        <w:t xml:space="preserve">//TC-02 - Eliminar de verdad y responder con </w:t>
+      </w:r>
+      <w:proofErr w:type="spellStart"/>
+      <w:r>
+        <w:rPr>
+          <w:rFonts w:ascii="Arial" w:hAnsi="Arial" w:cs="Arial"/>
+        </w:rPr>
+        <w:t>semantica</w:t>
+      </w:r>
+      <w:proofErr w:type="spellEnd"/>
+      <w:r>
+        <w:rPr>
+          <w:rFonts w:ascii="Arial" w:hAnsi="Arial" w:cs="Arial"/>
+        </w:rPr>
+        <w:t xml:space="preserve"> HTTP</w:t>
       </w:r>
     </w:p>
     <w:p>
@@ -708,12 +981,21 @@
         </w:rPr>
         <w:t xml:space="preserve">  </w:t>
       </w:r>
-      <w:r>
-        <w:rPr>
-          <w:rFonts w:ascii="Arial" w:hAnsi="Arial" w:cs="Arial"/>
-          <w:lang w:val="en-US"/>
-        </w:rPr>
-        <w:t>@DeleteMapping("/{id}")</w:t>
+      <w:proofErr w:type="gramStart"/>
+      <w:r>
+        <w:rPr>
+          <w:rFonts w:ascii="Arial" w:hAnsi="Arial" w:cs="Arial"/>
+          <w:lang w:val="en-US"/>
+        </w:rPr>
+        <w:t>@DeleteMapping</w:t>
+      </w:r>
+      <w:proofErr w:type="gramEnd"/>
+      <w:r>
+        <w:rPr>
+          <w:rFonts w:ascii="Arial" w:hAnsi="Arial" w:cs="Arial"/>
+          <w:lang w:val="en-US"/>
+        </w:rPr>
+        <w:t>("/{id}")</w:t>
       </w:r>
     </w:p>
     <w:p>
@@ -729,7 +1011,39 @@
           <w:rFonts w:ascii="Arial" w:hAnsi="Arial" w:cs="Arial"/>
           <w:lang w:val="en-US"/>
         </w:rPr>
-        <w:t xml:space="preserve">  public Mono&lt;ResponseEntity&lt;Void&gt;&gt; deleteIngredient(@PathVariable String id){</w:t>
+        <w:t xml:space="preserve">  public Mono&lt;</w:t>
+      </w:r>
+      <w:proofErr w:type="spellStart"/>
+      <w:r>
+        <w:rPr>
+          <w:rFonts w:ascii="Arial" w:hAnsi="Arial" w:cs="Arial"/>
+          <w:lang w:val="en-US"/>
+        </w:rPr>
+        <w:t>ResponseEntity</w:t>
+      </w:r>
+      <w:proofErr w:type="spellEnd"/>
+      <w:r>
+        <w:rPr>
+          <w:rFonts w:ascii="Arial" w:hAnsi="Arial" w:cs="Arial"/>
+          <w:lang w:val="en-US"/>
+        </w:rPr>
+        <w:t xml:space="preserve">&lt;Void&gt;&gt; </w:t>
+      </w:r>
+      <w:proofErr w:type="spellStart"/>
+      <w:r>
+        <w:rPr>
+          <w:rFonts w:ascii="Arial" w:hAnsi="Arial" w:cs="Arial"/>
+          <w:lang w:val="en-US"/>
+        </w:rPr>
+        <w:t>deleteIngredient</w:t>
+      </w:r>
+      <w:proofErr w:type="spellEnd"/>
+      <w:r>
+        <w:rPr>
+          <w:rFonts w:ascii="Arial" w:hAnsi="Arial" w:cs="Arial"/>
+          <w:lang w:val="en-US"/>
+        </w:rPr>
+        <w:t>(@PathVariable String id){</w:t>
       </w:r>
     </w:p>
     <w:p>
@@ -745,7 +1059,23 @@
           <w:rFonts w:ascii="Arial" w:hAnsi="Arial" w:cs="Arial"/>
           <w:lang w:val="en-US"/>
         </w:rPr>
-        <w:t xml:space="preserve">    if(id == null || id.isEmpty()){</w:t>
+        <w:t xml:space="preserve">    if(id == null || </w:t>
+      </w:r>
+      <w:proofErr w:type="spellStart"/>
+      <w:r>
+        <w:rPr>
+          <w:rFonts w:ascii="Arial" w:hAnsi="Arial" w:cs="Arial"/>
+          <w:lang w:val="en-US"/>
+        </w:rPr>
+        <w:t>id.isEmpty</w:t>
+      </w:r>
+      <w:proofErr w:type="spellEnd"/>
+      <w:r>
+        <w:rPr>
+          <w:rFonts w:ascii="Arial" w:hAnsi="Arial" w:cs="Arial"/>
+          <w:lang w:val="en-US"/>
+        </w:rPr>
+        <w:t>()){</w:t>
       </w:r>
     </w:p>
     <w:p>
@@ -761,7 +1091,39 @@
           <w:rFonts w:ascii="Arial" w:hAnsi="Arial" w:cs="Arial"/>
           <w:lang w:val="en-US"/>
         </w:rPr>
-        <w:t xml:space="preserve">      return Mono.just(ResponseEntity.badRequest().build());</w:t>
+        <w:t xml:space="preserve">      return </w:t>
+      </w:r>
+      <w:proofErr w:type="spellStart"/>
+      <w:r>
+        <w:rPr>
+          <w:rFonts w:ascii="Arial" w:hAnsi="Arial" w:cs="Arial"/>
+          <w:lang w:val="en-US"/>
+        </w:rPr>
+        <w:t>Mono.just</w:t>
+      </w:r>
+      <w:proofErr w:type="spellEnd"/>
+      <w:r>
+        <w:rPr>
+          <w:rFonts w:ascii="Arial" w:hAnsi="Arial" w:cs="Arial"/>
+          <w:lang w:val="en-US"/>
+        </w:rPr>
+        <w:t>(</w:t>
+      </w:r>
+      <w:proofErr w:type="spellStart"/>
+      <w:r>
+        <w:rPr>
+          <w:rFonts w:ascii="Arial" w:hAnsi="Arial" w:cs="Arial"/>
+          <w:lang w:val="en-US"/>
+        </w:rPr>
+        <w:t>ResponseEntity.badRequest</w:t>
+      </w:r>
+      <w:proofErr w:type="spellEnd"/>
+      <w:r>
+        <w:rPr>
+          <w:rFonts w:ascii="Arial" w:hAnsi="Arial" w:cs="Arial"/>
+          <w:lang w:val="en-US"/>
+        </w:rPr>
+        <w:t>().build());</w:t>
       </w:r>
     </w:p>
     <w:p>
@@ -793,7 +1155,23 @@
           <w:rFonts w:ascii="Arial" w:hAnsi="Arial" w:cs="Arial"/>
           <w:lang w:val="en-US"/>
         </w:rPr>
-        <w:t xml:space="preserve">    return repo.findById(id)</w:t>
+        <w:t xml:space="preserve">    return </w:t>
+      </w:r>
+      <w:proofErr w:type="spellStart"/>
+      <w:r>
+        <w:rPr>
+          <w:rFonts w:ascii="Arial" w:hAnsi="Arial" w:cs="Arial"/>
+          <w:lang w:val="en-US"/>
+        </w:rPr>
+        <w:t>repo.findById</w:t>
+      </w:r>
+      <w:proofErr w:type="spellEnd"/>
+      <w:r>
+        <w:rPr>
+          <w:rFonts w:ascii="Arial" w:hAnsi="Arial" w:cs="Arial"/>
+          <w:lang w:val="en-US"/>
+        </w:rPr>
+        <w:t>(id)</w:t>
       </w:r>
     </w:p>
     <w:p>
@@ -809,7 +1187,31 @@
           <w:rFonts w:ascii="Arial" w:hAnsi="Arial" w:cs="Arial"/>
           <w:lang w:val="en-US"/>
         </w:rPr>
-        <w:t xml:space="preserve">        .flatMap(ingredient -&gt; repo.delete</w:t>
+        <w:t xml:space="preserve">        .</w:t>
+      </w:r>
+      <w:proofErr w:type="spellStart"/>
+      <w:r>
+        <w:rPr>
+          <w:rFonts w:ascii="Arial" w:hAnsi="Arial" w:cs="Arial"/>
+          <w:lang w:val="en-US"/>
+        </w:rPr>
+        <w:t>flatMap</w:t>
+      </w:r>
+      <w:proofErr w:type="spellEnd"/>
+      <w:r>
+        <w:rPr>
+          <w:rFonts w:ascii="Arial" w:hAnsi="Arial" w:cs="Arial"/>
+          <w:lang w:val="en-US"/>
+        </w:rPr>
+        <w:t xml:space="preserve">(ingredient -&gt; </w:t>
+      </w:r>
+      <w:proofErr w:type="spellStart"/>
+      <w:r>
+        <w:rPr>
+          <w:rFonts w:ascii="Arial" w:hAnsi="Arial" w:cs="Arial"/>
+          <w:lang w:val="en-US"/>
+        </w:rPr>
+        <w:t>repo.delete</w:t>
       </w:r>
       <w:r>
         <w:rPr>
@@ -818,19 +1220,36 @@
         </w:rPr>
         <w:t>ById</w:t>
       </w:r>
-      <w:r>
-        <w:rPr>
-          <w:rFonts w:ascii="Arial" w:hAnsi="Arial" w:cs="Arial"/>
-          <w:lang w:val="en-US"/>
-        </w:rPr>
-        <w:t>(ingredient</w:t>
-      </w:r>
-      <w:r>
-        <w:rPr>
-          <w:rFonts w:ascii="Arial" w:hAnsi="Arial" w:cs="Arial"/>
-          <w:lang w:val="en-US"/>
-        </w:rPr>
-        <w:t>.getId()</w:t>
+      <w:proofErr w:type="spellEnd"/>
+      <w:r>
+        <w:rPr>
+          <w:rFonts w:ascii="Arial" w:hAnsi="Arial" w:cs="Arial"/>
+          <w:lang w:val="en-US"/>
+        </w:rPr>
+        <w:t>(</w:t>
+      </w:r>
+      <w:proofErr w:type="spellStart"/>
+      <w:r>
+        <w:rPr>
+          <w:rFonts w:ascii="Arial" w:hAnsi="Arial" w:cs="Arial"/>
+          <w:lang w:val="en-US"/>
+        </w:rPr>
+        <w:t>ingredient</w:t>
+      </w:r>
+      <w:r>
+        <w:rPr>
+          <w:rFonts w:ascii="Arial" w:hAnsi="Arial" w:cs="Arial"/>
+          <w:lang w:val="en-US"/>
+        </w:rPr>
+        <w:t>.getId</w:t>
+      </w:r>
+      <w:proofErr w:type="spellEnd"/>
+      <w:r>
+        <w:rPr>
+          <w:rFonts w:ascii="Arial" w:hAnsi="Arial" w:cs="Arial"/>
+          <w:lang w:val="en-US"/>
+        </w:rPr>
+        <w:t>()</w:t>
       </w:r>
       <w:r>
         <w:rPr>
@@ -853,7 +1272,39 @@
           <w:rFonts w:ascii="Arial" w:hAnsi="Arial" w:cs="Arial"/>
           <w:lang w:val="en-US"/>
         </w:rPr>
-        <w:t xml:space="preserve">            .then(Mono.just(ResponseEntity.noContent().&lt;Void&gt;build())))</w:t>
+        <w:t xml:space="preserve">            .then(</w:t>
+      </w:r>
+      <w:proofErr w:type="spellStart"/>
+      <w:r>
+        <w:rPr>
+          <w:rFonts w:ascii="Arial" w:hAnsi="Arial" w:cs="Arial"/>
+          <w:lang w:val="en-US"/>
+        </w:rPr>
+        <w:t>Mono.just</w:t>
+      </w:r>
+      <w:proofErr w:type="spellEnd"/>
+      <w:r>
+        <w:rPr>
+          <w:rFonts w:ascii="Arial" w:hAnsi="Arial" w:cs="Arial"/>
+          <w:lang w:val="en-US"/>
+        </w:rPr>
+        <w:t>(</w:t>
+      </w:r>
+      <w:proofErr w:type="spellStart"/>
+      <w:r>
+        <w:rPr>
+          <w:rFonts w:ascii="Arial" w:hAnsi="Arial" w:cs="Arial"/>
+          <w:lang w:val="en-US"/>
+        </w:rPr>
+        <w:t>ResponseEntity.noContent</w:t>
+      </w:r>
+      <w:proofErr w:type="spellEnd"/>
+      <w:r>
+        <w:rPr>
+          <w:rFonts w:ascii="Arial" w:hAnsi="Arial" w:cs="Arial"/>
+          <w:lang w:val="en-US"/>
+        </w:rPr>
+        <w:t>().&lt;Void&gt;build())))</w:t>
       </w:r>
     </w:p>
     <w:p>
@@ -869,7 +1320,39 @@
           <w:rFonts w:ascii="Arial" w:hAnsi="Arial" w:cs="Arial"/>
           <w:lang w:val="en-US"/>
         </w:rPr>
-        <w:t xml:space="preserve">        .defaultIfEmpty(ResponseEntity.notFound().build());</w:t>
+        <w:t xml:space="preserve">        .</w:t>
+      </w:r>
+      <w:proofErr w:type="spellStart"/>
+      <w:r>
+        <w:rPr>
+          <w:rFonts w:ascii="Arial" w:hAnsi="Arial" w:cs="Arial"/>
+          <w:lang w:val="en-US"/>
+        </w:rPr>
+        <w:t>defaultIfEmpty</w:t>
+      </w:r>
+      <w:proofErr w:type="spellEnd"/>
+      <w:r>
+        <w:rPr>
+          <w:rFonts w:ascii="Arial" w:hAnsi="Arial" w:cs="Arial"/>
+          <w:lang w:val="en-US"/>
+        </w:rPr>
+        <w:t>(</w:t>
+      </w:r>
+      <w:proofErr w:type="spellStart"/>
+      <w:r>
+        <w:rPr>
+          <w:rFonts w:ascii="Arial" w:hAnsi="Arial" w:cs="Arial"/>
+          <w:lang w:val="en-US"/>
+        </w:rPr>
+        <w:t>ResponseEntity.notFound</w:t>
+      </w:r>
+      <w:proofErr w:type="spellEnd"/>
+      <w:r>
+        <w:rPr>
+          <w:rFonts w:ascii="Arial" w:hAnsi="Arial" w:cs="Arial"/>
+          <w:lang w:val="en-US"/>
+        </w:rPr>
+        <w:t>().build());</w:t>
       </w:r>
     </w:p>
     <w:p>
@@ -1076,6 +1559,591 @@
         </w:drawing>
       </w:r>
     </w:p>
+    <w:p>
+      <w:pPr>
+        <w:jc w:val="center"/>
+      </w:pPr>
+    </w:p>
+    <w:p>
+      <w:pPr>
+        <w:pStyle w:val="Ttulo2"/>
+      </w:pPr>
+      <w:r>
+        <w:t xml:space="preserve">TC-03 – Construir </w:t>
+      </w:r>
+      <w:proofErr w:type="spellStart"/>
+      <w:r>
+        <w:t>Location</w:t>
+      </w:r>
+      <w:proofErr w:type="spellEnd"/>
+      <w:r>
+        <w:t xml:space="preserve"> sin localhost ni rutas rotas</w:t>
+      </w:r>
+    </w:p>
+    <w:p>
+      <w:pPr>
+        <w:spacing w:after="0"/>
+        <w:rPr>
+          <w:rFonts w:ascii="Arial" w:hAnsi="Arial" w:cs="Arial"/>
+        </w:rPr>
+      </w:pPr>
+      <w:r>
+        <w:rPr>
+          <w:rFonts w:ascii="Arial" w:hAnsi="Arial" w:cs="Arial"/>
+        </w:rPr>
+        <w:t xml:space="preserve">//TC-03 - Construir </w:t>
+      </w:r>
+      <w:proofErr w:type="spellStart"/>
+      <w:r>
+        <w:rPr>
+          <w:rFonts w:ascii="Arial" w:hAnsi="Arial" w:cs="Arial"/>
+        </w:rPr>
+        <w:t>Location</w:t>
+      </w:r>
+      <w:proofErr w:type="spellEnd"/>
+      <w:r>
+        <w:rPr>
+          <w:rFonts w:ascii="Arial" w:hAnsi="Arial" w:cs="Arial"/>
+        </w:rPr>
+        <w:t xml:space="preserve"> sin localhost ni rutas rotas</w:t>
+      </w:r>
+    </w:p>
+    <w:p>
+      <w:pPr>
+        <w:spacing w:after="0"/>
+        <w:rPr>
+          <w:rFonts w:ascii="Arial" w:hAnsi="Arial" w:cs="Arial"/>
+          <w:lang w:val="en-US"/>
+        </w:rPr>
+      </w:pPr>
+      <w:proofErr w:type="gramStart"/>
+      <w:r>
+        <w:rPr>
+          <w:rFonts w:ascii="Arial" w:hAnsi="Arial" w:cs="Arial"/>
+          <w:lang w:val="en-US"/>
+        </w:rPr>
+        <w:t>@PostMapping</w:t>
+      </w:r>
+      <w:proofErr w:type="gramEnd"/>
+    </w:p>
+    <w:p>
+      <w:pPr>
+        <w:spacing w:after="0"/>
+        <w:rPr>
+          <w:rFonts w:ascii="Arial" w:hAnsi="Arial" w:cs="Arial"/>
+          <w:lang w:val="en-US"/>
+        </w:rPr>
+      </w:pPr>
+      <w:r>
+        <w:rPr>
+          <w:rFonts w:ascii="Arial" w:hAnsi="Arial" w:cs="Arial"/>
+          <w:lang w:val="en-US"/>
+        </w:rPr>
+        <w:t xml:space="preserve">  public Mono </w:t>
+      </w:r>
+      <w:proofErr w:type="spellStart"/>
+      <w:r>
+        <w:rPr>
+          <w:rFonts w:ascii="Arial" w:hAnsi="Arial" w:cs="Arial"/>
+          <w:lang w:val="en-US"/>
+        </w:rPr>
+        <w:t>postIngredient</w:t>
+      </w:r>
+      <w:proofErr w:type="spellEnd"/>
+      <w:r>
+        <w:rPr>
+          <w:rFonts w:ascii="Arial" w:hAnsi="Arial" w:cs="Arial"/>
+          <w:lang w:val="en-US"/>
+        </w:rPr>
+        <w:t>(@</w:t>
+      </w:r>
+      <w:proofErr w:type="gramStart"/>
+      <w:r>
+        <w:rPr>
+          <w:rFonts w:ascii="Arial" w:hAnsi="Arial" w:cs="Arial"/>
+          <w:lang w:val="en-US"/>
+        </w:rPr>
+        <w:t>RequestBody @</w:t>
+      </w:r>
+      <w:proofErr w:type="gramEnd"/>
+      <w:r>
+        <w:rPr>
+          <w:rFonts w:ascii="Arial" w:hAnsi="Arial" w:cs="Arial"/>
+          <w:lang w:val="en-US"/>
+        </w:rPr>
+        <w:t xml:space="preserve">Valid Ingredient </w:t>
+      </w:r>
+      <w:proofErr w:type="spellStart"/>
+      <w:r>
+        <w:rPr>
+          <w:rFonts w:ascii="Arial" w:hAnsi="Arial" w:cs="Arial"/>
+          <w:lang w:val="en-US"/>
+        </w:rPr>
+        <w:t>ingredient</w:t>
+      </w:r>
+      <w:proofErr w:type="spellEnd"/>
+      <w:r>
+        <w:rPr>
+          <w:rFonts w:ascii="Arial" w:hAnsi="Arial" w:cs="Arial"/>
+          <w:lang w:val="en-US"/>
+        </w:rPr>
+        <w:t xml:space="preserve">, </w:t>
+      </w:r>
+      <w:proofErr w:type="spellStart"/>
+      <w:r>
+        <w:rPr>
+          <w:rFonts w:ascii="Arial" w:hAnsi="Arial" w:cs="Arial"/>
+          <w:lang w:val="en-US"/>
+        </w:rPr>
+        <w:t>UriComponentsBuilder</w:t>
+      </w:r>
+      <w:proofErr w:type="spellEnd"/>
+      <w:r>
+        <w:rPr>
+          <w:rFonts w:ascii="Arial" w:hAnsi="Arial" w:cs="Arial"/>
+          <w:lang w:val="en-US"/>
+        </w:rPr>
+        <w:t xml:space="preserve"> </w:t>
+      </w:r>
+      <w:proofErr w:type="spellStart"/>
+      <w:r>
+        <w:rPr>
+          <w:rFonts w:ascii="Arial" w:hAnsi="Arial" w:cs="Arial"/>
+          <w:lang w:val="en-US"/>
+        </w:rPr>
+        <w:t>ucb</w:t>
+      </w:r>
+      <w:proofErr w:type="spellEnd"/>
+      <w:r>
+        <w:rPr>
+          <w:rFonts w:ascii="Arial" w:hAnsi="Arial" w:cs="Arial"/>
+          <w:lang w:val="en-US"/>
+        </w:rPr>
+        <w:t>) {</w:t>
+      </w:r>
+    </w:p>
+    <w:p>
+      <w:pPr>
+        <w:spacing w:after="0"/>
+        <w:rPr>
+          <w:rFonts w:ascii="Arial" w:hAnsi="Arial" w:cs="Arial"/>
+          <w:lang w:val="en-US"/>
+        </w:rPr>
+      </w:pPr>
+      <w:r>
+        <w:rPr>
+          <w:rFonts w:ascii="Arial" w:hAnsi="Arial" w:cs="Arial"/>
+          <w:lang w:val="en-US"/>
+        </w:rPr>
+        <w:t xml:space="preserve">    return </w:t>
+      </w:r>
+      <w:proofErr w:type="spellStart"/>
+      <w:r>
+        <w:rPr>
+          <w:rFonts w:ascii="Arial" w:hAnsi="Arial" w:cs="Arial"/>
+          <w:lang w:val="en-US"/>
+        </w:rPr>
+        <w:t>Mono.just</w:t>
+      </w:r>
+      <w:proofErr w:type="spellEnd"/>
+      <w:r>
+        <w:rPr>
+          <w:rFonts w:ascii="Arial" w:hAnsi="Arial" w:cs="Arial"/>
+          <w:lang w:val="en-US"/>
+        </w:rPr>
+        <w:t>(ingredient)</w:t>
+      </w:r>
+    </w:p>
+    <w:p>
+      <w:pPr>
+        <w:spacing w:after="0"/>
+        <w:rPr>
+          <w:rFonts w:ascii="Arial" w:hAnsi="Arial" w:cs="Arial"/>
+          <w:lang w:val="en-US"/>
+        </w:rPr>
+      </w:pPr>
+      <w:r>
+        <w:rPr>
+          <w:rFonts w:ascii="Arial" w:hAnsi="Arial" w:cs="Arial"/>
+          <w:lang w:val="en-US"/>
+        </w:rPr>
+        <w:t xml:space="preserve">        .</w:t>
+      </w:r>
+      <w:proofErr w:type="spellStart"/>
+      <w:r>
+        <w:rPr>
+          <w:rFonts w:ascii="Arial" w:hAnsi="Arial" w:cs="Arial"/>
+          <w:lang w:val="en-US"/>
+        </w:rPr>
+        <w:t>flatMap</w:t>
+      </w:r>
+      <w:proofErr w:type="spellEnd"/>
+      <w:r>
+        <w:rPr>
+          <w:rFonts w:ascii="Arial" w:hAnsi="Arial" w:cs="Arial"/>
+          <w:lang w:val="en-US"/>
+        </w:rPr>
+        <w:t>(repo::save)</w:t>
+      </w:r>
+    </w:p>
+    <w:p>
+      <w:pPr>
+        <w:spacing w:after="0"/>
+        <w:rPr>
+          <w:rFonts w:ascii="Arial" w:hAnsi="Arial" w:cs="Arial"/>
+          <w:lang w:val="en-US"/>
+        </w:rPr>
+      </w:pPr>
+      <w:r>
+        <w:rPr>
+          <w:rFonts w:ascii="Arial" w:hAnsi="Arial" w:cs="Arial"/>
+          <w:lang w:val="en-US"/>
+        </w:rPr>
+        <w:t xml:space="preserve">        .map(</w:t>
+      </w:r>
+      <w:proofErr w:type="spellStart"/>
+      <w:r>
+        <w:rPr>
+          <w:rFonts w:ascii="Arial" w:hAnsi="Arial" w:cs="Arial"/>
+          <w:lang w:val="en-US"/>
+        </w:rPr>
+        <w:t>i</w:t>
+      </w:r>
+      <w:proofErr w:type="spellEnd"/>
+      <w:r>
+        <w:rPr>
+          <w:rFonts w:ascii="Arial" w:hAnsi="Arial" w:cs="Arial"/>
+          <w:lang w:val="en-US"/>
+        </w:rPr>
+        <w:t xml:space="preserve"> -&gt; {</w:t>
+      </w:r>
+    </w:p>
+    <w:p>
+      <w:pPr>
+        <w:spacing w:after="0"/>
+        <w:rPr>
+          <w:rFonts w:ascii="Arial" w:hAnsi="Arial" w:cs="Arial"/>
+          <w:lang w:val="en-US"/>
+        </w:rPr>
+      </w:pPr>
+      <w:r>
+        <w:rPr>
+          <w:rFonts w:ascii="Arial" w:hAnsi="Arial" w:cs="Arial"/>
+          <w:lang w:val="en-US"/>
+        </w:rPr>
+        <w:t xml:space="preserve">          URI location = </w:t>
+      </w:r>
+      <w:proofErr w:type="spellStart"/>
+      <w:r>
+        <w:rPr>
+          <w:rFonts w:ascii="Arial" w:hAnsi="Arial" w:cs="Arial"/>
+          <w:lang w:val="en-US"/>
+        </w:rPr>
+        <w:t>ucb.path</w:t>
+      </w:r>
+      <w:proofErr w:type="spellEnd"/>
+      <w:r>
+        <w:rPr>
+          <w:rFonts w:ascii="Arial" w:hAnsi="Arial" w:cs="Arial"/>
+          <w:lang w:val="en-US"/>
+        </w:rPr>
+        <w:t>("/{id}")</w:t>
+      </w:r>
+    </w:p>
+    <w:p>
+      <w:pPr>
+        <w:spacing w:after="0"/>
+        <w:rPr>
+          <w:rFonts w:ascii="Arial" w:hAnsi="Arial" w:cs="Arial"/>
+          <w:lang w:val="en-US"/>
+        </w:rPr>
+      </w:pPr>
+      <w:r>
+        <w:rPr>
+          <w:rFonts w:ascii="Arial" w:hAnsi="Arial" w:cs="Arial"/>
+          <w:lang w:val="en-US"/>
+        </w:rPr>
+        <w:t xml:space="preserve">            .</w:t>
+      </w:r>
+      <w:proofErr w:type="spellStart"/>
+      <w:r>
+        <w:rPr>
+          <w:rFonts w:ascii="Arial" w:hAnsi="Arial" w:cs="Arial"/>
+          <w:lang w:val="en-US"/>
+        </w:rPr>
+        <w:t>buildAndExpand</w:t>
+      </w:r>
+      <w:proofErr w:type="spellEnd"/>
+      <w:r>
+        <w:rPr>
+          <w:rFonts w:ascii="Arial" w:hAnsi="Arial" w:cs="Arial"/>
+          <w:lang w:val="en-US"/>
+        </w:rPr>
+        <w:t>(</w:t>
+      </w:r>
+      <w:proofErr w:type="spellStart"/>
+      <w:r>
+        <w:rPr>
+          <w:rFonts w:ascii="Arial" w:hAnsi="Arial" w:cs="Arial"/>
+          <w:lang w:val="en-US"/>
+        </w:rPr>
+        <w:t>i.getId</w:t>
+      </w:r>
+      <w:proofErr w:type="spellEnd"/>
+      <w:r>
+        <w:rPr>
+          <w:rFonts w:ascii="Arial" w:hAnsi="Arial" w:cs="Arial"/>
+          <w:lang w:val="en-US"/>
+        </w:rPr>
+        <w:t>()).</w:t>
+      </w:r>
+      <w:proofErr w:type="spellStart"/>
+      <w:r>
+        <w:rPr>
+          <w:rFonts w:ascii="Arial" w:hAnsi="Arial" w:cs="Arial"/>
+          <w:lang w:val="en-US"/>
+        </w:rPr>
+        <w:t>toUri</w:t>
+      </w:r>
+      <w:proofErr w:type="spellEnd"/>
+      <w:r>
+        <w:rPr>
+          <w:rFonts w:ascii="Arial" w:hAnsi="Arial" w:cs="Arial"/>
+          <w:lang w:val="en-US"/>
+        </w:rPr>
+        <w:t>();</w:t>
+      </w:r>
+    </w:p>
+    <w:p>
+      <w:pPr>
+        <w:spacing w:after="0"/>
+        <w:rPr>
+          <w:rFonts w:ascii="Arial" w:hAnsi="Arial" w:cs="Arial"/>
+          <w:lang w:val="en-US"/>
+        </w:rPr>
+      </w:pPr>
+      <w:r>
+        <w:rPr>
+          <w:rFonts w:ascii="Arial" w:hAnsi="Arial" w:cs="Arial"/>
+          <w:lang w:val="en-US"/>
+        </w:rPr>
+        <w:t xml:space="preserve">          </w:t>
+      </w:r>
+      <w:proofErr w:type="gramStart"/>
+      <w:r>
+        <w:rPr>
+          <w:rFonts w:ascii="Arial" w:hAnsi="Arial" w:cs="Arial"/>
+          <w:lang w:val="en-US"/>
+        </w:rPr>
+        <w:t xml:space="preserve">return </w:t>
+      </w:r>
+      <w:proofErr w:type="spellStart"/>
+      <w:r>
+        <w:rPr>
+          <w:rFonts w:ascii="Arial" w:hAnsi="Arial" w:cs="Arial"/>
+          <w:lang w:val="en-US"/>
+        </w:rPr>
+        <w:t>ResponseEntity</w:t>
+      </w:r>
+      <w:proofErr w:type="gramEnd"/>
+      <w:r>
+        <w:rPr>
+          <w:rFonts w:ascii="Arial" w:hAnsi="Arial" w:cs="Arial"/>
+          <w:lang w:val="en-US"/>
+        </w:rPr>
+        <w:t>.created</w:t>
+      </w:r>
+      <w:proofErr w:type="spellEnd"/>
+      <w:r>
+        <w:rPr>
+          <w:rFonts w:ascii="Arial" w:hAnsi="Arial" w:cs="Arial"/>
+          <w:lang w:val="en-US"/>
+        </w:rPr>
+        <w:t>(location).body(</w:t>
+      </w:r>
+      <w:proofErr w:type="spellStart"/>
+      <w:r>
+        <w:rPr>
+          <w:rFonts w:ascii="Arial" w:hAnsi="Arial" w:cs="Arial"/>
+          <w:lang w:val="en-US"/>
+        </w:rPr>
+        <w:t>i</w:t>
+      </w:r>
+      <w:proofErr w:type="spellEnd"/>
+      <w:r>
+        <w:rPr>
+          <w:rFonts w:ascii="Arial" w:hAnsi="Arial" w:cs="Arial"/>
+          <w:lang w:val="en-US"/>
+        </w:rPr>
+        <w:t>);</w:t>
+      </w:r>
+    </w:p>
+    <w:p>
+      <w:pPr>
+        <w:spacing w:after="0"/>
+        <w:rPr>
+          <w:rFonts w:ascii="Arial" w:hAnsi="Arial" w:cs="Arial"/>
+        </w:rPr>
+      </w:pPr>
+      <w:r>
+        <w:rPr>
+          <w:rFonts w:ascii="Arial" w:hAnsi="Arial" w:cs="Arial"/>
+          <w:lang w:val="en-US"/>
+        </w:rPr>
+        <w:t xml:space="preserve">        </w:t>
+      </w:r>
+      <w:r>
+        <w:rPr>
+          <w:rFonts w:ascii="Arial" w:hAnsi="Arial" w:cs="Arial"/>
+        </w:rPr>
+        <w:t>});</w:t>
+      </w:r>
+    </w:p>
+    <w:p>
+      <w:pPr>
+        <w:rPr>
+          <w:rFonts w:ascii="Arial" w:hAnsi="Arial" w:cs="Arial"/>
+        </w:rPr>
+      </w:pPr>
+      <w:r>
+        <w:rPr>
+          <w:rFonts w:ascii="Arial" w:hAnsi="Arial" w:cs="Arial"/>
+        </w:rPr>
+        <w:t xml:space="preserve">  }</w:t>
+      </w:r>
+      <w:r>
+        <w:rPr>
+          <w:rFonts w:ascii="Arial" w:hAnsi="Arial" w:cs="Arial"/>
+        </w:rPr>
+        <w:t xml:space="preserve">  //TC-03 – Fin</w:t>
+      </w:r>
+    </w:p>
+    <w:p>
+      <w:r>
+        <w:t>Creando un ingrediente</w:t>
+      </w:r>
+    </w:p>
+    <w:p>
+      <w:pPr>
+        <w:jc w:val="center"/>
+      </w:pPr>
+      <w:r>
+        <w:rPr>
+          <w:noProof/>
+        </w:rPr>
+        <w:lastRenderedPageBreak/>
+        <w:drawing>
+          <wp:inline distT="0" distB="0" distL="0" distR="0" wp14:anchorId="144A27B1" wp14:editId="627821F5">
+            <wp:extent cx="5352547" cy="2644140"/>
+            <wp:effectExtent l="0" t="0" r="635" b="3810"/>
+            <wp:docPr id="1051256984" name="Imagen 1"/>
+            <wp:cNvGraphicFramePr>
+              <a:graphicFrameLocks xmlns:a="http://schemas.openxmlformats.org/drawingml/2006/main" noChangeAspect="1"/>
+            </wp:cNvGraphicFramePr>
+            <a:graphic xmlns:a="http://schemas.openxmlformats.org/drawingml/2006/main">
+              <a:graphicData uri="http://schemas.openxmlformats.org/drawingml/2006/picture">
+                <pic:pic xmlns:pic="http://schemas.openxmlformats.org/drawingml/2006/picture">
+                  <pic:nvPicPr>
+                    <pic:cNvPr id="1051256984" name=""/>
+                    <pic:cNvPicPr/>
+                  </pic:nvPicPr>
+                  <pic:blipFill rotWithShape="1">
+                    <a:blip r:embed="rId12"/>
+                    <a:srcRect l="25256" t="8687" b="21817"/>
+                    <a:stretch>
+                      <a:fillRect/>
+                    </a:stretch>
+                  </pic:blipFill>
+                  <pic:spPr bwMode="auto">
+                    <a:xfrm>
+                      <a:off x="0" y="0"/>
+                      <a:ext cx="5357998" cy="2646833"/>
+                    </a:xfrm>
+                    <a:prstGeom prst="rect">
+                      <a:avLst/>
+                    </a:prstGeom>
+                    <a:ln>
+                      <a:noFill/>
+                    </a:ln>
+                    <a:extLst>
+                      <a:ext uri="{53640926-AAD7-44D8-BBD7-CCE9431645EC}">
+                        <a14:shadowObscured xmlns:a14="http://schemas.microsoft.com/office/drawing/2010/main"/>
+                      </a:ext>
+                    </a:extLst>
+                  </pic:spPr>
+                </pic:pic>
+              </a:graphicData>
+            </a:graphic>
+          </wp:inline>
+        </w:drawing>
+      </w:r>
+    </w:p>
+    <w:p>
+      <w:r>
+        <w:t>Listando el ingrediente para verificar que se creó correctamente:</w:t>
+      </w:r>
+    </w:p>
+    <w:p>
+      <w:pPr>
+        <w:jc w:val="center"/>
+      </w:pPr>
+      <w:r>
+        <w:rPr>
+          <w:noProof/>
+        </w:rPr>
+        <w:drawing>
+          <wp:inline distT="0" distB="0" distL="0" distR="0" wp14:anchorId="63AF72D0" wp14:editId="74E26725">
+            <wp:extent cx="5332630" cy="3413760"/>
+            <wp:effectExtent l="0" t="0" r="1905" b="0"/>
+            <wp:docPr id="1495455796" name="Imagen 1"/>
+            <wp:cNvGraphicFramePr>
+              <a:graphicFrameLocks xmlns:a="http://schemas.openxmlformats.org/drawingml/2006/main" noChangeAspect="1"/>
+            </wp:cNvGraphicFramePr>
+            <a:graphic xmlns:a="http://schemas.openxmlformats.org/drawingml/2006/main">
+              <a:graphicData uri="http://schemas.openxmlformats.org/drawingml/2006/picture">
+                <pic:pic xmlns:pic="http://schemas.openxmlformats.org/drawingml/2006/picture">
+                  <pic:nvPicPr>
+                    <pic:cNvPr id="1495455796" name=""/>
+                    <pic:cNvPicPr/>
+                  </pic:nvPicPr>
+                  <pic:blipFill rotWithShape="1">
+                    <a:blip r:embed="rId13"/>
+                    <a:srcRect l="24616" t="9170"/>
+                    <a:stretch>
+                      <a:fillRect/>
+                    </a:stretch>
+                  </pic:blipFill>
+                  <pic:spPr bwMode="auto">
+                    <a:xfrm>
+                      <a:off x="0" y="0"/>
+                      <a:ext cx="5341756" cy="3419602"/>
+                    </a:xfrm>
+                    <a:prstGeom prst="rect">
+                      <a:avLst/>
+                    </a:prstGeom>
+                    <a:ln>
+                      <a:noFill/>
+                    </a:ln>
+                    <a:extLst>
+                      <a:ext uri="{53640926-AAD7-44D8-BBD7-CCE9431645EC}">
+                        <a14:shadowObscured xmlns:a14="http://schemas.microsoft.com/office/drawing/2010/main"/>
+                      </a:ext>
+                    </a:extLst>
+                  </pic:spPr>
+                </pic:pic>
+              </a:graphicData>
+            </a:graphic>
+          </wp:inline>
+        </w:drawing>
+      </w:r>
+    </w:p>
+    <w:p/>
+    <w:p>
+      <w:r>
+        <w:t>TC-04 – PATCH de órdenes con lista blanca y sin ZIP mutante</w:t>
+      </w:r>
+    </w:p>
+    <w:p/>
     <w:sectPr>
       <w:pgSz w:w="12240" w:h="15840"/>
       <w:pgMar w:top="1440" w:right="1440" w:bottom="1440" w:left="1440" w:header="708" w:footer="708" w:gutter="0"/>

</xml_diff>

<commit_message>
(feat) TC-04 - PATCH de órdenes con lista blanca y sin ZIP mutante
test integrados funcionales
</commit_message>
<xml_diff>
--- a/TacoCloud - Pruebas funcionales.docx
+++ b/TacoCloud - Pruebas funcionales.docx
@@ -92,7 +92,11 @@
               <w:tab w:val="right" w:leader="dot" w:pos="9350"/>
             </w:tabs>
             <w:rPr>
+              <w:rFonts w:eastAsiaTheme="minorEastAsia"/>
               <w:noProof/>
+              <w:sz w:val="24"/>
+              <w:szCs w:val="24"/>
+              <w:lang w:eastAsia="es-MX"/>
             </w:rPr>
           </w:pPr>
           <w:r>
@@ -104,7 +108,7 @@
           <w:r>
             <w:fldChar w:fldCharType="separate"/>
           </w:r>
-          <w:hyperlink w:anchor="_Toc240129078" w:history="1">
+          <w:hyperlink w:anchor="_Toc240576539" w:history="1">
             <w:r>
               <w:rPr>
                 <w:rStyle w:val="Hipervnculo"/>
@@ -131,7 +135,7 @@
                 <w:noProof/>
                 <w:webHidden/>
               </w:rPr>
-              <w:instrText xml:space="preserve"> PAGEREF _Toc240129078 \h </w:instrText>
+              <w:instrText xml:space="preserve"> PAGEREF _Toc240576539 \h </w:instrText>
             </w:r>
             <w:r>
               <w:rPr>
@@ -151,7 +155,7 @@
                 <w:noProof/>
                 <w:webHidden/>
               </w:rPr>
-              <w:t>2</w:t>
+              <w:t>3</w:t>
             </w:r>
             <w:r>
               <w:rPr>
@@ -169,10 +173,14 @@
               <w:tab w:val="right" w:leader="dot" w:pos="9350"/>
             </w:tabs>
             <w:rPr>
+              <w:rFonts w:eastAsiaTheme="minorEastAsia"/>
               <w:noProof/>
+              <w:sz w:val="24"/>
+              <w:szCs w:val="24"/>
+              <w:lang w:eastAsia="es-MX"/>
             </w:rPr>
           </w:pPr>
-          <w:hyperlink w:anchor="_Toc240129079" w:history="1">
+          <w:hyperlink w:anchor="_Toc240576540" w:history="1">
             <w:r>
               <w:rPr>
                 <w:rStyle w:val="Hipervnculo"/>
@@ -199,7 +207,7 @@
                 <w:noProof/>
                 <w:webHidden/>
               </w:rPr>
-              <w:instrText xml:space="preserve"> PAGEREF _Toc240129079 \h </w:instrText>
+              <w:instrText xml:space="preserve"> PAGEREF _Toc240576540 \h </w:instrText>
             </w:r>
             <w:r>
               <w:rPr>
@@ -219,7 +227,223 @@
                 <w:noProof/>
                 <w:webHidden/>
               </w:rPr>
-              <w:t>2</w:t>
+              <w:t>3</w:t>
+            </w:r>
+            <w:r>
+              <w:rPr>
+                <w:noProof/>
+                <w:webHidden/>
+              </w:rPr>
+              <w:fldChar w:fldCharType="end"/>
+            </w:r>
+          </w:hyperlink>
+        </w:p>
+        <w:p>
+          <w:pPr>
+            <w:pStyle w:val="TDC2"/>
+            <w:tabs>
+              <w:tab w:val="right" w:leader="dot" w:pos="9350"/>
+            </w:tabs>
+            <w:rPr>
+              <w:rFonts w:eastAsiaTheme="minorEastAsia"/>
+              <w:noProof/>
+              <w:sz w:val="24"/>
+              <w:szCs w:val="24"/>
+              <w:lang w:eastAsia="es-MX"/>
+            </w:rPr>
+          </w:pPr>
+          <w:hyperlink w:anchor="_Toc240576541" w:history="1">
+            <w:r>
+              <w:rPr>
+                <w:rStyle w:val="Hipervnculo"/>
+                <w:noProof/>
+              </w:rPr>
+              <w:t>TC-02 – Eliminar de verdad y responder con semántica HTTP</w:t>
+            </w:r>
+            <w:r>
+              <w:rPr>
+                <w:noProof/>
+                <w:webHidden/>
+              </w:rPr>
+              <w:tab/>
+            </w:r>
+            <w:r>
+              <w:rPr>
+                <w:noProof/>
+                <w:webHidden/>
+              </w:rPr>
+              <w:fldChar w:fldCharType="begin"/>
+            </w:r>
+            <w:r>
+              <w:rPr>
+                <w:noProof/>
+                <w:webHidden/>
+              </w:rPr>
+              <w:instrText xml:space="preserve"> PAGEREF _Toc240576541 \h </w:instrText>
+            </w:r>
+            <w:r>
+              <w:rPr>
+                <w:noProof/>
+                <w:webHidden/>
+              </w:rPr>
+            </w:r>
+            <w:r>
+              <w:rPr>
+                <w:noProof/>
+                <w:webHidden/>
+              </w:rPr>
+              <w:fldChar w:fldCharType="separate"/>
+            </w:r>
+            <w:r>
+              <w:rPr>
+                <w:noProof/>
+                <w:webHidden/>
+              </w:rPr>
+              <w:t>4</w:t>
+            </w:r>
+            <w:r>
+              <w:rPr>
+                <w:noProof/>
+                <w:webHidden/>
+              </w:rPr>
+              <w:fldChar w:fldCharType="end"/>
+            </w:r>
+          </w:hyperlink>
+        </w:p>
+        <w:p>
+          <w:pPr>
+            <w:pStyle w:val="TDC2"/>
+            <w:tabs>
+              <w:tab w:val="right" w:leader="dot" w:pos="9350"/>
+            </w:tabs>
+            <w:rPr>
+              <w:rFonts w:eastAsiaTheme="minorEastAsia"/>
+              <w:noProof/>
+              <w:sz w:val="24"/>
+              <w:szCs w:val="24"/>
+              <w:lang w:eastAsia="es-MX"/>
+            </w:rPr>
+          </w:pPr>
+          <w:hyperlink w:anchor="_Toc240576542" w:history="1">
+            <w:r>
+              <w:rPr>
+                <w:rStyle w:val="Hipervnculo"/>
+                <w:noProof/>
+              </w:rPr>
+              <w:t>TC-03 – Construir Location sin localhost ni rutas rotas</w:t>
+            </w:r>
+            <w:r>
+              <w:rPr>
+                <w:noProof/>
+                <w:webHidden/>
+              </w:rPr>
+              <w:tab/>
+            </w:r>
+            <w:r>
+              <w:rPr>
+                <w:noProof/>
+                <w:webHidden/>
+              </w:rPr>
+              <w:fldChar w:fldCharType="begin"/>
+            </w:r>
+            <w:r>
+              <w:rPr>
+                <w:noProof/>
+                <w:webHidden/>
+              </w:rPr>
+              <w:instrText xml:space="preserve"> PAGEREF _Toc240576542 \h </w:instrText>
+            </w:r>
+            <w:r>
+              <w:rPr>
+                <w:noProof/>
+                <w:webHidden/>
+              </w:rPr>
+            </w:r>
+            <w:r>
+              <w:rPr>
+                <w:noProof/>
+                <w:webHidden/>
+              </w:rPr>
+              <w:fldChar w:fldCharType="separate"/>
+            </w:r>
+            <w:r>
+              <w:rPr>
+                <w:noProof/>
+                <w:webHidden/>
+              </w:rPr>
+              <w:t>6</w:t>
+            </w:r>
+            <w:r>
+              <w:rPr>
+                <w:noProof/>
+                <w:webHidden/>
+              </w:rPr>
+              <w:fldChar w:fldCharType="end"/>
+            </w:r>
+          </w:hyperlink>
+        </w:p>
+        <w:p>
+          <w:pPr>
+            <w:pStyle w:val="TDC2"/>
+            <w:tabs>
+              <w:tab w:val="right" w:leader="dot" w:pos="9350"/>
+            </w:tabs>
+            <w:rPr>
+              <w:rFonts w:eastAsiaTheme="minorEastAsia"/>
+              <w:noProof/>
+              <w:sz w:val="24"/>
+              <w:szCs w:val="24"/>
+              <w:lang w:eastAsia="es-MX"/>
+            </w:rPr>
+          </w:pPr>
+          <w:hyperlink w:anchor="_Toc240576543" w:history="1">
+            <w:r>
+              <w:rPr>
+                <w:rStyle w:val="Hipervnculo"/>
+                <w:noProof/>
+              </w:rPr>
+              <w:t>TC-04 – PATCH de órdenes con lista blanca y sin ZIP mutante</w:t>
+            </w:r>
+            <w:r>
+              <w:rPr>
+                <w:noProof/>
+                <w:webHidden/>
+              </w:rPr>
+              <w:tab/>
+            </w:r>
+            <w:r>
+              <w:rPr>
+                <w:noProof/>
+                <w:webHidden/>
+              </w:rPr>
+              <w:fldChar w:fldCharType="begin"/>
+            </w:r>
+            <w:r>
+              <w:rPr>
+                <w:noProof/>
+                <w:webHidden/>
+              </w:rPr>
+              <w:instrText xml:space="preserve"> PAGEREF _Toc240576543 \h </w:instrText>
+            </w:r>
+            <w:r>
+              <w:rPr>
+                <w:noProof/>
+                <w:webHidden/>
+              </w:rPr>
+            </w:r>
+            <w:r>
+              <w:rPr>
+                <w:noProof/>
+                <w:webHidden/>
+              </w:rPr>
+              <w:fldChar w:fldCharType="separate"/>
+            </w:r>
+            <w:r>
+              <w:rPr>
+                <w:noProof/>
+                <w:webHidden/>
+              </w:rPr>
+              <w:t>9</w:t>
             </w:r>
             <w:r>
               <w:rPr>
@@ -252,7 +476,7 @@
       <w:pPr>
         <w:pStyle w:val="Ttulo1"/>
       </w:pPr>
-      <w:bookmarkStart w:id="0" w:name="_Toc240129078"/>
+      <w:bookmarkStart w:id="0" w:name="_Toc240576539"/>
       <w:r>
         <w:lastRenderedPageBreak/>
         <w:t>Laboratorio 1 – Cazar operaciones fantasma</w:t>
@@ -263,7 +487,7 @@
       <w:pPr>
         <w:pStyle w:val="Ttulo2"/>
       </w:pPr>
-      <w:bookmarkStart w:id="1" w:name="_Toc240129079"/>
+      <w:bookmarkStart w:id="1" w:name="_Toc240576540"/>
       <w:r>
         <w:t>TC-01 – Actualizar un ingrediente sin perder el Publisher</w:t>
       </w:r>
@@ -935,9 +1159,11 @@
       <w:pPr>
         <w:pStyle w:val="Ttulo2"/>
       </w:pPr>
+      <w:bookmarkStart w:id="2" w:name="_Toc240576541"/>
       <w:r>
         <w:t>TC-02 – Eliminar de verdad y responder con semántica HTTP</w:t>
       </w:r>
+      <w:bookmarkEnd w:id="2"/>
     </w:p>
     <w:p>
       <w:pPr>
@@ -1568,6 +1794,7 @@
       <w:pPr>
         <w:pStyle w:val="Ttulo2"/>
       </w:pPr>
+      <w:bookmarkStart w:id="3" w:name="_Toc240576542"/>
       <w:r>
         <w:t xml:space="preserve">TC-03 – Construir </w:t>
       </w:r>
@@ -1579,6 +1806,7 @@
       <w:r>
         <w:t xml:space="preserve"> sin localhost ni rutas rotas</w:t>
       </w:r>
+      <w:bookmarkEnd w:id="3"/>
     </w:p>
     <w:p>
       <w:pPr>
@@ -1639,7 +1867,23 @@
           <w:rFonts w:ascii="Arial" w:hAnsi="Arial" w:cs="Arial"/>
           <w:lang w:val="en-US"/>
         </w:rPr>
-        <w:t xml:space="preserve">  public Mono </w:t>
+        <w:t>public Mono&lt;</w:t>
+      </w:r>
+      <w:proofErr w:type="spellStart"/>
+      <w:r>
+        <w:rPr>
+          <w:rFonts w:ascii="Arial" w:hAnsi="Arial" w:cs="Arial"/>
+          <w:lang w:val="en-US"/>
+        </w:rPr>
+        <w:t>ResponseEntity</w:t>
+      </w:r>
+      <w:proofErr w:type="spellEnd"/>
+      <w:r>
+        <w:rPr>
+          <w:rFonts w:ascii="Arial" w:hAnsi="Arial" w:cs="Arial"/>
+          <w:lang w:val="en-US"/>
+        </w:rPr>
+        <w:t xml:space="preserve">&lt;Ingredient&gt;&gt; </w:t>
       </w:r>
       <w:proofErr w:type="spellStart"/>
       <w:r>
@@ -1847,7 +2091,23 @@
           <w:rFonts w:ascii="Arial" w:hAnsi="Arial" w:cs="Arial"/>
           <w:lang w:val="en-US"/>
         </w:rPr>
-        <w:t>("/{id}")</w:t>
+        <w:t>("/</w:t>
+      </w:r>
+      <w:proofErr w:type="spellStart"/>
+      <w:r>
+        <w:rPr>
+          <w:rFonts w:ascii="Arial" w:hAnsi="Arial" w:cs="Arial"/>
+          <w:lang w:val="en-US"/>
+        </w:rPr>
+        <w:t>api</w:t>
+      </w:r>
+      <w:proofErr w:type="spellEnd"/>
+      <w:r>
+        <w:rPr>
+          <w:rFonts w:ascii="Arial" w:hAnsi="Arial" w:cs="Arial"/>
+          <w:lang w:val="en-US"/>
+        </w:rPr>
+        <w:t>/ingredients/{id}")</w:t>
       </w:r>
     </w:p>
     <w:p>
@@ -1983,31 +2243,27 @@
         <w:spacing w:after="0"/>
         <w:rPr>
           <w:rFonts w:ascii="Arial" w:hAnsi="Arial" w:cs="Arial"/>
-        </w:rPr>
-      </w:pPr>
-      <w:r>
-        <w:rPr>
-          <w:rFonts w:ascii="Arial" w:hAnsi="Arial" w:cs="Arial"/>
-          <w:lang w:val="en-US"/>
-        </w:rPr>
-        <w:t xml:space="preserve">        </w:t>
-      </w:r>
-      <w:r>
-        <w:rPr>
-          <w:rFonts w:ascii="Arial" w:hAnsi="Arial" w:cs="Arial"/>
-        </w:rPr>
-        <w:t>});</w:t>
-      </w:r>
-    </w:p>
-    <w:p>
-      <w:pPr>
-        <w:rPr>
-          <w:rFonts w:ascii="Arial" w:hAnsi="Arial" w:cs="Arial"/>
-        </w:rPr>
-      </w:pPr>
-      <w:r>
-        <w:rPr>
-          <w:rFonts w:ascii="Arial" w:hAnsi="Arial" w:cs="Arial"/>
+          <w:lang w:val="en-US"/>
+        </w:rPr>
+      </w:pPr>
+      <w:r>
+        <w:rPr>
+          <w:rFonts w:ascii="Arial" w:hAnsi="Arial" w:cs="Arial"/>
+          <w:lang w:val="en-US"/>
+        </w:rPr>
+        <w:t xml:space="preserve">        });</w:t>
+      </w:r>
+    </w:p>
+    <w:p>
+      <w:pPr>
+        <w:rPr>
+          <w:rFonts w:ascii="Arial" w:hAnsi="Arial" w:cs="Arial"/>
+        </w:rPr>
+      </w:pPr>
+      <w:r>
+        <w:rPr>
+          <w:rFonts w:ascii="Arial" w:hAnsi="Arial" w:cs="Arial"/>
+          <w:lang w:val="en-US"/>
         </w:rPr>
         <w:t xml:space="preserve">  }</w:t>
       </w:r>
@@ -2015,7 +2271,7 @@
         <w:rPr>
           <w:rFonts w:ascii="Arial" w:hAnsi="Arial" w:cs="Arial"/>
         </w:rPr>
-        <w:t xml:space="preserve">  //TC-03 – Fin</w:t>
+        <w:t>//TC-03 – Fin</w:t>
       </w:r>
     </w:p>
     <w:p>
@@ -2077,6 +2333,55 @@
           </wp:inline>
         </w:drawing>
       </w:r>
+      <w:r>
+        <w:rPr>
+          <w:noProof/>
+        </w:rPr>
+        <w:drawing>
+          <wp:inline distT="0" distB="0" distL="0" distR="0" wp14:anchorId="2F908B4D" wp14:editId="3064C2C9">
+            <wp:extent cx="5409229" cy="3459480"/>
+            <wp:effectExtent l="0" t="0" r="1270" b="7620"/>
+            <wp:docPr id="1181584977" name="Imagen 1"/>
+            <wp:cNvGraphicFramePr>
+              <a:graphicFrameLocks xmlns:a="http://schemas.openxmlformats.org/drawingml/2006/main" noChangeAspect="1"/>
+            </wp:cNvGraphicFramePr>
+            <a:graphic xmlns:a="http://schemas.openxmlformats.org/drawingml/2006/main">
+              <a:graphicData uri="http://schemas.openxmlformats.org/drawingml/2006/picture">
+                <pic:pic xmlns:pic="http://schemas.openxmlformats.org/drawingml/2006/picture">
+                  <pic:nvPicPr>
+                    <pic:cNvPr id="1181584977" name=""/>
+                    <pic:cNvPicPr/>
+                  </pic:nvPicPr>
+                  <pic:blipFill rotWithShape="1">
+                    <a:blip r:embed="rId13"/>
+                    <a:srcRect l="24744" t="9410"/>
+                    <a:stretch>
+                      <a:fillRect/>
+                    </a:stretch>
+                  </pic:blipFill>
+                  <pic:spPr bwMode="auto">
+                    <a:xfrm>
+                      <a:off x="0" y="0"/>
+                      <a:ext cx="5424064" cy="3468968"/>
+                    </a:xfrm>
+                    <a:prstGeom prst="rect">
+                      <a:avLst/>
+                    </a:prstGeom>
+                    <a:ln>
+                      <a:noFill/>
+                    </a:ln>
+                    <a:extLst>
+                      <a:ext uri="{53640926-AAD7-44D8-BBD7-CCE9431645EC}">
+                        <a14:shadowObscured xmlns:a14="http://schemas.microsoft.com/office/drawing/2010/main"/>
+                      </a:ext>
+                    </a:extLst>
+                  </pic:spPr>
+                </pic:pic>
+              </a:graphicData>
+            </a:graphic>
+          </wp:inline>
+        </w:drawing>
+      </w:r>
     </w:p>
     <w:p>
       <w:r>
@@ -2091,6 +2396,7 @@
         <w:rPr>
           <w:noProof/>
         </w:rPr>
+        <w:lastRenderedPageBreak/>
         <w:drawing>
           <wp:inline distT="0" distB="0" distL="0" distR="0" wp14:anchorId="63AF72D0" wp14:editId="74E26725">
             <wp:extent cx="5332630" cy="3413760"/>
@@ -2107,7 +2413,7 @@
                     <pic:cNvPicPr/>
                   </pic:nvPicPr>
                   <pic:blipFill rotWithShape="1">
-                    <a:blip r:embed="rId13"/>
+                    <a:blip r:embed="rId14"/>
                     <a:srcRect l="24616" t="9170"/>
                     <a:stretch>
                       <a:fillRect/>
@@ -2137,12 +2443,1644 @@
         </w:drawing>
       </w:r>
     </w:p>
+    <w:p>
+      <w:r>
+        <w:t>Cuando se envía un ingrediente inválido:</w:t>
+      </w:r>
+    </w:p>
+    <w:p>
+      <w:pPr>
+        <w:jc w:val="center"/>
+      </w:pPr>
+      <w:r>
+        <w:rPr>
+          <w:noProof/>
+        </w:rPr>
+        <w:drawing>
+          <wp:inline distT="0" distB="0" distL="0" distR="0" wp14:anchorId="0CB5A851" wp14:editId="0F01348A">
+            <wp:extent cx="5459184" cy="3528060"/>
+            <wp:effectExtent l="0" t="0" r="8255" b="0"/>
+            <wp:docPr id="1331121154" name="Imagen 1"/>
+            <wp:cNvGraphicFramePr>
+              <a:graphicFrameLocks xmlns:a="http://schemas.openxmlformats.org/drawingml/2006/main" noChangeAspect="1"/>
+            </wp:cNvGraphicFramePr>
+            <a:graphic xmlns:a="http://schemas.openxmlformats.org/drawingml/2006/main">
+              <a:graphicData uri="http://schemas.openxmlformats.org/drawingml/2006/picture">
+                <pic:pic xmlns:pic="http://schemas.openxmlformats.org/drawingml/2006/picture">
+                  <pic:nvPicPr>
+                    <pic:cNvPr id="1331121154" name=""/>
+                    <pic:cNvPicPr/>
+                  </pic:nvPicPr>
+                  <pic:blipFill rotWithShape="1">
+                    <a:blip r:embed="rId15"/>
+                    <a:srcRect l="25128" t="8928"/>
+                    <a:stretch>
+                      <a:fillRect/>
+                    </a:stretch>
+                  </pic:blipFill>
+                  <pic:spPr bwMode="auto">
+                    <a:xfrm>
+                      <a:off x="0" y="0"/>
+                      <a:ext cx="5473028" cy="3537007"/>
+                    </a:xfrm>
+                    <a:prstGeom prst="rect">
+                      <a:avLst/>
+                    </a:prstGeom>
+                    <a:ln>
+                      <a:noFill/>
+                    </a:ln>
+                    <a:extLst>
+                      <a:ext uri="{53640926-AAD7-44D8-BBD7-CCE9431645EC}">
+                        <a14:shadowObscured xmlns:a14="http://schemas.microsoft.com/office/drawing/2010/main"/>
+                      </a:ext>
+                    </a:extLst>
+                  </pic:spPr>
+                </pic:pic>
+              </a:graphicData>
+            </a:graphic>
+          </wp:inline>
+        </w:drawing>
+      </w:r>
+    </w:p>
     <w:p/>
     <w:p>
-      <w:r>
+      <w:pPr>
+        <w:pStyle w:val="Ttulo2"/>
+      </w:pPr>
+      <w:bookmarkStart w:id="4" w:name="_Toc240576543"/>
+      <w:r>
+        <w:lastRenderedPageBreak/>
         <w:t>TC-04 – PATCH de órdenes con lista blanca y sin ZIP mutante</w:t>
       </w:r>
-    </w:p>
+      <w:bookmarkEnd w:id="4"/>
+    </w:p>
+    <w:p>
+      <w:r>
+        <w:t xml:space="preserve">Cambios dentro de </w:t>
+      </w:r>
+      <w:r>
+        <w:rPr>
+          <w:i/>
+          <w:iCs/>
+        </w:rPr>
+        <w:t>OrderApiController.java</w:t>
+      </w:r>
+    </w:p>
+    <w:p>
+      <w:pPr>
+        <w:spacing w:after="0"/>
+        <w:rPr>
+          <w:rFonts w:ascii="Arial" w:hAnsi="Arial" w:cs="Arial"/>
+        </w:rPr>
+      </w:pPr>
+      <w:r>
+        <w:rPr>
+          <w:rFonts w:ascii="Arial" w:hAnsi="Arial" w:cs="Arial"/>
+        </w:rPr>
+        <w:t xml:space="preserve">  //TC-04 - PATCH de ordenes con lista blanca y sin ZIP mutante</w:t>
+      </w:r>
+    </w:p>
+    <w:p>
+      <w:pPr>
+        <w:spacing w:after="0"/>
+        <w:rPr>
+          <w:rFonts w:ascii="Arial" w:hAnsi="Arial" w:cs="Arial"/>
+          <w:lang w:val="en-US"/>
+        </w:rPr>
+      </w:pPr>
+      <w:r>
+        <w:rPr>
+          <w:rFonts w:ascii="Arial" w:hAnsi="Arial" w:cs="Arial"/>
+        </w:rPr>
+        <w:t xml:space="preserve">  </w:t>
+      </w:r>
+      <w:proofErr w:type="gramStart"/>
+      <w:r>
+        <w:rPr>
+          <w:rFonts w:ascii="Arial" w:hAnsi="Arial" w:cs="Arial"/>
+          <w:lang w:val="en-US"/>
+        </w:rPr>
+        <w:t>@PatchMapping</w:t>
+      </w:r>
+      <w:proofErr w:type="gramEnd"/>
+      <w:r>
+        <w:rPr>
+          <w:rFonts w:ascii="Arial" w:hAnsi="Arial" w:cs="Arial"/>
+          <w:lang w:val="en-US"/>
+        </w:rPr>
+        <w:t>(path="/{orderId}", consumes="application/</w:t>
+      </w:r>
+      <w:proofErr w:type="spellStart"/>
+      <w:r>
+        <w:rPr>
+          <w:rFonts w:ascii="Arial" w:hAnsi="Arial" w:cs="Arial"/>
+          <w:lang w:val="en-US"/>
+        </w:rPr>
+        <w:t>json</w:t>
+      </w:r>
+      <w:proofErr w:type="spellEnd"/>
+      <w:r>
+        <w:rPr>
+          <w:rFonts w:ascii="Arial" w:hAnsi="Arial" w:cs="Arial"/>
+          <w:lang w:val="en-US"/>
+        </w:rPr>
+        <w:t>")</w:t>
+      </w:r>
+    </w:p>
+    <w:p>
+      <w:pPr>
+        <w:spacing w:after="0"/>
+        <w:rPr>
+          <w:rFonts w:ascii="Arial" w:hAnsi="Arial" w:cs="Arial"/>
+          <w:lang w:val="en-US"/>
+        </w:rPr>
+      </w:pPr>
+      <w:r>
+        <w:rPr>
+          <w:rFonts w:ascii="Arial" w:hAnsi="Arial" w:cs="Arial"/>
+          <w:lang w:val="en-US"/>
+        </w:rPr>
+        <w:t xml:space="preserve">  public Mono&lt;</w:t>
+      </w:r>
+      <w:proofErr w:type="spellStart"/>
+      <w:r>
+        <w:rPr>
+          <w:rFonts w:ascii="Arial" w:hAnsi="Arial" w:cs="Arial"/>
+          <w:lang w:val="en-US"/>
+        </w:rPr>
+        <w:t>TacoOrder</w:t>
+      </w:r>
+      <w:proofErr w:type="spellEnd"/>
+      <w:r>
+        <w:rPr>
+          <w:rFonts w:ascii="Arial" w:hAnsi="Arial" w:cs="Arial"/>
+          <w:lang w:val="en-US"/>
+        </w:rPr>
+        <w:t xml:space="preserve">&gt; </w:t>
+      </w:r>
+      <w:proofErr w:type="spellStart"/>
+      <w:r>
+        <w:rPr>
+          <w:rFonts w:ascii="Arial" w:hAnsi="Arial" w:cs="Arial"/>
+          <w:lang w:val="en-US"/>
+        </w:rPr>
+        <w:t>patchOrder</w:t>
+      </w:r>
+      <w:proofErr w:type="spellEnd"/>
+      <w:r>
+        <w:rPr>
+          <w:rFonts w:ascii="Arial" w:hAnsi="Arial" w:cs="Arial"/>
+          <w:lang w:val="en-US"/>
+        </w:rPr>
+        <w:t xml:space="preserve">(@PathVariable("orderId") String </w:t>
+      </w:r>
+      <w:proofErr w:type="spellStart"/>
+      <w:r>
+        <w:rPr>
+          <w:rFonts w:ascii="Arial" w:hAnsi="Arial" w:cs="Arial"/>
+          <w:lang w:val="en-US"/>
+        </w:rPr>
+        <w:t>orderId</w:t>
+      </w:r>
+      <w:proofErr w:type="spellEnd"/>
+      <w:r>
+        <w:rPr>
+          <w:rFonts w:ascii="Arial" w:hAnsi="Arial" w:cs="Arial"/>
+          <w:lang w:val="en-US"/>
+        </w:rPr>
+        <w:t>,</w:t>
+      </w:r>
+    </w:p>
+    <w:p>
+      <w:pPr>
+        <w:spacing w:after="0"/>
+        <w:rPr>
+          <w:rFonts w:ascii="Arial" w:hAnsi="Arial" w:cs="Arial"/>
+          <w:lang w:val="en-US"/>
+        </w:rPr>
+      </w:pPr>
+      <w:r>
+        <w:rPr>
+          <w:rFonts w:ascii="Arial" w:hAnsi="Arial" w:cs="Arial"/>
+          <w:lang w:val="en-US"/>
+        </w:rPr>
+        <w:t xml:space="preserve">                          </w:t>
+      </w:r>
+      <w:proofErr w:type="gramStart"/>
+      <w:r>
+        <w:rPr>
+          <w:rFonts w:ascii="Arial" w:hAnsi="Arial" w:cs="Arial"/>
+          <w:lang w:val="en-US"/>
+        </w:rPr>
+        <w:t>@RequestBody</w:t>
+      </w:r>
+      <w:proofErr w:type="gramEnd"/>
+      <w:r>
+        <w:rPr>
+          <w:rFonts w:ascii="Arial" w:hAnsi="Arial" w:cs="Arial"/>
+          <w:lang w:val="en-US"/>
+        </w:rPr>
+        <w:t xml:space="preserve"> </w:t>
+      </w:r>
+      <w:proofErr w:type="spellStart"/>
+      <w:r>
+        <w:rPr>
+          <w:rFonts w:ascii="Arial" w:hAnsi="Arial" w:cs="Arial"/>
+          <w:lang w:val="en-US"/>
+        </w:rPr>
+        <w:t>OrderPatchRequest</w:t>
+      </w:r>
+      <w:proofErr w:type="spellEnd"/>
+      <w:r>
+        <w:rPr>
+          <w:rFonts w:ascii="Arial" w:hAnsi="Arial" w:cs="Arial"/>
+          <w:lang w:val="en-US"/>
+        </w:rPr>
+        <w:t xml:space="preserve"> patch) {</w:t>
+      </w:r>
+    </w:p>
+    <w:p>
+      <w:pPr>
+        <w:spacing w:after="0"/>
+        <w:rPr>
+          <w:rFonts w:ascii="Arial" w:hAnsi="Arial" w:cs="Arial"/>
+          <w:lang w:val="en-US"/>
+        </w:rPr>
+      </w:pPr>
+    </w:p>
+    <w:p>
+      <w:pPr>
+        <w:spacing w:after="0"/>
+        <w:rPr>
+          <w:rFonts w:ascii="Arial" w:hAnsi="Arial" w:cs="Arial"/>
+          <w:lang w:val="en-US"/>
+        </w:rPr>
+      </w:pPr>
+      <w:r>
+        <w:rPr>
+          <w:rFonts w:ascii="Arial" w:hAnsi="Arial" w:cs="Arial"/>
+          <w:lang w:val="en-US"/>
+        </w:rPr>
+        <w:t xml:space="preserve">    return </w:t>
+      </w:r>
+      <w:proofErr w:type="spellStart"/>
+      <w:r>
+        <w:rPr>
+          <w:rFonts w:ascii="Arial" w:hAnsi="Arial" w:cs="Arial"/>
+          <w:lang w:val="en-US"/>
+        </w:rPr>
+        <w:t>repo.findById</w:t>
+      </w:r>
+      <w:proofErr w:type="spellEnd"/>
+      <w:r>
+        <w:rPr>
+          <w:rFonts w:ascii="Arial" w:hAnsi="Arial" w:cs="Arial"/>
+          <w:lang w:val="en-US"/>
+        </w:rPr>
+        <w:t>(</w:t>
+      </w:r>
+      <w:proofErr w:type="spellStart"/>
+      <w:r>
+        <w:rPr>
+          <w:rFonts w:ascii="Arial" w:hAnsi="Arial" w:cs="Arial"/>
+          <w:lang w:val="en-US"/>
+        </w:rPr>
+        <w:t>orderId</w:t>
+      </w:r>
+      <w:proofErr w:type="spellEnd"/>
+      <w:r>
+        <w:rPr>
+          <w:rFonts w:ascii="Arial" w:hAnsi="Arial" w:cs="Arial"/>
+          <w:lang w:val="en-US"/>
+        </w:rPr>
+        <w:t>)</w:t>
+      </w:r>
+    </w:p>
+    <w:p>
+      <w:pPr>
+        <w:spacing w:after="0"/>
+        <w:rPr>
+          <w:rFonts w:ascii="Arial" w:hAnsi="Arial" w:cs="Arial"/>
+          <w:lang w:val="en-US"/>
+        </w:rPr>
+      </w:pPr>
+      <w:r>
+        <w:rPr>
+          <w:rFonts w:ascii="Arial" w:hAnsi="Arial" w:cs="Arial"/>
+          <w:lang w:val="en-US"/>
+        </w:rPr>
+        <w:t xml:space="preserve">        .</w:t>
+      </w:r>
+      <w:proofErr w:type="spellStart"/>
+      <w:r>
+        <w:rPr>
+          <w:rFonts w:ascii="Arial" w:hAnsi="Arial" w:cs="Arial"/>
+          <w:lang w:val="en-US"/>
+        </w:rPr>
+        <w:t>switchIfEmpty</w:t>
+      </w:r>
+      <w:proofErr w:type="spellEnd"/>
+      <w:r>
+        <w:rPr>
+          <w:rFonts w:ascii="Arial" w:hAnsi="Arial" w:cs="Arial"/>
+          <w:lang w:val="en-US"/>
+        </w:rPr>
+        <w:t>(</w:t>
+      </w:r>
+      <w:proofErr w:type="spellStart"/>
+      <w:r>
+        <w:rPr>
+          <w:rFonts w:ascii="Arial" w:hAnsi="Arial" w:cs="Arial"/>
+          <w:lang w:val="en-US"/>
+        </w:rPr>
+        <w:t>Mono.error</w:t>
+      </w:r>
+      <w:proofErr w:type="spellEnd"/>
+      <w:r>
+        <w:rPr>
+          <w:rFonts w:ascii="Arial" w:hAnsi="Arial" w:cs="Arial"/>
+          <w:lang w:val="en-US"/>
+        </w:rPr>
+        <w:t xml:space="preserve">(new </w:t>
+      </w:r>
+      <w:proofErr w:type="spellStart"/>
+      <w:r>
+        <w:rPr>
+          <w:rFonts w:ascii="Arial" w:hAnsi="Arial" w:cs="Arial"/>
+          <w:lang w:val="en-US"/>
+        </w:rPr>
+        <w:t>ResponseStatusException</w:t>
+      </w:r>
+      <w:proofErr w:type="spellEnd"/>
+      <w:r>
+        <w:rPr>
+          <w:rFonts w:ascii="Arial" w:hAnsi="Arial" w:cs="Arial"/>
+          <w:lang w:val="en-US"/>
+        </w:rPr>
+        <w:t>(</w:t>
+      </w:r>
+      <w:proofErr w:type="spellStart"/>
+      <w:r>
+        <w:rPr>
+          <w:rFonts w:ascii="Arial" w:hAnsi="Arial" w:cs="Arial"/>
+          <w:lang w:val="en-US"/>
+        </w:rPr>
+        <w:t>HttpStatus.NOT_FOUND</w:t>
+      </w:r>
+      <w:proofErr w:type="spellEnd"/>
+      <w:r>
+        <w:rPr>
+          <w:rFonts w:ascii="Arial" w:hAnsi="Arial" w:cs="Arial"/>
+          <w:lang w:val="en-US"/>
+        </w:rPr>
+        <w:t>)))</w:t>
+      </w:r>
+    </w:p>
+    <w:p>
+      <w:pPr>
+        <w:spacing w:after="0"/>
+        <w:rPr>
+          <w:rFonts w:ascii="Arial" w:hAnsi="Arial" w:cs="Arial"/>
+          <w:lang w:val="en-US"/>
+        </w:rPr>
+      </w:pPr>
+      <w:r>
+        <w:rPr>
+          <w:rFonts w:ascii="Arial" w:hAnsi="Arial" w:cs="Arial"/>
+          <w:lang w:val="en-US"/>
+        </w:rPr>
+        <w:t xml:space="preserve">        .map(order -&gt; {</w:t>
+      </w:r>
+    </w:p>
+    <w:p>
+      <w:pPr>
+        <w:spacing w:after="0"/>
+        <w:rPr>
+          <w:rFonts w:ascii="Arial" w:hAnsi="Arial" w:cs="Arial"/>
+          <w:lang w:val="en-US"/>
+        </w:rPr>
+      </w:pPr>
+      <w:r>
+        <w:rPr>
+          <w:rFonts w:ascii="Arial" w:hAnsi="Arial" w:cs="Arial"/>
+          <w:lang w:val="en-US"/>
+        </w:rPr>
+        <w:t xml:space="preserve">          if (</w:t>
+      </w:r>
+      <w:proofErr w:type="spellStart"/>
+      <w:r>
+        <w:rPr>
+          <w:rFonts w:ascii="Arial" w:hAnsi="Arial" w:cs="Arial"/>
+          <w:lang w:val="en-US"/>
+        </w:rPr>
+        <w:t>patch.getDeliveryName</w:t>
+      </w:r>
+      <w:proofErr w:type="spellEnd"/>
+      <w:r>
+        <w:rPr>
+          <w:rFonts w:ascii="Arial" w:hAnsi="Arial" w:cs="Arial"/>
+          <w:lang w:val="en-US"/>
+        </w:rPr>
+        <w:t>() != null) {</w:t>
+      </w:r>
+    </w:p>
+    <w:p>
+      <w:pPr>
+        <w:spacing w:after="0"/>
+        <w:rPr>
+          <w:rFonts w:ascii="Arial" w:hAnsi="Arial" w:cs="Arial"/>
+          <w:lang w:val="en-US"/>
+        </w:rPr>
+      </w:pPr>
+      <w:r>
+        <w:rPr>
+          <w:rFonts w:ascii="Arial" w:hAnsi="Arial" w:cs="Arial"/>
+          <w:lang w:val="en-US"/>
+        </w:rPr>
+        <w:t xml:space="preserve">            </w:t>
+      </w:r>
+      <w:proofErr w:type="spellStart"/>
+      <w:r>
+        <w:rPr>
+          <w:rFonts w:ascii="Arial" w:hAnsi="Arial" w:cs="Arial"/>
+          <w:lang w:val="en-US"/>
+        </w:rPr>
+        <w:t>order.setDeliveryName</w:t>
+      </w:r>
+      <w:proofErr w:type="spellEnd"/>
+      <w:r>
+        <w:rPr>
+          <w:rFonts w:ascii="Arial" w:hAnsi="Arial" w:cs="Arial"/>
+          <w:lang w:val="en-US"/>
+        </w:rPr>
+        <w:t>(</w:t>
+      </w:r>
+      <w:proofErr w:type="spellStart"/>
+      <w:r>
+        <w:rPr>
+          <w:rFonts w:ascii="Arial" w:hAnsi="Arial" w:cs="Arial"/>
+          <w:lang w:val="en-US"/>
+        </w:rPr>
+        <w:t>patch.getDeliveryName</w:t>
+      </w:r>
+      <w:proofErr w:type="spellEnd"/>
+      <w:r>
+        <w:rPr>
+          <w:rFonts w:ascii="Arial" w:hAnsi="Arial" w:cs="Arial"/>
+          <w:lang w:val="en-US"/>
+        </w:rPr>
+        <w:t>());</w:t>
+      </w:r>
+    </w:p>
+    <w:p>
+      <w:pPr>
+        <w:spacing w:after="0"/>
+        <w:rPr>
+          <w:rFonts w:ascii="Arial" w:hAnsi="Arial" w:cs="Arial"/>
+          <w:lang w:val="en-US"/>
+        </w:rPr>
+      </w:pPr>
+      <w:r>
+        <w:rPr>
+          <w:rFonts w:ascii="Arial" w:hAnsi="Arial" w:cs="Arial"/>
+          <w:lang w:val="en-US"/>
+        </w:rPr>
+        <w:t xml:space="preserve">          }</w:t>
+      </w:r>
+    </w:p>
+    <w:p>
+      <w:pPr>
+        <w:spacing w:after="0"/>
+        <w:rPr>
+          <w:rFonts w:ascii="Arial" w:hAnsi="Arial" w:cs="Arial"/>
+          <w:lang w:val="en-US"/>
+        </w:rPr>
+      </w:pPr>
+      <w:r>
+        <w:rPr>
+          <w:rFonts w:ascii="Arial" w:hAnsi="Arial" w:cs="Arial"/>
+          <w:lang w:val="en-US"/>
+        </w:rPr>
+        <w:t xml:space="preserve">          if (</w:t>
+      </w:r>
+      <w:proofErr w:type="spellStart"/>
+      <w:r>
+        <w:rPr>
+          <w:rFonts w:ascii="Arial" w:hAnsi="Arial" w:cs="Arial"/>
+          <w:lang w:val="en-US"/>
+        </w:rPr>
+        <w:t>patch.getDeliveryStreet</w:t>
+      </w:r>
+      <w:proofErr w:type="spellEnd"/>
+      <w:r>
+        <w:rPr>
+          <w:rFonts w:ascii="Arial" w:hAnsi="Arial" w:cs="Arial"/>
+          <w:lang w:val="en-US"/>
+        </w:rPr>
+        <w:t>() != null) {</w:t>
+      </w:r>
+    </w:p>
+    <w:p>
+      <w:pPr>
+        <w:spacing w:after="0"/>
+        <w:rPr>
+          <w:rFonts w:ascii="Arial" w:hAnsi="Arial" w:cs="Arial"/>
+          <w:lang w:val="en-US"/>
+        </w:rPr>
+      </w:pPr>
+      <w:r>
+        <w:rPr>
+          <w:rFonts w:ascii="Arial" w:hAnsi="Arial" w:cs="Arial"/>
+          <w:lang w:val="en-US"/>
+        </w:rPr>
+        <w:t xml:space="preserve">            </w:t>
+      </w:r>
+      <w:proofErr w:type="spellStart"/>
+      <w:r>
+        <w:rPr>
+          <w:rFonts w:ascii="Arial" w:hAnsi="Arial" w:cs="Arial"/>
+          <w:lang w:val="en-US"/>
+        </w:rPr>
+        <w:t>order.setDeliveryStreet</w:t>
+      </w:r>
+      <w:proofErr w:type="spellEnd"/>
+      <w:r>
+        <w:rPr>
+          <w:rFonts w:ascii="Arial" w:hAnsi="Arial" w:cs="Arial"/>
+          <w:lang w:val="en-US"/>
+        </w:rPr>
+        <w:t>(</w:t>
+      </w:r>
+      <w:proofErr w:type="spellStart"/>
+      <w:r>
+        <w:rPr>
+          <w:rFonts w:ascii="Arial" w:hAnsi="Arial" w:cs="Arial"/>
+          <w:lang w:val="en-US"/>
+        </w:rPr>
+        <w:t>patch.getDeliveryStreet</w:t>
+      </w:r>
+      <w:proofErr w:type="spellEnd"/>
+      <w:r>
+        <w:rPr>
+          <w:rFonts w:ascii="Arial" w:hAnsi="Arial" w:cs="Arial"/>
+          <w:lang w:val="en-US"/>
+        </w:rPr>
+        <w:t>());</w:t>
+      </w:r>
+    </w:p>
+    <w:p>
+      <w:pPr>
+        <w:spacing w:after="0"/>
+        <w:rPr>
+          <w:rFonts w:ascii="Arial" w:hAnsi="Arial" w:cs="Arial"/>
+          <w:lang w:val="en-US"/>
+        </w:rPr>
+      </w:pPr>
+      <w:r>
+        <w:rPr>
+          <w:rFonts w:ascii="Arial" w:hAnsi="Arial" w:cs="Arial"/>
+          <w:lang w:val="en-US"/>
+        </w:rPr>
+        <w:t xml:space="preserve">          }</w:t>
+      </w:r>
+    </w:p>
+    <w:p>
+      <w:pPr>
+        <w:spacing w:after="0"/>
+        <w:rPr>
+          <w:rFonts w:ascii="Arial" w:hAnsi="Arial" w:cs="Arial"/>
+          <w:lang w:val="en-US"/>
+        </w:rPr>
+      </w:pPr>
+      <w:r>
+        <w:rPr>
+          <w:rFonts w:ascii="Arial" w:hAnsi="Arial" w:cs="Arial"/>
+          <w:lang w:val="en-US"/>
+        </w:rPr>
+        <w:t xml:space="preserve">          if (</w:t>
+      </w:r>
+      <w:proofErr w:type="spellStart"/>
+      <w:r>
+        <w:rPr>
+          <w:rFonts w:ascii="Arial" w:hAnsi="Arial" w:cs="Arial"/>
+          <w:lang w:val="en-US"/>
+        </w:rPr>
+        <w:t>patch.getDeliveryCity</w:t>
+      </w:r>
+      <w:proofErr w:type="spellEnd"/>
+      <w:r>
+        <w:rPr>
+          <w:rFonts w:ascii="Arial" w:hAnsi="Arial" w:cs="Arial"/>
+          <w:lang w:val="en-US"/>
+        </w:rPr>
+        <w:t>() != null) {</w:t>
+      </w:r>
+    </w:p>
+    <w:p>
+      <w:pPr>
+        <w:spacing w:after="0"/>
+        <w:rPr>
+          <w:rFonts w:ascii="Arial" w:hAnsi="Arial" w:cs="Arial"/>
+          <w:lang w:val="en-US"/>
+        </w:rPr>
+      </w:pPr>
+      <w:r>
+        <w:rPr>
+          <w:rFonts w:ascii="Arial" w:hAnsi="Arial" w:cs="Arial"/>
+          <w:lang w:val="en-US"/>
+        </w:rPr>
+        <w:t xml:space="preserve">            </w:t>
+      </w:r>
+      <w:proofErr w:type="spellStart"/>
+      <w:r>
+        <w:rPr>
+          <w:rFonts w:ascii="Arial" w:hAnsi="Arial" w:cs="Arial"/>
+          <w:lang w:val="en-US"/>
+        </w:rPr>
+        <w:t>order.setDeliveryCity</w:t>
+      </w:r>
+      <w:proofErr w:type="spellEnd"/>
+      <w:r>
+        <w:rPr>
+          <w:rFonts w:ascii="Arial" w:hAnsi="Arial" w:cs="Arial"/>
+          <w:lang w:val="en-US"/>
+        </w:rPr>
+        <w:t>(</w:t>
+      </w:r>
+      <w:proofErr w:type="spellStart"/>
+      <w:r>
+        <w:rPr>
+          <w:rFonts w:ascii="Arial" w:hAnsi="Arial" w:cs="Arial"/>
+          <w:lang w:val="en-US"/>
+        </w:rPr>
+        <w:t>patch.getDeliveryCity</w:t>
+      </w:r>
+      <w:proofErr w:type="spellEnd"/>
+      <w:r>
+        <w:rPr>
+          <w:rFonts w:ascii="Arial" w:hAnsi="Arial" w:cs="Arial"/>
+          <w:lang w:val="en-US"/>
+        </w:rPr>
+        <w:t>());</w:t>
+      </w:r>
+    </w:p>
+    <w:p>
+      <w:pPr>
+        <w:spacing w:after="0"/>
+        <w:rPr>
+          <w:rFonts w:ascii="Arial" w:hAnsi="Arial" w:cs="Arial"/>
+          <w:lang w:val="en-US"/>
+        </w:rPr>
+      </w:pPr>
+      <w:r>
+        <w:rPr>
+          <w:rFonts w:ascii="Arial" w:hAnsi="Arial" w:cs="Arial"/>
+          <w:lang w:val="en-US"/>
+        </w:rPr>
+        <w:t xml:space="preserve">          }</w:t>
+      </w:r>
+    </w:p>
+    <w:p>
+      <w:pPr>
+        <w:spacing w:after="0"/>
+        <w:rPr>
+          <w:rFonts w:ascii="Arial" w:hAnsi="Arial" w:cs="Arial"/>
+          <w:lang w:val="en-US"/>
+        </w:rPr>
+      </w:pPr>
+      <w:r>
+        <w:rPr>
+          <w:rFonts w:ascii="Arial" w:hAnsi="Arial" w:cs="Arial"/>
+          <w:lang w:val="en-US"/>
+        </w:rPr>
+        <w:t xml:space="preserve">          if (</w:t>
+      </w:r>
+      <w:proofErr w:type="spellStart"/>
+      <w:r>
+        <w:rPr>
+          <w:rFonts w:ascii="Arial" w:hAnsi="Arial" w:cs="Arial"/>
+          <w:lang w:val="en-US"/>
+        </w:rPr>
+        <w:t>patch.getDeliveryState</w:t>
+      </w:r>
+      <w:proofErr w:type="spellEnd"/>
+      <w:r>
+        <w:rPr>
+          <w:rFonts w:ascii="Arial" w:hAnsi="Arial" w:cs="Arial"/>
+          <w:lang w:val="en-US"/>
+        </w:rPr>
+        <w:t>() != null) {</w:t>
+      </w:r>
+    </w:p>
+    <w:p>
+      <w:pPr>
+        <w:spacing w:after="0"/>
+        <w:rPr>
+          <w:rFonts w:ascii="Arial" w:hAnsi="Arial" w:cs="Arial"/>
+          <w:lang w:val="en-US"/>
+        </w:rPr>
+      </w:pPr>
+      <w:r>
+        <w:rPr>
+          <w:rFonts w:ascii="Arial" w:hAnsi="Arial" w:cs="Arial"/>
+          <w:lang w:val="en-US"/>
+        </w:rPr>
+        <w:t xml:space="preserve">            </w:t>
+      </w:r>
+      <w:proofErr w:type="spellStart"/>
+      <w:r>
+        <w:rPr>
+          <w:rFonts w:ascii="Arial" w:hAnsi="Arial" w:cs="Arial"/>
+          <w:lang w:val="en-US"/>
+        </w:rPr>
+        <w:t>order.setDeliveryState</w:t>
+      </w:r>
+      <w:proofErr w:type="spellEnd"/>
+      <w:r>
+        <w:rPr>
+          <w:rFonts w:ascii="Arial" w:hAnsi="Arial" w:cs="Arial"/>
+          <w:lang w:val="en-US"/>
+        </w:rPr>
+        <w:t>(</w:t>
+      </w:r>
+      <w:proofErr w:type="spellStart"/>
+      <w:r>
+        <w:rPr>
+          <w:rFonts w:ascii="Arial" w:hAnsi="Arial" w:cs="Arial"/>
+          <w:lang w:val="en-US"/>
+        </w:rPr>
+        <w:t>patch.getDeliveryState</w:t>
+      </w:r>
+      <w:proofErr w:type="spellEnd"/>
+      <w:r>
+        <w:rPr>
+          <w:rFonts w:ascii="Arial" w:hAnsi="Arial" w:cs="Arial"/>
+          <w:lang w:val="en-US"/>
+        </w:rPr>
+        <w:t>());</w:t>
+      </w:r>
+    </w:p>
+    <w:p>
+      <w:pPr>
+        <w:spacing w:after="0"/>
+        <w:rPr>
+          <w:rFonts w:ascii="Arial" w:hAnsi="Arial" w:cs="Arial"/>
+          <w:lang w:val="en-US"/>
+        </w:rPr>
+      </w:pPr>
+      <w:r>
+        <w:rPr>
+          <w:rFonts w:ascii="Arial" w:hAnsi="Arial" w:cs="Arial"/>
+          <w:lang w:val="en-US"/>
+        </w:rPr>
+        <w:t xml:space="preserve">          }</w:t>
+      </w:r>
+    </w:p>
+    <w:p>
+      <w:pPr>
+        <w:spacing w:after="0"/>
+        <w:rPr>
+          <w:rFonts w:ascii="Arial" w:hAnsi="Arial" w:cs="Arial"/>
+          <w:lang w:val="en-US"/>
+        </w:rPr>
+      </w:pPr>
+      <w:r>
+        <w:rPr>
+          <w:rFonts w:ascii="Arial" w:hAnsi="Arial" w:cs="Arial"/>
+          <w:lang w:val="en-US"/>
+        </w:rPr>
+        <w:t xml:space="preserve">          if (</w:t>
+      </w:r>
+      <w:proofErr w:type="spellStart"/>
+      <w:r>
+        <w:rPr>
+          <w:rFonts w:ascii="Arial" w:hAnsi="Arial" w:cs="Arial"/>
+          <w:lang w:val="en-US"/>
+        </w:rPr>
+        <w:t>patch.getDeliveryZip</w:t>
+      </w:r>
+      <w:proofErr w:type="spellEnd"/>
+      <w:r>
+        <w:rPr>
+          <w:rFonts w:ascii="Arial" w:hAnsi="Arial" w:cs="Arial"/>
+          <w:lang w:val="en-US"/>
+        </w:rPr>
+        <w:t>() != null) {</w:t>
+      </w:r>
+    </w:p>
+    <w:p>
+      <w:pPr>
+        <w:spacing w:after="0"/>
+        <w:rPr>
+          <w:rFonts w:ascii="Arial" w:hAnsi="Arial" w:cs="Arial"/>
+          <w:lang w:val="en-US"/>
+        </w:rPr>
+      </w:pPr>
+      <w:r>
+        <w:rPr>
+          <w:rFonts w:ascii="Arial" w:hAnsi="Arial" w:cs="Arial"/>
+          <w:lang w:val="en-US"/>
+        </w:rPr>
+        <w:t xml:space="preserve">            </w:t>
+      </w:r>
+      <w:proofErr w:type="spellStart"/>
+      <w:r>
+        <w:rPr>
+          <w:rFonts w:ascii="Arial" w:hAnsi="Arial" w:cs="Arial"/>
+          <w:lang w:val="en-US"/>
+        </w:rPr>
+        <w:t>order.setDeliveryZip</w:t>
+      </w:r>
+      <w:proofErr w:type="spellEnd"/>
+      <w:r>
+        <w:rPr>
+          <w:rFonts w:ascii="Arial" w:hAnsi="Arial" w:cs="Arial"/>
+          <w:lang w:val="en-US"/>
+        </w:rPr>
+        <w:t>(</w:t>
+      </w:r>
+      <w:proofErr w:type="spellStart"/>
+      <w:r>
+        <w:rPr>
+          <w:rFonts w:ascii="Arial" w:hAnsi="Arial" w:cs="Arial"/>
+          <w:lang w:val="en-US"/>
+        </w:rPr>
+        <w:t>patch.getDeliveryZip</w:t>
+      </w:r>
+      <w:proofErr w:type="spellEnd"/>
+      <w:r>
+        <w:rPr>
+          <w:rFonts w:ascii="Arial" w:hAnsi="Arial" w:cs="Arial"/>
+          <w:lang w:val="en-US"/>
+        </w:rPr>
+        <w:t>());</w:t>
+      </w:r>
+    </w:p>
+    <w:p>
+      <w:pPr>
+        <w:spacing w:after="0"/>
+        <w:rPr>
+          <w:rFonts w:ascii="Arial" w:hAnsi="Arial" w:cs="Arial"/>
+          <w:lang w:val="en-US"/>
+        </w:rPr>
+      </w:pPr>
+      <w:r>
+        <w:rPr>
+          <w:rFonts w:ascii="Arial" w:hAnsi="Arial" w:cs="Arial"/>
+          <w:lang w:val="en-US"/>
+        </w:rPr>
+        <w:t xml:space="preserve">          }</w:t>
+      </w:r>
+    </w:p>
+    <w:p>
+      <w:pPr>
+        <w:spacing w:after="0"/>
+        <w:rPr>
+          <w:rFonts w:ascii="Arial" w:hAnsi="Arial" w:cs="Arial"/>
+          <w:lang w:val="en-US"/>
+        </w:rPr>
+      </w:pPr>
+      <w:r>
+        <w:rPr>
+          <w:rFonts w:ascii="Arial" w:hAnsi="Arial" w:cs="Arial"/>
+          <w:lang w:val="en-US"/>
+        </w:rPr>
+        <w:t xml:space="preserve">          return order;</w:t>
+      </w:r>
+    </w:p>
+    <w:p>
+      <w:pPr>
+        <w:spacing w:after="0"/>
+        <w:rPr>
+          <w:rFonts w:ascii="Arial" w:hAnsi="Arial" w:cs="Arial"/>
+        </w:rPr>
+      </w:pPr>
+      <w:r>
+        <w:rPr>
+          <w:rFonts w:ascii="Arial" w:hAnsi="Arial" w:cs="Arial"/>
+          <w:lang w:val="en-US"/>
+        </w:rPr>
+        <w:t xml:space="preserve">        </w:t>
+      </w:r>
+      <w:r>
+        <w:rPr>
+          <w:rFonts w:ascii="Arial" w:hAnsi="Arial" w:cs="Arial"/>
+        </w:rPr>
+        <w:t>})</w:t>
+      </w:r>
+    </w:p>
+    <w:p>
+      <w:pPr>
+        <w:spacing w:after="0"/>
+        <w:rPr>
+          <w:rFonts w:ascii="Arial" w:hAnsi="Arial" w:cs="Arial"/>
+        </w:rPr>
+      </w:pPr>
+      <w:r>
+        <w:rPr>
+          <w:rFonts w:ascii="Arial" w:hAnsi="Arial" w:cs="Arial"/>
+        </w:rPr>
+        <w:t xml:space="preserve">        .</w:t>
+      </w:r>
+      <w:proofErr w:type="spellStart"/>
+      <w:r>
+        <w:rPr>
+          <w:rFonts w:ascii="Arial" w:hAnsi="Arial" w:cs="Arial"/>
+        </w:rPr>
+        <w:t>flatMap</w:t>
+      </w:r>
+      <w:proofErr w:type="spellEnd"/>
+      <w:r>
+        <w:rPr>
+          <w:rFonts w:ascii="Arial" w:hAnsi="Arial" w:cs="Arial"/>
+        </w:rPr>
+        <w:t>(repo::</w:t>
+      </w:r>
+      <w:proofErr w:type="spellStart"/>
+      <w:r>
+        <w:rPr>
+          <w:rFonts w:ascii="Arial" w:hAnsi="Arial" w:cs="Arial"/>
+        </w:rPr>
+        <w:t>save</w:t>
+      </w:r>
+      <w:proofErr w:type="spellEnd"/>
+      <w:r>
+        <w:rPr>
+          <w:rFonts w:ascii="Arial" w:hAnsi="Arial" w:cs="Arial"/>
+        </w:rPr>
+        <w:t>);</w:t>
+      </w:r>
+    </w:p>
+    <w:p>
+      <w:pPr>
+        <w:spacing w:after="0"/>
+        <w:rPr>
+          <w:rFonts w:ascii="Arial" w:hAnsi="Arial" w:cs="Arial"/>
+        </w:rPr>
+      </w:pPr>
+      <w:r>
+        <w:rPr>
+          <w:rFonts w:ascii="Arial" w:hAnsi="Arial" w:cs="Arial"/>
+        </w:rPr>
+        <w:t xml:space="preserve">  }</w:t>
+      </w:r>
+    </w:p>
+    <w:p>
+      <w:pPr>
+        <w:rPr>
+          <w:rFonts w:ascii="Arial" w:hAnsi="Arial" w:cs="Arial"/>
+        </w:rPr>
+      </w:pPr>
+      <w:r>
+        <w:rPr>
+          <w:rFonts w:ascii="Arial" w:hAnsi="Arial" w:cs="Arial"/>
+        </w:rPr>
+        <w:t xml:space="preserve">  //TC-04 - Fin</w:t>
+      </w:r>
+    </w:p>
+    <w:p/>
+    <w:p>
+      <w:r>
+        <w:t>Se creó un DTO para guardar los campos necesarios</w:t>
+      </w:r>
+    </w:p>
+    <w:p>
+      <w:pPr>
+        <w:spacing w:after="0"/>
+        <w:rPr>
+          <w:rFonts w:ascii="Arial" w:hAnsi="Arial" w:cs="Arial"/>
+          <w:lang w:val="en-US"/>
+        </w:rPr>
+      </w:pPr>
+      <w:proofErr w:type="gramStart"/>
+      <w:r>
+        <w:rPr>
+          <w:rFonts w:ascii="Arial" w:hAnsi="Arial" w:cs="Arial"/>
+          <w:lang w:val="en-US"/>
+        </w:rPr>
+        <w:t>@Data</w:t>
+      </w:r>
+      <w:proofErr w:type="gramEnd"/>
+    </w:p>
+    <w:p>
+      <w:pPr>
+        <w:spacing w:after="0"/>
+        <w:rPr>
+          <w:rFonts w:ascii="Arial" w:hAnsi="Arial" w:cs="Arial"/>
+          <w:lang w:val="en-US"/>
+        </w:rPr>
+      </w:pPr>
+      <w:r>
+        <w:rPr>
+          <w:rFonts w:ascii="Arial" w:hAnsi="Arial" w:cs="Arial"/>
+          <w:lang w:val="en-US"/>
+        </w:rPr>
+        <w:t xml:space="preserve">public class </w:t>
+      </w:r>
+      <w:proofErr w:type="spellStart"/>
+      <w:r>
+        <w:rPr>
+          <w:rFonts w:ascii="Arial" w:hAnsi="Arial" w:cs="Arial"/>
+          <w:lang w:val="en-US"/>
+        </w:rPr>
+        <w:t>OrderPatchRequest</w:t>
+      </w:r>
+      <w:proofErr w:type="spellEnd"/>
+      <w:r>
+        <w:rPr>
+          <w:rFonts w:ascii="Arial" w:hAnsi="Arial" w:cs="Arial"/>
+          <w:lang w:val="en-US"/>
+        </w:rPr>
+        <w:t xml:space="preserve"> {</w:t>
+      </w:r>
+    </w:p>
+    <w:p>
+      <w:pPr>
+        <w:spacing w:after="0"/>
+        <w:rPr>
+          <w:rFonts w:ascii="Arial" w:hAnsi="Arial" w:cs="Arial"/>
+          <w:lang w:val="en-US"/>
+        </w:rPr>
+      </w:pPr>
+      <w:r>
+        <w:rPr>
+          <w:rFonts w:ascii="Arial" w:hAnsi="Arial" w:cs="Arial"/>
+          <w:lang w:val="en-US"/>
+        </w:rPr>
+        <w:t xml:space="preserve">    private String </w:t>
+      </w:r>
+      <w:proofErr w:type="spellStart"/>
+      <w:r>
+        <w:rPr>
+          <w:rFonts w:ascii="Arial" w:hAnsi="Arial" w:cs="Arial"/>
+          <w:lang w:val="en-US"/>
+        </w:rPr>
+        <w:t>deliveryName</w:t>
+      </w:r>
+      <w:proofErr w:type="spellEnd"/>
+      <w:r>
+        <w:rPr>
+          <w:rFonts w:ascii="Arial" w:hAnsi="Arial" w:cs="Arial"/>
+          <w:lang w:val="en-US"/>
+        </w:rPr>
+        <w:t>;</w:t>
+      </w:r>
+    </w:p>
+    <w:p>
+      <w:pPr>
+        <w:spacing w:after="0"/>
+        <w:rPr>
+          <w:rFonts w:ascii="Arial" w:hAnsi="Arial" w:cs="Arial"/>
+          <w:lang w:val="en-US"/>
+        </w:rPr>
+      </w:pPr>
+      <w:r>
+        <w:rPr>
+          <w:rFonts w:ascii="Arial" w:hAnsi="Arial" w:cs="Arial"/>
+          <w:lang w:val="en-US"/>
+        </w:rPr>
+        <w:t xml:space="preserve">    private String </w:t>
+      </w:r>
+      <w:proofErr w:type="spellStart"/>
+      <w:r>
+        <w:rPr>
+          <w:rFonts w:ascii="Arial" w:hAnsi="Arial" w:cs="Arial"/>
+          <w:lang w:val="en-US"/>
+        </w:rPr>
+        <w:t>deliveryStreet</w:t>
+      </w:r>
+      <w:proofErr w:type="spellEnd"/>
+      <w:r>
+        <w:rPr>
+          <w:rFonts w:ascii="Arial" w:hAnsi="Arial" w:cs="Arial"/>
+          <w:lang w:val="en-US"/>
+        </w:rPr>
+        <w:t>;</w:t>
+      </w:r>
+    </w:p>
+    <w:p>
+      <w:pPr>
+        <w:spacing w:after="0"/>
+        <w:rPr>
+          <w:rFonts w:ascii="Arial" w:hAnsi="Arial" w:cs="Arial"/>
+          <w:lang w:val="en-US"/>
+        </w:rPr>
+      </w:pPr>
+      <w:r>
+        <w:rPr>
+          <w:rFonts w:ascii="Arial" w:hAnsi="Arial" w:cs="Arial"/>
+          <w:lang w:val="en-US"/>
+        </w:rPr>
+        <w:t xml:space="preserve">    private String </w:t>
+      </w:r>
+      <w:proofErr w:type="spellStart"/>
+      <w:r>
+        <w:rPr>
+          <w:rFonts w:ascii="Arial" w:hAnsi="Arial" w:cs="Arial"/>
+          <w:lang w:val="en-US"/>
+        </w:rPr>
+        <w:t>deliveryCity</w:t>
+      </w:r>
+      <w:proofErr w:type="spellEnd"/>
+      <w:r>
+        <w:rPr>
+          <w:rFonts w:ascii="Arial" w:hAnsi="Arial" w:cs="Arial"/>
+          <w:lang w:val="en-US"/>
+        </w:rPr>
+        <w:t>;</w:t>
+      </w:r>
+    </w:p>
+    <w:p>
+      <w:pPr>
+        <w:spacing w:after="0"/>
+        <w:rPr>
+          <w:rFonts w:ascii="Arial" w:hAnsi="Arial" w:cs="Arial"/>
+          <w:lang w:val="en-US"/>
+        </w:rPr>
+      </w:pPr>
+      <w:r>
+        <w:rPr>
+          <w:rFonts w:ascii="Arial" w:hAnsi="Arial" w:cs="Arial"/>
+          <w:lang w:val="en-US"/>
+        </w:rPr>
+        <w:t xml:space="preserve">    private String </w:t>
+      </w:r>
+      <w:proofErr w:type="spellStart"/>
+      <w:r>
+        <w:rPr>
+          <w:rFonts w:ascii="Arial" w:hAnsi="Arial" w:cs="Arial"/>
+          <w:lang w:val="en-US"/>
+        </w:rPr>
+        <w:t>deliveryState</w:t>
+      </w:r>
+      <w:proofErr w:type="spellEnd"/>
+      <w:r>
+        <w:rPr>
+          <w:rFonts w:ascii="Arial" w:hAnsi="Arial" w:cs="Arial"/>
+          <w:lang w:val="en-US"/>
+        </w:rPr>
+        <w:t>;</w:t>
+      </w:r>
+    </w:p>
+    <w:p>
+      <w:pPr>
+        <w:spacing w:after="0"/>
+        <w:rPr>
+          <w:rFonts w:ascii="Arial" w:hAnsi="Arial" w:cs="Arial"/>
+          <w:lang w:val="en-US"/>
+        </w:rPr>
+      </w:pPr>
+      <w:r>
+        <w:rPr>
+          <w:rFonts w:ascii="Arial" w:hAnsi="Arial" w:cs="Arial"/>
+          <w:lang w:val="en-US"/>
+        </w:rPr>
+        <w:t xml:space="preserve">    private String </w:t>
+      </w:r>
+      <w:proofErr w:type="spellStart"/>
+      <w:r>
+        <w:rPr>
+          <w:rFonts w:ascii="Arial" w:hAnsi="Arial" w:cs="Arial"/>
+          <w:lang w:val="en-US"/>
+        </w:rPr>
+        <w:t>deliveryZip</w:t>
+      </w:r>
+      <w:proofErr w:type="spellEnd"/>
+      <w:r>
+        <w:rPr>
+          <w:rFonts w:ascii="Arial" w:hAnsi="Arial" w:cs="Arial"/>
+          <w:lang w:val="en-US"/>
+        </w:rPr>
+        <w:t>;</w:t>
+      </w:r>
+    </w:p>
+    <w:p>
+      <w:pPr>
+        <w:rPr>
+          <w:rFonts w:ascii="Arial" w:hAnsi="Arial" w:cs="Arial"/>
+        </w:rPr>
+      </w:pPr>
+      <w:r>
+        <w:rPr>
+          <w:rFonts w:ascii="Arial" w:hAnsi="Arial" w:cs="Arial"/>
+        </w:rPr>
+        <w:t>}</w:t>
+      </w:r>
+    </w:p>
+    <w:p/>
+    <w:p>
+      <w:r>
+        <w:t>Primero se creó una orden:</w:t>
+      </w:r>
+    </w:p>
+    <w:p>
+      <w:pPr>
+        <w:jc w:val="center"/>
+      </w:pPr>
+      <w:r>
+        <w:rPr>
+          <w:noProof/>
+        </w:rPr>
+        <w:lastRenderedPageBreak/>
+        <w:drawing>
+          <wp:inline distT="0" distB="0" distL="0" distR="0" wp14:anchorId="18FE7811" wp14:editId="7542EC58">
+            <wp:extent cx="5385959" cy="3489960"/>
+            <wp:effectExtent l="0" t="0" r="5715" b="0"/>
+            <wp:docPr id="580512121" name="Imagen 1"/>
+            <wp:cNvGraphicFramePr>
+              <a:graphicFrameLocks xmlns:a="http://schemas.openxmlformats.org/drawingml/2006/main" noChangeAspect="1"/>
+            </wp:cNvGraphicFramePr>
+            <a:graphic xmlns:a="http://schemas.openxmlformats.org/drawingml/2006/main">
+              <a:graphicData uri="http://schemas.openxmlformats.org/drawingml/2006/picture">
+                <pic:pic xmlns:pic="http://schemas.openxmlformats.org/drawingml/2006/picture">
+                  <pic:nvPicPr>
+                    <pic:cNvPr id="580512121" name=""/>
+                    <pic:cNvPicPr/>
+                  </pic:nvPicPr>
+                  <pic:blipFill rotWithShape="1">
+                    <a:blip r:embed="rId16"/>
+                    <a:srcRect l="25128" t="8687"/>
+                    <a:stretch>
+                      <a:fillRect/>
+                    </a:stretch>
+                  </pic:blipFill>
+                  <pic:spPr bwMode="auto">
+                    <a:xfrm>
+                      <a:off x="0" y="0"/>
+                      <a:ext cx="5395326" cy="3496030"/>
+                    </a:xfrm>
+                    <a:prstGeom prst="rect">
+                      <a:avLst/>
+                    </a:prstGeom>
+                    <a:ln>
+                      <a:noFill/>
+                    </a:ln>
+                    <a:extLst>
+                      <a:ext uri="{53640926-AAD7-44D8-BBD7-CCE9431645EC}">
+                        <a14:shadowObscured xmlns:a14="http://schemas.microsoft.com/office/drawing/2010/main"/>
+                      </a:ext>
+                    </a:extLst>
+                  </pic:spPr>
+                </pic:pic>
+              </a:graphicData>
+            </a:graphic>
+          </wp:inline>
+        </w:drawing>
+      </w:r>
+    </w:p>
+    <w:p>
+      <w:r>
+        <w:t xml:space="preserve">Utilizando el </w:t>
+      </w:r>
+      <w:proofErr w:type="spellStart"/>
+      <w:r>
+        <w:t>patch</w:t>
+      </w:r>
+      <w:proofErr w:type="spellEnd"/>
+      <w:r>
+        <w:t xml:space="preserve"> correctamente:</w:t>
+      </w:r>
+    </w:p>
+    <w:p>
+      <w:pPr>
+        <w:jc w:val="center"/>
+      </w:pPr>
+      <w:r>
+        <w:rPr>
+          <w:noProof/>
+        </w:rPr>
+        <w:drawing>
+          <wp:inline distT="0" distB="0" distL="0" distR="0" wp14:anchorId="2BB10ADA" wp14:editId="54326492">
+            <wp:extent cx="5458303" cy="3528060"/>
+            <wp:effectExtent l="0" t="0" r="9525" b="0"/>
+            <wp:docPr id="612640045" name="Imagen 1"/>
+            <wp:cNvGraphicFramePr>
+              <a:graphicFrameLocks xmlns:a="http://schemas.openxmlformats.org/drawingml/2006/main" noChangeAspect="1"/>
+            </wp:cNvGraphicFramePr>
+            <a:graphic xmlns:a="http://schemas.openxmlformats.org/drawingml/2006/main">
+              <a:graphicData uri="http://schemas.openxmlformats.org/drawingml/2006/picture">
+                <pic:pic xmlns:pic="http://schemas.openxmlformats.org/drawingml/2006/picture">
+                  <pic:nvPicPr>
+                    <pic:cNvPr id="612640045" name=""/>
+                    <pic:cNvPicPr/>
+                  </pic:nvPicPr>
+                  <pic:blipFill rotWithShape="1">
+                    <a:blip r:embed="rId17"/>
+                    <a:srcRect l="24744" t="8445"/>
+                    <a:stretch>
+                      <a:fillRect/>
+                    </a:stretch>
+                  </pic:blipFill>
+                  <pic:spPr bwMode="auto">
+                    <a:xfrm>
+                      <a:off x="0" y="0"/>
+                      <a:ext cx="5467180" cy="3533798"/>
+                    </a:xfrm>
+                    <a:prstGeom prst="rect">
+                      <a:avLst/>
+                    </a:prstGeom>
+                    <a:ln>
+                      <a:noFill/>
+                    </a:ln>
+                    <a:extLst>
+                      <a:ext uri="{53640926-AAD7-44D8-BBD7-CCE9431645EC}">
+                        <a14:shadowObscured xmlns:a14="http://schemas.microsoft.com/office/drawing/2010/main"/>
+                      </a:ext>
+                    </a:extLst>
+                  </pic:spPr>
+                </pic:pic>
+              </a:graphicData>
+            </a:graphic>
+          </wp:inline>
+        </w:drawing>
+      </w:r>
+    </w:p>
+    <w:p>
+      <w:r>
+        <w:t>Obteniendo la orden para verificar los cambios:</w:t>
+      </w:r>
+    </w:p>
+    <w:p>
+      <w:pPr>
+        <w:jc w:val="center"/>
+      </w:pPr>
+      <w:r>
+        <w:rPr>
+          <w:noProof/>
+        </w:rPr>
+        <w:lastRenderedPageBreak/>
+        <w:drawing>
+          <wp:inline distT="0" distB="0" distL="0" distR="0" wp14:anchorId="78AB1A37" wp14:editId="31EAFAEF">
+            <wp:extent cx="5503069" cy="3581400"/>
+            <wp:effectExtent l="0" t="0" r="2540" b="0"/>
+            <wp:docPr id="424142108" name="Imagen 1"/>
+            <wp:cNvGraphicFramePr>
+              <a:graphicFrameLocks xmlns:a="http://schemas.openxmlformats.org/drawingml/2006/main" noChangeAspect="1"/>
+            </wp:cNvGraphicFramePr>
+            <a:graphic xmlns:a="http://schemas.openxmlformats.org/drawingml/2006/main">
+              <a:graphicData uri="http://schemas.openxmlformats.org/drawingml/2006/picture">
+                <pic:pic xmlns:pic="http://schemas.openxmlformats.org/drawingml/2006/picture">
+                  <pic:nvPicPr>
+                    <pic:cNvPr id="424142108" name=""/>
+                    <pic:cNvPicPr/>
+                  </pic:nvPicPr>
+                  <pic:blipFill rotWithShape="1">
+                    <a:blip r:embed="rId18"/>
+                    <a:srcRect l="25256" t="8445"/>
+                    <a:stretch>
+                      <a:fillRect/>
+                    </a:stretch>
+                  </pic:blipFill>
+                  <pic:spPr bwMode="auto">
+                    <a:xfrm>
+                      <a:off x="0" y="0"/>
+                      <a:ext cx="5520042" cy="3592446"/>
+                    </a:xfrm>
+                    <a:prstGeom prst="rect">
+                      <a:avLst/>
+                    </a:prstGeom>
+                    <a:ln>
+                      <a:noFill/>
+                    </a:ln>
+                    <a:extLst>
+                      <a:ext uri="{53640926-AAD7-44D8-BBD7-CCE9431645EC}">
+                        <a14:shadowObscured xmlns:a14="http://schemas.microsoft.com/office/drawing/2010/main"/>
+                      </a:ext>
+                    </a:extLst>
+                  </pic:spPr>
+                </pic:pic>
+              </a:graphicData>
+            </a:graphic>
+          </wp:inline>
+        </w:drawing>
+      </w:r>
+    </w:p>
+    <w:p>
+      <w:r>
+        <w:t>Realizando cambios a campos que NO se deben modificar:</w:t>
+      </w:r>
+    </w:p>
+    <w:p>
+      <w:pPr>
+        <w:jc w:val="center"/>
+      </w:pPr>
+      <w:r>
+        <w:rPr>
+          <w:noProof/>
+        </w:rPr>
+        <w:drawing>
+          <wp:inline distT="0" distB="0" distL="0" distR="0" wp14:anchorId="09CA4D13" wp14:editId="30636559">
+            <wp:extent cx="5553511" cy="3589020"/>
+            <wp:effectExtent l="0" t="0" r="9525" b="0"/>
+            <wp:docPr id="896101263" name="Imagen 1"/>
+            <wp:cNvGraphicFramePr>
+              <a:graphicFrameLocks xmlns:a="http://schemas.openxmlformats.org/drawingml/2006/main" noChangeAspect="1"/>
+            </wp:cNvGraphicFramePr>
+            <a:graphic xmlns:a="http://schemas.openxmlformats.org/drawingml/2006/main">
+              <a:graphicData uri="http://schemas.openxmlformats.org/drawingml/2006/picture">
+                <pic:pic xmlns:pic="http://schemas.openxmlformats.org/drawingml/2006/picture">
+                  <pic:nvPicPr>
+                    <pic:cNvPr id="896101263" name=""/>
+                    <pic:cNvPicPr/>
+                  </pic:nvPicPr>
+                  <pic:blipFill rotWithShape="1">
+                    <a:blip r:embed="rId19"/>
+                    <a:srcRect l="25128" t="8928"/>
+                    <a:stretch>
+                      <a:fillRect/>
+                    </a:stretch>
+                  </pic:blipFill>
+                  <pic:spPr bwMode="auto">
+                    <a:xfrm>
+                      <a:off x="0" y="0"/>
+                      <a:ext cx="5562584" cy="3594883"/>
+                    </a:xfrm>
+                    <a:prstGeom prst="rect">
+                      <a:avLst/>
+                    </a:prstGeom>
+                    <a:ln>
+                      <a:noFill/>
+                    </a:ln>
+                    <a:extLst>
+                      <a:ext uri="{53640926-AAD7-44D8-BBD7-CCE9431645EC}">
+                        <a14:shadowObscured xmlns:a14="http://schemas.microsoft.com/office/drawing/2010/main"/>
+                      </a:ext>
+                    </a:extLst>
+                  </pic:spPr>
+                </pic:pic>
+              </a:graphicData>
+            </a:graphic>
+          </wp:inline>
+        </w:drawing>
+      </w:r>
+    </w:p>
+    <w:p>
+      <w:r>
+        <w:t xml:space="preserve">Verificando que </w:t>
+      </w:r>
+      <w:proofErr w:type="spellStart"/>
+      <w:r>
+        <w:rPr>
+          <w:i/>
+          <w:iCs/>
+        </w:rPr>
+        <w:t>user</w:t>
+      </w:r>
+      <w:proofErr w:type="spellEnd"/>
+      <w:r>
+        <w:t xml:space="preserve">, </w:t>
+      </w:r>
+      <w:proofErr w:type="spellStart"/>
+      <w:r>
+        <w:rPr>
+          <w:i/>
+          <w:iCs/>
+        </w:rPr>
+        <w:t>ccNumber</w:t>
+      </w:r>
+      <w:proofErr w:type="spellEnd"/>
+      <w:r>
+        <w:t xml:space="preserve"> y </w:t>
+      </w:r>
+      <w:proofErr w:type="spellStart"/>
+      <w:r>
+        <w:rPr>
+          <w:i/>
+          <w:iCs/>
+        </w:rPr>
+        <w:t>ccCCV</w:t>
+      </w:r>
+      <w:proofErr w:type="spellEnd"/>
+      <w:r>
+        <w:t xml:space="preserve"> no fueron modificados:</w:t>
+      </w:r>
+    </w:p>
+    <w:p>
+      <w:pPr>
+        <w:jc w:val="center"/>
+      </w:pPr>
+      <w:r>
+        <w:rPr>
+          <w:noProof/>
+        </w:rPr>
+        <w:lastRenderedPageBreak/>
+        <w:drawing>
+          <wp:inline distT="0" distB="0" distL="0" distR="0" wp14:anchorId="1EA18A29" wp14:editId="73E34C66">
+            <wp:extent cx="5543156" cy="3589020"/>
+            <wp:effectExtent l="0" t="0" r="635" b="0"/>
+            <wp:docPr id="995445093" name="Imagen 1"/>
+            <wp:cNvGraphicFramePr>
+              <a:graphicFrameLocks xmlns:a="http://schemas.openxmlformats.org/drawingml/2006/main" noChangeAspect="1"/>
+            </wp:cNvGraphicFramePr>
+            <a:graphic xmlns:a="http://schemas.openxmlformats.org/drawingml/2006/main">
+              <a:graphicData uri="http://schemas.openxmlformats.org/drawingml/2006/picture">
+                <pic:pic xmlns:pic="http://schemas.openxmlformats.org/drawingml/2006/picture">
+                  <pic:nvPicPr>
+                    <pic:cNvPr id="995445093" name=""/>
+                    <pic:cNvPicPr/>
+                  </pic:nvPicPr>
+                  <pic:blipFill rotWithShape="1">
+                    <a:blip r:embed="rId20"/>
+                    <a:srcRect l="24872" t="8445"/>
+                    <a:stretch>
+                      <a:fillRect/>
+                    </a:stretch>
+                  </pic:blipFill>
+                  <pic:spPr bwMode="auto">
+                    <a:xfrm>
+                      <a:off x="0" y="0"/>
+                      <a:ext cx="5550386" cy="3593701"/>
+                    </a:xfrm>
+                    <a:prstGeom prst="rect">
+                      <a:avLst/>
+                    </a:prstGeom>
+                    <a:ln>
+                      <a:noFill/>
+                    </a:ln>
+                    <a:extLst>
+                      <a:ext uri="{53640926-AAD7-44D8-BBD7-CCE9431645EC}">
+                        <a14:shadowObscured xmlns:a14="http://schemas.microsoft.com/office/drawing/2010/main"/>
+                      </a:ext>
+                    </a:extLst>
+                  </pic:spPr>
+                </pic:pic>
+              </a:graphicData>
+            </a:graphic>
+          </wp:inline>
+        </w:drawing>
+      </w:r>
+    </w:p>
+    <w:p>
+      <w:r>
+        <w:t xml:space="preserve">Realizando </w:t>
+      </w:r>
+      <w:proofErr w:type="spellStart"/>
+      <w:r>
+        <w:t>patch</w:t>
+      </w:r>
+      <w:proofErr w:type="spellEnd"/>
+      <w:r>
+        <w:t xml:space="preserve"> a un ID inexistente:</w:t>
+      </w:r>
+    </w:p>
+    <w:p>
+      <w:pPr>
+        <w:jc w:val="center"/>
+      </w:pPr>
+      <w:r>
+        <w:rPr>
+          <w:noProof/>
+        </w:rPr>
+        <w:drawing>
+          <wp:inline distT="0" distB="0" distL="0" distR="0" wp14:anchorId="127A3826" wp14:editId="1AC73F8C">
+            <wp:extent cx="5455920" cy="3578790"/>
+            <wp:effectExtent l="0" t="0" r="0" b="3175"/>
+            <wp:docPr id="1675130097" name="Imagen 1"/>
+            <wp:cNvGraphicFramePr>
+              <a:graphicFrameLocks xmlns:a="http://schemas.openxmlformats.org/drawingml/2006/main" noChangeAspect="1"/>
+            </wp:cNvGraphicFramePr>
+            <a:graphic xmlns:a="http://schemas.openxmlformats.org/drawingml/2006/main">
+              <a:graphicData uri="http://schemas.openxmlformats.org/drawingml/2006/picture">
+                <pic:pic xmlns:pic="http://schemas.openxmlformats.org/drawingml/2006/picture">
+                  <pic:nvPicPr>
+                    <pic:cNvPr id="1675130097" name=""/>
+                    <pic:cNvPicPr/>
+                  </pic:nvPicPr>
+                  <pic:blipFill rotWithShape="1">
+                    <a:blip r:embed="rId21"/>
+                    <a:srcRect l="25256" t="7721" b="1"/>
+                    <a:stretch>
+                      <a:fillRect/>
+                    </a:stretch>
+                  </pic:blipFill>
+                  <pic:spPr bwMode="auto">
+                    <a:xfrm>
+                      <a:off x="0" y="0"/>
+                      <a:ext cx="5472342" cy="3589562"/>
+                    </a:xfrm>
+                    <a:prstGeom prst="rect">
+                      <a:avLst/>
+                    </a:prstGeom>
+                    <a:ln>
+                      <a:noFill/>
+                    </a:ln>
+                    <a:extLst>
+                      <a:ext uri="{53640926-AAD7-44D8-BBD7-CCE9431645EC}">
+                        <a14:shadowObscured xmlns:a14="http://schemas.microsoft.com/office/drawing/2010/main"/>
+                      </a:ext>
+                    </a:extLst>
+                  </pic:spPr>
+                </pic:pic>
+              </a:graphicData>
+            </a:graphic>
+          </wp:inline>
+        </w:drawing>
+      </w:r>
+    </w:p>
+    <w:p/>
+    <w:p/>
+    <w:p/>
+    <w:p/>
     <w:p/>
     <w:sectPr>
       <w:pgSz w:w="12240" w:h="15840"/>

</xml_diff>

<commit_message>
TC-05 - PUT y DELETE de ordenes con identidad consistente
test faltantes
</commit_message>
<xml_diff>
--- a/TacoCloud - Pruebas funcionales.docx
+++ b/TacoCloud - Pruebas funcionales.docx
@@ -11,23 +11,13 @@
           <w:szCs w:val="48"/>
         </w:rPr>
       </w:pPr>
-      <w:proofErr w:type="spellStart"/>
       <w:r>
         <w:rPr>
           <w:rFonts w:asciiTheme="majorHAnsi" w:hAnsiTheme="majorHAnsi"/>
           <w:sz w:val="48"/>
           <w:szCs w:val="48"/>
         </w:rPr>
-        <w:t>TacoCloud</w:t>
-      </w:r>
-      <w:proofErr w:type="spellEnd"/>
-      <w:r>
-        <w:rPr>
-          <w:rFonts w:asciiTheme="majorHAnsi" w:hAnsiTheme="majorHAnsi"/>
-          <w:sz w:val="48"/>
-          <w:szCs w:val="48"/>
-        </w:rPr>
-        <w:t xml:space="preserve"> – Retos Funcionales</w:t>
+        <w:t>TacoCloud – Retos Funcionales</w:t>
       </w:r>
     </w:p>
     <w:p>
@@ -108,7 +98,7 @@
           <w:r>
             <w:fldChar w:fldCharType="separate"/>
           </w:r>
-          <w:hyperlink w:anchor="_Toc240576539" w:history="1">
+          <w:hyperlink w:anchor="_Toc240624439" w:history="1">
             <w:r>
               <w:rPr>
                 <w:rStyle w:val="Hipervnculo"/>
@@ -135,7 +125,7 @@
                 <w:noProof/>
                 <w:webHidden/>
               </w:rPr>
-              <w:instrText xml:space="preserve"> PAGEREF _Toc240576539 \h </w:instrText>
+              <w:instrText xml:space="preserve"> PAGEREF _Toc240624439 \h </w:instrText>
             </w:r>
             <w:r>
               <w:rPr>
@@ -180,7 +170,7 @@
               <w:lang w:eastAsia="es-MX"/>
             </w:rPr>
           </w:pPr>
-          <w:hyperlink w:anchor="_Toc240576540" w:history="1">
+          <w:hyperlink w:anchor="_Toc240624440" w:history="1">
             <w:r>
               <w:rPr>
                 <w:rStyle w:val="Hipervnculo"/>
@@ -207,7 +197,7 @@
                 <w:noProof/>
                 <w:webHidden/>
               </w:rPr>
-              <w:instrText xml:space="preserve"> PAGEREF _Toc240576540 \h </w:instrText>
+              <w:instrText xml:space="preserve"> PAGEREF _Toc240624440 \h </w:instrText>
             </w:r>
             <w:r>
               <w:rPr>
@@ -252,7 +242,7 @@
               <w:lang w:eastAsia="es-MX"/>
             </w:rPr>
           </w:pPr>
-          <w:hyperlink w:anchor="_Toc240576541" w:history="1">
+          <w:hyperlink w:anchor="_Toc240624441" w:history="1">
             <w:r>
               <w:rPr>
                 <w:rStyle w:val="Hipervnculo"/>
@@ -279,7 +269,7 @@
                 <w:noProof/>
                 <w:webHidden/>
               </w:rPr>
-              <w:instrText xml:space="preserve"> PAGEREF _Toc240576541 \h </w:instrText>
+              <w:instrText xml:space="preserve"> PAGEREF _Toc240624441 \h </w:instrText>
             </w:r>
             <w:r>
               <w:rPr>
@@ -324,7 +314,7 @@
               <w:lang w:eastAsia="es-MX"/>
             </w:rPr>
           </w:pPr>
-          <w:hyperlink w:anchor="_Toc240576542" w:history="1">
+          <w:hyperlink w:anchor="_Toc240624442" w:history="1">
             <w:r>
               <w:rPr>
                 <w:rStyle w:val="Hipervnculo"/>
@@ -351,7 +341,7 @@
                 <w:noProof/>
                 <w:webHidden/>
               </w:rPr>
-              <w:instrText xml:space="preserve"> PAGEREF _Toc240576542 \h </w:instrText>
+              <w:instrText xml:space="preserve"> PAGEREF _Toc240624442 \h </w:instrText>
             </w:r>
             <w:r>
               <w:rPr>
@@ -396,7 +386,7 @@
               <w:lang w:eastAsia="es-MX"/>
             </w:rPr>
           </w:pPr>
-          <w:hyperlink w:anchor="_Toc240576543" w:history="1">
+          <w:hyperlink w:anchor="_Toc240624443" w:history="1">
             <w:r>
               <w:rPr>
                 <w:rStyle w:val="Hipervnculo"/>
@@ -423,7 +413,7 @@
                 <w:noProof/>
                 <w:webHidden/>
               </w:rPr>
-              <w:instrText xml:space="preserve"> PAGEREF _Toc240576543 \h </w:instrText>
+              <w:instrText xml:space="preserve"> PAGEREF _Toc240624443 \h </w:instrText>
             </w:r>
             <w:r>
               <w:rPr>
@@ -455,6 +445,78 @@
           </w:hyperlink>
         </w:p>
         <w:p>
+          <w:pPr>
+            <w:pStyle w:val="TDC2"/>
+            <w:tabs>
+              <w:tab w:val="right" w:leader="dot" w:pos="9350"/>
+            </w:tabs>
+            <w:rPr>
+              <w:rFonts w:eastAsiaTheme="minorEastAsia"/>
+              <w:noProof/>
+              <w:sz w:val="24"/>
+              <w:szCs w:val="24"/>
+              <w:lang w:eastAsia="es-MX"/>
+            </w:rPr>
+          </w:pPr>
+          <w:hyperlink w:anchor="_Toc240624444" w:history="1">
+            <w:r>
+              <w:rPr>
+                <w:rStyle w:val="Hipervnculo"/>
+                <w:noProof/>
+              </w:rPr>
+              <w:t>TC-05 – PUT y DELETE de órdenes con identidad consistente</w:t>
+            </w:r>
+            <w:r>
+              <w:rPr>
+                <w:noProof/>
+                <w:webHidden/>
+              </w:rPr>
+              <w:tab/>
+            </w:r>
+            <w:r>
+              <w:rPr>
+                <w:noProof/>
+                <w:webHidden/>
+              </w:rPr>
+              <w:fldChar w:fldCharType="begin"/>
+            </w:r>
+            <w:r>
+              <w:rPr>
+                <w:noProof/>
+                <w:webHidden/>
+              </w:rPr>
+              <w:instrText xml:space="preserve"> PAGEREF _Toc240624444 \h </w:instrText>
+            </w:r>
+            <w:r>
+              <w:rPr>
+                <w:noProof/>
+                <w:webHidden/>
+              </w:rPr>
+            </w:r>
+            <w:r>
+              <w:rPr>
+                <w:noProof/>
+                <w:webHidden/>
+              </w:rPr>
+              <w:fldChar w:fldCharType="separate"/>
+            </w:r>
+            <w:r>
+              <w:rPr>
+                <w:noProof/>
+                <w:webHidden/>
+              </w:rPr>
+              <w:t>13</w:t>
+            </w:r>
+            <w:r>
+              <w:rPr>
+                <w:noProof/>
+                <w:webHidden/>
+              </w:rPr>
+              <w:fldChar w:fldCharType="end"/>
+            </w:r>
+          </w:hyperlink>
+        </w:p>
+        <w:p>
           <w:r>
             <w:rPr>
               <w:b/>
@@ -476,7 +538,7 @@
       <w:pPr>
         <w:pStyle w:val="Ttulo1"/>
       </w:pPr>
-      <w:bookmarkStart w:id="0" w:name="_Toc240576539"/>
+      <w:bookmarkStart w:id="0" w:name="_Toc240624439"/>
       <w:r>
         <w:lastRenderedPageBreak/>
         <w:t>Laboratorio 1 – Cazar operaciones fantasma</w:t>
@@ -487,7 +549,7 @@
       <w:pPr>
         <w:pStyle w:val="Ttulo2"/>
       </w:pPr>
-      <w:bookmarkStart w:id="1" w:name="_Toc240576540"/>
+      <w:bookmarkStart w:id="1" w:name="_Toc240624440"/>
       <w:r>
         <w:t>TC-01 – Actualizar un ingrediente sin perder el Publisher</w:t>
       </w:r>
@@ -495,38 +557,22 @@
     </w:p>
     <w:p>
       <w:r>
-        <w:t xml:space="preserve">Dentro de tacocloud-api/src/main/java/tacos/web/api/IngredientController.java se modificó la petición </w:t>
-      </w:r>
-      <w:proofErr w:type="spellStart"/>
-      <w:r>
-        <w:t>put</w:t>
-      </w:r>
-      <w:proofErr w:type="spellEnd"/>
-      <w:r>
-        <w:t xml:space="preserve"> para cumplir con las pruebas de integración:</w:t>
-      </w:r>
-    </w:p>
-    <w:p>
-      <w:pPr>
-        <w:spacing w:after="0"/>
-        <w:rPr>
-          <w:rFonts w:ascii="Arial" w:hAnsi="Arial" w:cs="Arial"/>
-        </w:rPr>
-      </w:pPr>
-      <w:r>
-        <w:rPr>
-          <w:rFonts w:ascii="Arial" w:hAnsi="Arial" w:cs="Arial"/>
-        </w:rPr>
-        <w:t xml:space="preserve">//TC-01 - Actualizar un ingrediente sin perder el </w:t>
-      </w:r>
-      <w:proofErr w:type="spellStart"/>
-      <w:r>
-        <w:rPr>
-          <w:rFonts w:ascii="Arial" w:hAnsi="Arial" w:cs="Arial"/>
-        </w:rPr>
-        <w:t>publisher</w:t>
-      </w:r>
-      <w:proofErr w:type="spellEnd"/>
+        <w:t>Dentro de tacocloud-api/src/main/java/tacos/web/api/IngredientController.java se modificó la petición put para cumplir con las pruebas de integración:</w:t>
+      </w:r>
+    </w:p>
+    <w:p>
+      <w:pPr>
+        <w:spacing w:after="0"/>
+        <w:rPr>
+          <w:rFonts w:ascii="Arial" w:hAnsi="Arial" w:cs="Arial"/>
+        </w:rPr>
+      </w:pPr>
+      <w:r>
+        <w:rPr>
+          <w:rFonts w:ascii="Arial" w:hAnsi="Arial" w:cs="Arial"/>
+        </w:rPr>
+        <w:t>//TC-01 - Actualizar un ingrediente sin perder el publisher</w:t>
+      </w:r>
     </w:p>
     <w:p>
       <w:pPr>
@@ -542,165 +588,60 @@
         </w:rPr>
         <w:t xml:space="preserve">  </w:t>
       </w:r>
-      <w:proofErr w:type="gramStart"/>
-      <w:r>
-        <w:rPr>
-          <w:rFonts w:ascii="Arial" w:hAnsi="Arial" w:cs="Arial"/>
-          <w:lang w:val="en-US"/>
-        </w:rPr>
-        <w:t>@PutMapping</w:t>
-      </w:r>
-      <w:proofErr w:type="gramEnd"/>
-      <w:r>
-        <w:rPr>
-          <w:rFonts w:ascii="Arial" w:hAnsi="Arial" w:cs="Arial"/>
-          <w:lang w:val="en-US"/>
-        </w:rPr>
-        <w:t>("/{id}")</w:t>
-      </w:r>
-    </w:p>
-    <w:p>
-      <w:pPr>
-        <w:spacing w:after="0"/>
-        <w:rPr>
-          <w:rFonts w:ascii="Arial" w:hAnsi="Arial" w:cs="Arial"/>
-          <w:lang w:val="en-US"/>
-        </w:rPr>
-      </w:pPr>
-      <w:r>
-        <w:rPr>
-          <w:rFonts w:ascii="Arial" w:hAnsi="Arial" w:cs="Arial"/>
-          <w:lang w:val="en-US"/>
-        </w:rPr>
-        <w:t xml:space="preserve">  public Mono&lt;</w:t>
-      </w:r>
-      <w:proofErr w:type="spellStart"/>
-      <w:r>
-        <w:rPr>
-          <w:rFonts w:ascii="Arial" w:hAnsi="Arial" w:cs="Arial"/>
-          <w:lang w:val="en-US"/>
-        </w:rPr>
-        <w:t>ResponseEntity</w:t>
-      </w:r>
-      <w:proofErr w:type="spellEnd"/>
-      <w:r>
-        <w:rPr>
-          <w:rFonts w:ascii="Arial" w:hAnsi="Arial" w:cs="Arial"/>
-          <w:lang w:val="en-US"/>
-        </w:rPr>
-        <w:t xml:space="preserve">&lt;Ingredient&gt;&gt; </w:t>
-      </w:r>
-      <w:proofErr w:type="spellStart"/>
-      <w:r>
-        <w:rPr>
-          <w:rFonts w:ascii="Arial" w:hAnsi="Arial" w:cs="Arial"/>
-          <w:lang w:val="en-US"/>
-        </w:rPr>
-        <w:t>updateIngredient</w:t>
-      </w:r>
-      <w:proofErr w:type="spellEnd"/>
-      <w:r>
-        <w:rPr>
-          <w:rFonts w:ascii="Arial" w:hAnsi="Arial" w:cs="Arial"/>
-          <w:lang w:val="en-US"/>
-        </w:rPr>
-        <w:t>(@PathVariable String id, @RequestBody Ingredient ingredient) {</w:t>
-      </w:r>
-    </w:p>
-    <w:p>
-      <w:pPr>
-        <w:spacing w:after="0"/>
-        <w:rPr>
-          <w:rFonts w:ascii="Arial" w:hAnsi="Arial" w:cs="Arial"/>
-          <w:lang w:val="en-US"/>
-        </w:rPr>
-      </w:pPr>
-      <w:r>
-        <w:rPr>
-          <w:rFonts w:ascii="Arial" w:hAnsi="Arial" w:cs="Arial"/>
-          <w:lang w:val="en-US"/>
-        </w:rPr>
-        <w:t xml:space="preserve">    if (</w:t>
-      </w:r>
-      <w:proofErr w:type="spellStart"/>
-      <w:r>
-        <w:rPr>
-          <w:rFonts w:ascii="Arial" w:hAnsi="Arial" w:cs="Arial"/>
-          <w:lang w:val="en-US"/>
-        </w:rPr>
-        <w:t>ingredient.getId</w:t>
-      </w:r>
-      <w:proofErr w:type="spellEnd"/>
-      <w:r>
-        <w:rPr>
-          <w:rFonts w:ascii="Arial" w:hAnsi="Arial" w:cs="Arial"/>
-          <w:lang w:val="en-US"/>
-        </w:rPr>
-        <w:t>() != null &amp;&amp; !</w:t>
-      </w:r>
-      <w:proofErr w:type="spellStart"/>
-      <w:r>
-        <w:rPr>
-          <w:rFonts w:ascii="Arial" w:hAnsi="Arial" w:cs="Arial"/>
-          <w:lang w:val="en-US"/>
-        </w:rPr>
-        <w:t>ingredient.getId</w:t>
-      </w:r>
-      <w:proofErr w:type="spellEnd"/>
-      <w:r>
-        <w:rPr>
-          <w:rFonts w:ascii="Arial" w:hAnsi="Arial" w:cs="Arial"/>
-          <w:lang w:val="en-US"/>
-        </w:rPr>
-        <w:t>().equals(id)) {</w:t>
-      </w:r>
-    </w:p>
-    <w:p>
-      <w:pPr>
-        <w:spacing w:after="0"/>
-        <w:rPr>
-          <w:rFonts w:ascii="Arial" w:hAnsi="Arial" w:cs="Arial"/>
-          <w:lang w:val="en-US"/>
-        </w:rPr>
-      </w:pPr>
-      <w:r>
-        <w:rPr>
-          <w:rFonts w:ascii="Arial" w:hAnsi="Arial" w:cs="Arial"/>
-          <w:lang w:val="en-US"/>
-        </w:rPr>
-        <w:t xml:space="preserve">      return </w:t>
-      </w:r>
-      <w:proofErr w:type="spellStart"/>
-      <w:r>
-        <w:rPr>
-          <w:rFonts w:ascii="Arial" w:hAnsi="Arial" w:cs="Arial"/>
-          <w:lang w:val="en-US"/>
-        </w:rPr>
-        <w:t>Mono.just</w:t>
-      </w:r>
-      <w:proofErr w:type="spellEnd"/>
-      <w:r>
-        <w:rPr>
-          <w:rFonts w:ascii="Arial" w:hAnsi="Arial" w:cs="Arial"/>
-          <w:lang w:val="en-US"/>
-        </w:rPr>
-        <w:t>(</w:t>
-      </w:r>
-      <w:proofErr w:type="spellStart"/>
-      <w:r>
-        <w:rPr>
-          <w:rFonts w:ascii="Arial" w:hAnsi="Arial" w:cs="Arial"/>
-          <w:lang w:val="en-US"/>
-        </w:rPr>
-        <w:t>ResponseEntity.badRequest</w:t>
-      </w:r>
-      <w:proofErr w:type="spellEnd"/>
-      <w:r>
-        <w:rPr>
-          <w:rFonts w:ascii="Arial" w:hAnsi="Arial" w:cs="Arial"/>
-          <w:lang w:val="en-US"/>
-        </w:rPr>
-        <w:t>().build());</w:t>
+      <w:r>
+        <w:rPr>
+          <w:rFonts w:ascii="Arial" w:hAnsi="Arial" w:cs="Arial"/>
+          <w:lang w:val="en-US"/>
+        </w:rPr>
+        <w:t>@PutMapping("/{id}")</w:t>
+      </w:r>
+    </w:p>
+    <w:p>
+      <w:pPr>
+        <w:spacing w:after="0"/>
+        <w:rPr>
+          <w:rFonts w:ascii="Arial" w:hAnsi="Arial" w:cs="Arial"/>
+          <w:lang w:val="en-US"/>
+        </w:rPr>
+      </w:pPr>
+      <w:r>
+        <w:rPr>
+          <w:rFonts w:ascii="Arial" w:hAnsi="Arial" w:cs="Arial"/>
+          <w:lang w:val="en-US"/>
+        </w:rPr>
+        <w:t xml:space="preserve">  public Mono&lt;ResponseEntity&lt;Ingredient&gt;&gt; updateIngredient(@PathVariable String id, @RequestBody Ingredient ingredient) {</w:t>
+      </w:r>
+    </w:p>
+    <w:p>
+      <w:pPr>
+        <w:spacing w:after="0"/>
+        <w:rPr>
+          <w:rFonts w:ascii="Arial" w:hAnsi="Arial" w:cs="Arial"/>
+          <w:lang w:val="en-US"/>
+        </w:rPr>
+      </w:pPr>
+      <w:r>
+        <w:rPr>
+          <w:rFonts w:ascii="Arial" w:hAnsi="Arial" w:cs="Arial"/>
+          <w:lang w:val="en-US"/>
+        </w:rPr>
+        <w:t xml:space="preserve">    if (ingredient.getId() != null &amp;&amp; !ingredient.getId().equals(id)) {</w:t>
+      </w:r>
+    </w:p>
+    <w:p>
+      <w:pPr>
+        <w:spacing w:after="0"/>
+        <w:rPr>
+          <w:rFonts w:ascii="Arial" w:hAnsi="Arial" w:cs="Arial"/>
+          <w:lang w:val="en-US"/>
+        </w:rPr>
+      </w:pPr>
+      <w:r>
+        <w:rPr>
+          <w:rFonts w:ascii="Arial" w:hAnsi="Arial" w:cs="Arial"/>
+          <w:lang w:val="en-US"/>
+        </w:rPr>
+        <w:t xml:space="preserve">      return Mono.just(ResponseEntity.badRequest().build());</w:t>
       </w:r>
     </w:p>
     <w:p>
@@ -732,199 +673,71 @@
           <w:rFonts w:ascii="Arial" w:hAnsi="Arial" w:cs="Arial"/>
           <w:lang w:val="en-US"/>
         </w:rPr>
-        <w:t xml:space="preserve">    </w:t>
-      </w:r>
-      <w:proofErr w:type="spellStart"/>
-      <w:r>
-        <w:rPr>
-          <w:rFonts w:ascii="Arial" w:hAnsi="Arial" w:cs="Arial"/>
-          <w:lang w:val="en-US"/>
-        </w:rPr>
-        <w:t>ingredient.setId</w:t>
-      </w:r>
-      <w:proofErr w:type="spellEnd"/>
-      <w:r>
-        <w:rPr>
-          <w:rFonts w:ascii="Arial" w:hAnsi="Arial" w:cs="Arial"/>
-          <w:lang w:val="en-US"/>
-        </w:rPr>
-        <w:t>(id);</w:t>
-      </w:r>
-    </w:p>
-    <w:p>
-      <w:pPr>
-        <w:spacing w:after="0"/>
-        <w:rPr>
-          <w:rFonts w:ascii="Arial" w:hAnsi="Arial" w:cs="Arial"/>
-          <w:lang w:val="en-US"/>
-        </w:rPr>
-      </w:pPr>
-      <w:r>
-        <w:rPr>
-          <w:rFonts w:ascii="Arial" w:hAnsi="Arial" w:cs="Arial"/>
-          <w:lang w:val="en-US"/>
-        </w:rPr>
-        <w:t xml:space="preserve">    return </w:t>
-      </w:r>
-      <w:proofErr w:type="spellStart"/>
-      <w:r>
-        <w:rPr>
-          <w:rFonts w:ascii="Arial" w:hAnsi="Arial" w:cs="Arial"/>
-          <w:lang w:val="en-US"/>
-        </w:rPr>
-        <w:t>repo.findById</w:t>
-      </w:r>
-      <w:proofErr w:type="spellEnd"/>
-      <w:r>
-        <w:rPr>
-          <w:rFonts w:ascii="Arial" w:hAnsi="Arial" w:cs="Arial"/>
-          <w:lang w:val="en-US"/>
-        </w:rPr>
-        <w:t>(id)</w:t>
-      </w:r>
-    </w:p>
-    <w:p>
-      <w:pPr>
-        <w:spacing w:after="0"/>
-        <w:rPr>
-          <w:rFonts w:ascii="Arial" w:hAnsi="Arial" w:cs="Arial"/>
-          <w:lang w:val="en-US"/>
-        </w:rPr>
-      </w:pPr>
-      <w:r>
-        <w:rPr>
-          <w:rFonts w:ascii="Arial" w:hAnsi="Arial" w:cs="Arial"/>
-          <w:lang w:val="en-US"/>
-        </w:rPr>
-        <w:t xml:space="preserve">        .</w:t>
-      </w:r>
-      <w:proofErr w:type="spellStart"/>
-      <w:r>
-        <w:rPr>
-          <w:rFonts w:ascii="Arial" w:hAnsi="Arial" w:cs="Arial"/>
-          <w:lang w:val="en-US"/>
-        </w:rPr>
-        <w:t>flatMap</w:t>
-      </w:r>
-      <w:proofErr w:type="spellEnd"/>
-      <w:r>
-        <w:rPr>
-          <w:rFonts w:ascii="Arial" w:hAnsi="Arial" w:cs="Arial"/>
-          <w:lang w:val="en-US"/>
-        </w:rPr>
-        <w:t>(</w:t>
-      </w:r>
-      <w:proofErr w:type="spellStart"/>
-      <w:r>
-        <w:rPr>
-          <w:rFonts w:ascii="Arial" w:hAnsi="Arial" w:cs="Arial"/>
-          <w:lang w:val="en-US"/>
-        </w:rPr>
-        <w:t>updatedIngredient</w:t>
-      </w:r>
-      <w:proofErr w:type="spellEnd"/>
-      <w:r>
-        <w:rPr>
-          <w:rFonts w:ascii="Arial" w:hAnsi="Arial" w:cs="Arial"/>
-          <w:lang w:val="en-US"/>
-        </w:rPr>
-        <w:t xml:space="preserve"> -&gt; </w:t>
-      </w:r>
-      <w:proofErr w:type="spellStart"/>
-      <w:r>
-        <w:rPr>
-          <w:rFonts w:ascii="Arial" w:hAnsi="Arial" w:cs="Arial"/>
-          <w:lang w:val="en-US"/>
-        </w:rPr>
-        <w:t>repo.save</w:t>
-      </w:r>
-      <w:proofErr w:type="spellEnd"/>
-      <w:r>
-        <w:rPr>
-          <w:rFonts w:ascii="Arial" w:hAnsi="Arial" w:cs="Arial"/>
-          <w:lang w:val="en-US"/>
-        </w:rPr>
-        <w:t>(ingredient))</w:t>
-      </w:r>
-    </w:p>
-    <w:p>
-      <w:pPr>
-        <w:spacing w:after="0"/>
-        <w:rPr>
-          <w:rFonts w:ascii="Arial" w:hAnsi="Arial" w:cs="Arial"/>
-          <w:lang w:val="en-US"/>
-        </w:rPr>
-      </w:pPr>
-      <w:r>
-        <w:rPr>
-          <w:rFonts w:ascii="Arial" w:hAnsi="Arial" w:cs="Arial"/>
-          <w:lang w:val="en-US"/>
-        </w:rPr>
-        <w:t xml:space="preserve">        .map(</w:t>
-      </w:r>
-      <w:proofErr w:type="spellStart"/>
-      <w:r>
-        <w:rPr>
-          <w:rFonts w:ascii="Arial" w:hAnsi="Arial" w:cs="Arial"/>
-          <w:lang w:val="en-US"/>
-        </w:rPr>
-        <w:t>ResponseEntity</w:t>
-      </w:r>
-      <w:proofErr w:type="spellEnd"/>
-      <w:r>
-        <w:rPr>
-          <w:rFonts w:ascii="Arial" w:hAnsi="Arial" w:cs="Arial"/>
-          <w:lang w:val="en-US"/>
-        </w:rPr>
-        <w:t>::ok)</w:t>
-      </w:r>
-    </w:p>
-    <w:p>
-      <w:pPr>
-        <w:spacing w:after="0"/>
-        <w:rPr>
-          <w:rFonts w:ascii="Arial" w:hAnsi="Arial" w:cs="Arial"/>
-          <w:lang w:val="en-US"/>
-        </w:rPr>
-      </w:pPr>
-      <w:r>
-        <w:rPr>
-          <w:rFonts w:ascii="Arial" w:hAnsi="Arial" w:cs="Arial"/>
-          <w:lang w:val="en-US"/>
-        </w:rPr>
-        <w:t xml:space="preserve">        .</w:t>
-      </w:r>
-      <w:proofErr w:type="spellStart"/>
-      <w:r>
-        <w:rPr>
-          <w:rFonts w:ascii="Arial" w:hAnsi="Arial" w:cs="Arial"/>
-          <w:lang w:val="en-US"/>
-        </w:rPr>
-        <w:t>defaultIfEmpty</w:t>
-      </w:r>
-      <w:proofErr w:type="spellEnd"/>
-      <w:r>
-        <w:rPr>
-          <w:rFonts w:ascii="Arial" w:hAnsi="Arial" w:cs="Arial"/>
-          <w:lang w:val="en-US"/>
-        </w:rPr>
-        <w:t>(</w:t>
-      </w:r>
-      <w:proofErr w:type="spellStart"/>
-      <w:r>
-        <w:rPr>
-          <w:rFonts w:ascii="Arial" w:hAnsi="Arial" w:cs="Arial"/>
-          <w:lang w:val="en-US"/>
-        </w:rPr>
-        <w:t>ResponseEntity.notFound</w:t>
-      </w:r>
-      <w:proofErr w:type="spellEnd"/>
-      <w:r>
-        <w:rPr>
-          <w:rFonts w:ascii="Arial" w:hAnsi="Arial" w:cs="Arial"/>
-          <w:lang w:val="en-US"/>
-        </w:rPr>
-        <w:t>().build());</w:t>
+        <w:t xml:space="preserve">    ingredient.setId(id);</w:t>
+      </w:r>
+    </w:p>
+    <w:p>
+      <w:pPr>
+        <w:spacing w:after="0"/>
+        <w:rPr>
+          <w:rFonts w:ascii="Arial" w:hAnsi="Arial" w:cs="Arial"/>
+          <w:lang w:val="en-US"/>
+        </w:rPr>
+      </w:pPr>
+      <w:r>
+        <w:rPr>
+          <w:rFonts w:ascii="Arial" w:hAnsi="Arial" w:cs="Arial"/>
+          <w:lang w:val="en-US"/>
+        </w:rPr>
+        <w:t xml:space="preserve">    return repo.findById(id)</w:t>
+      </w:r>
+    </w:p>
+    <w:p>
+      <w:pPr>
+        <w:spacing w:after="0"/>
+        <w:rPr>
+          <w:rFonts w:ascii="Arial" w:hAnsi="Arial" w:cs="Arial"/>
+          <w:lang w:val="en-US"/>
+        </w:rPr>
+      </w:pPr>
+      <w:r>
+        <w:rPr>
+          <w:rFonts w:ascii="Arial" w:hAnsi="Arial" w:cs="Arial"/>
+          <w:lang w:val="en-US"/>
+        </w:rPr>
+        <w:t xml:space="preserve">        .flatMap(updatedIngredient -&gt; repo.save(ingredient))</w:t>
+      </w:r>
+    </w:p>
+    <w:p>
+      <w:pPr>
+        <w:spacing w:after="0"/>
+        <w:rPr>
+          <w:rFonts w:ascii="Arial" w:hAnsi="Arial" w:cs="Arial"/>
+          <w:lang w:val="en-US"/>
+        </w:rPr>
+      </w:pPr>
+      <w:r>
+        <w:rPr>
+          <w:rFonts w:ascii="Arial" w:hAnsi="Arial" w:cs="Arial"/>
+          <w:lang w:val="en-US"/>
+        </w:rPr>
+        <w:t xml:space="preserve">        .map(ResponseEntity::ok)</w:t>
+      </w:r>
+    </w:p>
+    <w:p>
+      <w:pPr>
+        <w:spacing w:after="0"/>
+        <w:rPr>
+          <w:rFonts w:ascii="Arial" w:hAnsi="Arial" w:cs="Arial"/>
+          <w:lang w:val="en-US"/>
+        </w:rPr>
+      </w:pPr>
+      <w:r>
+        <w:rPr>
+          <w:rFonts w:ascii="Arial" w:hAnsi="Arial" w:cs="Arial"/>
+          <w:lang w:val="en-US"/>
+        </w:rPr>
+        <w:t xml:space="preserve">        .defaultIfEmpty(ResponseEntity.notFound().build());</w:t>
       </w:r>
     </w:p>
     <w:p>
@@ -1159,7 +972,7 @@
       <w:pPr>
         <w:pStyle w:val="Ttulo2"/>
       </w:pPr>
-      <w:bookmarkStart w:id="2" w:name="_Toc240576541"/>
+      <w:bookmarkStart w:id="2" w:name="_Toc240624441"/>
       <w:r>
         <w:t>TC-02 – Eliminar de verdad y responder con semántica HTTP</w:t>
       </w:r>
@@ -1176,21 +989,7 @@
         <w:rPr>
           <w:rFonts w:ascii="Arial" w:hAnsi="Arial" w:cs="Arial"/>
         </w:rPr>
-        <w:t xml:space="preserve">//TC-02 - Eliminar de verdad y responder con </w:t>
-      </w:r>
-      <w:proofErr w:type="spellStart"/>
-      <w:r>
-        <w:rPr>
-          <w:rFonts w:ascii="Arial" w:hAnsi="Arial" w:cs="Arial"/>
-        </w:rPr>
-        <w:t>semantica</w:t>
-      </w:r>
-      <w:proofErr w:type="spellEnd"/>
-      <w:r>
-        <w:rPr>
-          <w:rFonts w:ascii="Arial" w:hAnsi="Arial" w:cs="Arial"/>
-        </w:rPr>
-        <w:t xml:space="preserve"> HTTP</w:t>
+        <w:t>//TC-02 - Eliminar de verdad y responder con semantica HTTP</w:t>
       </w:r>
     </w:p>
     <w:p>
@@ -1207,149 +1006,60 @@
         </w:rPr>
         <w:t xml:space="preserve">  </w:t>
       </w:r>
-      <w:proofErr w:type="gramStart"/>
-      <w:r>
-        <w:rPr>
-          <w:rFonts w:ascii="Arial" w:hAnsi="Arial" w:cs="Arial"/>
-          <w:lang w:val="en-US"/>
-        </w:rPr>
-        <w:t>@DeleteMapping</w:t>
-      </w:r>
-      <w:proofErr w:type="gramEnd"/>
-      <w:r>
-        <w:rPr>
-          <w:rFonts w:ascii="Arial" w:hAnsi="Arial" w:cs="Arial"/>
-          <w:lang w:val="en-US"/>
-        </w:rPr>
-        <w:t>("/{id}")</w:t>
-      </w:r>
-    </w:p>
-    <w:p>
-      <w:pPr>
-        <w:spacing w:after="0"/>
-        <w:rPr>
-          <w:rFonts w:ascii="Arial" w:hAnsi="Arial" w:cs="Arial"/>
-          <w:lang w:val="en-US"/>
-        </w:rPr>
-      </w:pPr>
-      <w:r>
-        <w:rPr>
-          <w:rFonts w:ascii="Arial" w:hAnsi="Arial" w:cs="Arial"/>
-          <w:lang w:val="en-US"/>
-        </w:rPr>
-        <w:t xml:space="preserve">  public Mono&lt;</w:t>
-      </w:r>
-      <w:proofErr w:type="spellStart"/>
-      <w:r>
-        <w:rPr>
-          <w:rFonts w:ascii="Arial" w:hAnsi="Arial" w:cs="Arial"/>
-          <w:lang w:val="en-US"/>
-        </w:rPr>
-        <w:t>ResponseEntity</w:t>
-      </w:r>
-      <w:proofErr w:type="spellEnd"/>
-      <w:r>
-        <w:rPr>
-          <w:rFonts w:ascii="Arial" w:hAnsi="Arial" w:cs="Arial"/>
-          <w:lang w:val="en-US"/>
-        </w:rPr>
-        <w:t xml:space="preserve">&lt;Void&gt;&gt; </w:t>
-      </w:r>
-      <w:proofErr w:type="spellStart"/>
-      <w:r>
-        <w:rPr>
-          <w:rFonts w:ascii="Arial" w:hAnsi="Arial" w:cs="Arial"/>
-          <w:lang w:val="en-US"/>
-        </w:rPr>
-        <w:t>deleteIngredient</w:t>
-      </w:r>
-      <w:proofErr w:type="spellEnd"/>
-      <w:r>
-        <w:rPr>
-          <w:rFonts w:ascii="Arial" w:hAnsi="Arial" w:cs="Arial"/>
-          <w:lang w:val="en-US"/>
-        </w:rPr>
-        <w:t>(@PathVariable String id){</w:t>
-      </w:r>
-    </w:p>
-    <w:p>
-      <w:pPr>
-        <w:spacing w:after="0"/>
-        <w:rPr>
-          <w:rFonts w:ascii="Arial" w:hAnsi="Arial" w:cs="Arial"/>
-          <w:lang w:val="en-US"/>
-        </w:rPr>
-      </w:pPr>
-      <w:r>
-        <w:rPr>
-          <w:rFonts w:ascii="Arial" w:hAnsi="Arial" w:cs="Arial"/>
-          <w:lang w:val="en-US"/>
-        </w:rPr>
-        <w:t xml:space="preserve">    if(id == null || </w:t>
-      </w:r>
-      <w:proofErr w:type="spellStart"/>
-      <w:r>
-        <w:rPr>
-          <w:rFonts w:ascii="Arial" w:hAnsi="Arial" w:cs="Arial"/>
-          <w:lang w:val="en-US"/>
-        </w:rPr>
-        <w:t>id.isEmpty</w:t>
-      </w:r>
-      <w:proofErr w:type="spellEnd"/>
-      <w:r>
-        <w:rPr>
-          <w:rFonts w:ascii="Arial" w:hAnsi="Arial" w:cs="Arial"/>
-          <w:lang w:val="en-US"/>
-        </w:rPr>
-        <w:t>()){</w:t>
-      </w:r>
-    </w:p>
-    <w:p>
-      <w:pPr>
-        <w:spacing w:after="0"/>
-        <w:rPr>
-          <w:rFonts w:ascii="Arial" w:hAnsi="Arial" w:cs="Arial"/>
-          <w:lang w:val="en-US"/>
-        </w:rPr>
-      </w:pPr>
-      <w:r>
-        <w:rPr>
-          <w:rFonts w:ascii="Arial" w:hAnsi="Arial" w:cs="Arial"/>
-          <w:lang w:val="en-US"/>
-        </w:rPr>
-        <w:t xml:space="preserve">      return </w:t>
-      </w:r>
-      <w:proofErr w:type="spellStart"/>
-      <w:r>
-        <w:rPr>
-          <w:rFonts w:ascii="Arial" w:hAnsi="Arial" w:cs="Arial"/>
-          <w:lang w:val="en-US"/>
-        </w:rPr>
-        <w:t>Mono.just</w:t>
-      </w:r>
-      <w:proofErr w:type="spellEnd"/>
-      <w:r>
-        <w:rPr>
-          <w:rFonts w:ascii="Arial" w:hAnsi="Arial" w:cs="Arial"/>
-          <w:lang w:val="en-US"/>
-        </w:rPr>
-        <w:t>(</w:t>
-      </w:r>
-      <w:proofErr w:type="spellStart"/>
-      <w:r>
-        <w:rPr>
-          <w:rFonts w:ascii="Arial" w:hAnsi="Arial" w:cs="Arial"/>
-          <w:lang w:val="en-US"/>
-        </w:rPr>
-        <w:t>ResponseEntity.badRequest</w:t>
-      </w:r>
-      <w:proofErr w:type="spellEnd"/>
-      <w:r>
-        <w:rPr>
-          <w:rFonts w:ascii="Arial" w:hAnsi="Arial" w:cs="Arial"/>
-          <w:lang w:val="en-US"/>
-        </w:rPr>
-        <w:t>().build());</w:t>
+      <w:r>
+        <w:rPr>
+          <w:rFonts w:ascii="Arial" w:hAnsi="Arial" w:cs="Arial"/>
+          <w:lang w:val="en-US"/>
+        </w:rPr>
+        <w:t>@DeleteMapping("/{id}")</w:t>
+      </w:r>
+    </w:p>
+    <w:p>
+      <w:pPr>
+        <w:spacing w:after="0"/>
+        <w:rPr>
+          <w:rFonts w:ascii="Arial" w:hAnsi="Arial" w:cs="Arial"/>
+          <w:lang w:val="en-US"/>
+        </w:rPr>
+      </w:pPr>
+      <w:r>
+        <w:rPr>
+          <w:rFonts w:ascii="Arial" w:hAnsi="Arial" w:cs="Arial"/>
+          <w:lang w:val="en-US"/>
+        </w:rPr>
+        <w:t xml:space="preserve">  public Mono&lt;ResponseEntity&lt;Void&gt;&gt; deleteIngredient(@PathVariable String id){</w:t>
+      </w:r>
+    </w:p>
+    <w:p>
+      <w:pPr>
+        <w:spacing w:after="0"/>
+        <w:rPr>
+          <w:rFonts w:ascii="Arial" w:hAnsi="Arial" w:cs="Arial"/>
+          <w:lang w:val="en-US"/>
+        </w:rPr>
+      </w:pPr>
+      <w:r>
+        <w:rPr>
+          <w:rFonts w:ascii="Arial" w:hAnsi="Arial" w:cs="Arial"/>
+          <w:lang w:val="en-US"/>
+        </w:rPr>
+        <w:t xml:space="preserve">    if(id == null || id.isEmpty()){</w:t>
+      </w:r>
+    </w:p>
+    <w:p>
+      <w:pPr>
+        <w:spacing w:after="0"/>
+        <w:rPr>
+          <w:rFonts w:ascii="Arial" w:hAnsi="Arial" w:cs="Arial"/>
+          <w:lang w:val="en-US"/>
+        </w:rPr>
+      </w:pPr>
+      <w:r>
+        <w:rPr>
+          <w:rFonts w:ascii="Arial" w:hAnsi="Arial" w:cs="Arial"/>
+          <w:lang w:val="en-US"/>
+        </w:rPr>
+        <w:t xml:space="preserve">      return Mono.just(ResponseEntity.badRequest().build());</w:t>
       </w:r>
     </w:p>
     <w:p>
@@ -1381,63 +1091,23 @@
           <w:rFonts w:ascii="Arial" w:hAnsi="Arial" w:cs="Arial"/>
           <w:lang w:val="en-US"/>
         </w:rPr>
-        <w:t xml:space="preserve">    return </w:t>
-      </w:r>
-      <w:proofErr w:type="spellStart"/>
-      <w:r>
-        <w:rPr>
-          <w:rFonts w:ascii="Arial" w:hAnsi="Arial" w:cs="Arial"/>
-          <w:lang w:val="en-US"/>
-        </w:rPr>
-        <w:t>repo.findById</w:t>
-      </w:r>
-      <w:proofErr w:type="spellEnd"/>
-      <w:r>
-        <w:rPr>
-          <w:rFonts w:ascii="Arial" w:hAnsi="Arial" w:cs="Arial"/>
-          <w:lang w:val="en-US"/>
-        </w:rPr>
-        <w:t>(id)</w:t>
-      </w:r>
-    </w:p>
-    <w:p>
-      <w:pPr>
-        <w:spacing w:after="0"/>
-        <w:rPr>
-          <w:rFonts w:ascii="Arial" w:hAnsi="Arial" w:cs="Arial"/>
-          <w:lang w:val="en-US"/>
-        </w:rPr>
-      </w:pPr>
-      <w:r>
-        <w:rPr>
-          <w:rFonts w:ascii="Arial" w:hAnsi="Arial" w:cs="Arial"/>
-          <w:lang w:val="en-US"/>
-        </w:rPr>
-        <w:t xml:space="preserve">        .</w:t>
-      </w:r>
-      <w:proofErr w:type="spellStart"/>
-      <w:r>
-        <w:rPr>
-          <w:rFonts w:ascii="Arial" w:hAnsi="Arial" w:cs="Arial"/>
-          <w:lang w:val="en-US"/>
-        </w:rPr>
-        <w:t>flatMap</w:t>
-      </w:r>
-      <w:proofErr w:type="spellEnd"/>
-      <w:r>
-        <w:rPr>
-          <w:rFonts w:ascii="Arial" w:hAnsi="Arial" w:cs="Arial"/>
-          <w:lang w:val="en-US"/>
-        </w:rPr>
-        <w:t xml:space="preserve">(ingredient -&gt; </w:t>
-      </w:r>
-      <w:proofErr w:type="spellStart"/>
-      <w:r>
-        <w:rPr>
-          <w:rFonts w:ascii="Arial" w:hAnsi="Arial" w:cs="Arial"/>
-          <w:lang w:val="en-US"/>
-        </w:rPr>
-        <w:t>repo.delete</w:t>
+        <w:t xml:space="preserve">    return repo.findById(id)</w:t>
+      </w:r>
+    </w:p>
+    <w:p>
+      <w:pPr>
+        <w:spacing w:after="0"/>
+        <w:rPr>
+          <w:rFonts w:ascii="Arial" w:hAnsi="Arial" w:cs="Arial"/>
+          <w:lang w:val="en-US"/>
+        </w:rPr>
+      </w:pPr>
+      <w:r>
+        <w:rPr>
+          <w:rFonts w:ascii="Arial" w:hAnsi="Arial" w:cs="Arial"/>
+          <w:lang w:val="en-US"/>
+        </w:rPr>
+        <w:t xml:space="preserve">        .flatMap(ingredient -&gt; repo.delete</w:t>
       </w:r>
       <w:r>
         <w:rPr>
@@ -1446,36 +1116,19 @@
         </w:rPr>
         <w:t>ById</w:t>
       </w:r>
-      <w:proofErr w:type="spellEnd"/>
-      <w:r>
-        <w:rPr>
-          <w:rFonts w:ascii="Arial" w:hAnsi="Arial" w:cs="Arial"/>
-          <w:lang w:val="en-US"/>
-        </w:rPr>
-        <w:t>(</w:t>
-      </w:r>
-      <w:proofErr w:type="spellStart"/>
-      <w:r>
-        <w:rPr>
-          <w:rFonts w:ascii="Arial" w:hAnsi="Arial" w:cs="Arial"/>
-          <w:lang w:val="en-US"/>
-        </w:rPr>
-        <w:t>ingredient</w:t>
-      </w:r>
-      <w:r>
-        <w:rPr>
-          <w:rFonts w:ascii="Arial" w:hAnsi="Arial" w:cs="Arial"/>
-          <w:lang w:val="en-US"/>
-        </w:rPr>
-        <w:t>.getId</w:t>
-      </w:r>
-      <w:proofErr w:type="spellEnd"/>
-      <w:r>
-        <w:rPr>
-          <w:rFonts w:ascii="Arial" w:hAnsi="Arial" w:cs="Arial"/>
-          <w:lang w:val="en-US"/>
-        </w:rPr>
-        <w:t>()</w:t>
+      <w:r>
+        <w:rPr>
+          <w:rFonts w:ascii="Arial" w:hAnsi="Arial" w:cs="Arial"/>
+          <w:lang w:val="en-US"/>
+        </w:rPr>
+        <w:t>(ingredient</w:t>
+      </w:r>
+      <w:r>
+        <w:rPr>
+          <w:rFonts w:ascii="Arial" w:hAnsi="Arial" w:cs="Arial"/>
+          <w:lang w:val="en-US"/>
+        </w:rPr>
+        <w:t>.getId()</w:t>
       </w:r>
       <w:r>
         <w:rPr>
@@ -1498,87 +1151,23 @@
           <w:rFonts w:ascii="Arial" w:hAnsi="Arial" w:cs="Arial"/>
           <w:lang w:val="en-US"/>
         </w:rPr>
-        <w:t xml:space="preserve">            .then(</w:t>
-      </w:r>
-      <w:proofErr w:type="spellStart"/>
-      <w:r>
-        <w:rPr>
-          <w:rFonts w:ascii="Arial" w:hAnsi="Arial" w:cs="Arial"/>
-          <w:lang w:val="en-US"/>
-        </w:rPr>
-        <w:t>Mono.just</w:t>
-      </w:r>
-      <w:proofErr w:type="spellEnd"/>
-      <w:r>
-        <w:rPr>
-          <w:rFonts w:ascii="Arial" w:hAnsi="Arial" w:cs="Arial"/>
-          <w:lang w:val="en-US"/>
-        </w:rPr>
-        <w:t>(</w:t>
-      </w:r>
-      <w:proofErr w:type="spellStart"/>
-      <w:r>
-        <w:rPr>
-          <w:rFonts w:ascii="Arial" w:hAnsi="Arial" w:cs="Arial"/>
-          <w:lang w:val="en-US"/>
-        </w:rPr>
-        <w:t>ResponseEntity.noContent</w:t>
-      </w:r>
-      <w:proofErr w:type="spellEnd"/>
-      <w:r>
-        <w:rPr>
-          <w:rFonts w:ascii="Arial" w:hAnsi="Arial" w:cs="Arial"/>
-          <w:lang w:val="en-US"/>
-        </w:rPr>
-        <w:t>().&lt;Void&gt;build())))</w:t>
-      </w:r>
-    </w:p>
-    <w:p>
-      <w:pPr>
-        <w:spacing w:after="0"/>
-        <w:rPr>
-          <w:rFonts w:ascii="Arial" w:hAnsi="Arial" w:cs="Arial"/>
-          <w:lang w:val="en-US"/>
-        </w:rPr>
-      </w:pPr>
-      <w:r>
-        <w:rPr>
-          <w:rFonts w:ascii="Arial" w:hAnsi="Arial" w:cs="Arial"/>
-          <w:lang w:val="en-US"/>
-        </w:rPr>
-        <w:t xml:space="preserve">        .</w:t>
-      </w:r>
-      <w:proofErr w:type="spellStart"/>
-      <w:r>
-        <w:rPr>
-          <w:rFonts w:ascii="Arial" w:hAnsi="Arial" w:cs="Arial"/>
-          <w:lang w:val="en-US"/>
-        </w:rPr>
-        <w:t>defaultIfEmpty</w:t>
-      </w:r>
-      <w:proofErr w:type="spellEnd"/>
-      <w:r>
-        <w:rPr>
-          <w:rFonts w:ascii="Arial" w:hAnsi="Arial" w:cs="Arial"/>
-          <w:lang w:val="en-US"/>
-        </w:rPr>
-        <w:t>(</w:t>
-      </w:r>
-      <w:proofErr w:type="spellStart"/>
-      <w:r>
-        <w:rPr>
-          <w:rFonts w:ascii="Arial" w:hAnsi="Arial" w:cs="Arial"/>
-          <w:lang w:val="en-US"/>
-        </w:rPr>
-        <w:t>ResponseEntity.notFound</w:t>
-      </w:r>
-      <w:proofErr w:type="spellEnd"/>
-      <w:r>
-        <w:rPr>
-          <w:rFonts w:ascii="Arial" w:hAnsi="Arial" w:cs="Arial"/>
-          <w:lang w:val="en-US"/>
-        </w:rPr>
-        <w:t>().build());</w:t>
+        <w:t xml:space="preserve">            .then(Mono.just(ResponseEntity.noContent().&lt;Void&gt;build())))</w:t>
+      </w:r>
+    </w:p>
+    <w:p>
+      <w:pPr>
+        <w:spacing w:after="0"/>
+        <w:rPr>
+          <w:rFonts w:ascii="Arial" w:hAnsi="Arial" w:cs="Arial"/>
+          <w:lang w:val="en-US"/>
+        </w:rPr>
+      </w:pPr>
+      <w:r>
+        <w:rPr>
+          <w:rFonts w:ascii="Arial" w:hAnsi="Arial" w:cs="Arial"/>
+          <w:lang w:val="en-US"/>
+        </w:rPr>
+        <w:t xml:space="preserve">        .defaultIfEmpty(ResponseEntity.notFound().build());</w:t>
       </w:r>
     </w:p>
     <w:p>
@@ -1794,17 +1383,9 @@
       <w:pPr>
         <w:pStyle w:val="Ttulo2"/>
       </w:pPr>
-      <w:bookmarkStart w:id="3" w:name="_Toc240576542"/>
-      <w:r>
-        <w:t xml:space="preserve">TC-03 – Construir </w:t>
-      </w:r>
-      <w:proofErr w:type="spellStart"/>
-      <w:r>
-        <w:t>Location</w:t>
-      </w:r>
-      <w:proofErr w:type="spellEnd"/>
-      <w:r>
-        <w:t xml:space="preserve"> sin localhost ni rutas rotas</w:t>
+      <w:bookmarkStart w:id="3" w:name="_Toc240624442"/>
+      <w:r>
+        <w:t>TC-03 – Construir Location sin localhost ni rutas rotas</w:t>
       </w:r>
       <w:bookmarkEnd w:id="3"/>
     </w:p>
@@ -1819,32 +1400,17 @@
         <w:rPr>
           <w:rFonts w:ascii="Arial" w:hAnsi="Arial" w:cs="Arial"/>
         </w:rPr>
-        <w:t xml:space="preserve">//TC-03 - Construir </w:t>
-      </w:r>
-      <w:proofErr w:type="spellStart"/>
-      <w:r>
-        <w:rPr>
-          <w:rFonts w:ascii="Arial" w:hAnsi="Arial" w:cs="Arial"/>
-        </w:rPr>
-        <w:t>Location</w:t>
-      </w:r>
-      <w:proofErr w:type="spellEnd"/>
-      <w:r>
-        <w:rPr>
-          <w:rFonts w:ascii="Arial" w:hAnsi="Arial" w:cs="Arial"/>
-        </w:rPr>
-        <w:t xml:space="preserve"> sin localhost ni rutas rotas</w:t>
-      </w:r>
-    </w:p>
-    <w:p>
-      <w:pPr>
-        <w:spacing w:after="0"/>
-        <w:rPr>
-          <w:rFonts w:ascii="Arial" w:hAnsi="Arial" w:cs="Arial"/>
-          <w:lang w:val="en-US"/>
-        </w:rPr>
-      </w:pPr>
-      <w:proofErr w:type="gramStart"/>
+        <w:t>//TC-03 - Construir Location sin localhost ni rutas rotas</w:t>
+      </w:r>
+    </w:p>
+    <w:p>
+      <w:pPr>
+        <w:spacing w:after="0"/>
+        <w:rPr>
+          <w:rFonts w:ascii="Arial" w:hAnsi="Arial" w:cs="Arial"/>
+          <w:lang w:val="en-US"/>
+        </w:rPr>
+      </w:pPr>
       <w:r>
         <w:rPr>
           <w:rFonts w:ascii="Arial" w:hAnsi="Arial" w:cs="Arial"/>
@@ -1852,390 +1418,117 @@
         </w:rPr>
         <w:t>@PostMapping</w:t>
       </w:r>
-      <w:proofErr w:type="gramEnd"/>
-    </w:p>
-    <w:p>
-      <w:pPr>
-        <w:spacing w:after="0"/>
-        <w:rPr>
-          <w:rFonts w:ascii="Arial" w:hAnsi="Arial" w:cs="Arial"/>
-          <w:lang w:val="en-US"/>
-        </w:rPr>
-      </w:pPr>
-      <w:r>
-        <w:rPr>
-          <w:rFonts w:ascii="Arial" w:hAnsi="Arial" w:cs="Arial"/>
-          <w:lang w:val="en-US"/>
-        </w:rPr>
-        <w:t>public Mono&lt;</w:t>
-      </w:r>
-      <w:proofErr w:type="spellStart"/>
-      <w:r>
-        <w:rPr>
-          <w:rFonts w:ascii="Arial" w:hAnsi="Arial" w:cs="Arial"/>
-          <w:lang w:val="en-US"/>
-        </w:rPr>
-        <w:t>ResponseEntity</w:t>
-      </w:r>
-      <w:proofErr w:type="spellEnd"/>
-      <w:r>
-        <w:rPr>
-          <w:rFonts w:ascii="Arial" w:hAnsi="Arial" w:cs="Arial"/>
-          <w:lang w:val="en-US"/>
-        </w:rPr>
-        <w:t xml:space="preserve">&lt;Ingredient&gt;&gt; </w:t>
-      </w:r>
-      <w:proofErr w:type="spellStart"/>
-      <w:r>
-        <w:rPr>
-          <w:rFonts w:ascii="Arial" w:hAnsi="Arial" w:cs="Arial"/>
-          <w:lang w:val="en-US"/>
-        </w:rPr>
-        <w:t>postIngredient</w:t>
-      </w:r>
-      <w:proofErr w:type="spellEnd"/>
-      <w:r>
-        <w:rPr>
-          <w:rFonts w:ascii="Arial" w:hAnsi="Arial" w:cs="Arial"/>
-          <w:lang w:val="en-US"/>
-        </w:rPr>
-        <w:t>(@</w:t>
-      </w:r>
-      <w:proofErr w:type="gramStart"/>
-      <w:r>
-        <w:rPr>
-          <w:rFonts w:ascii="Arial" w:hAnsi="Arial" w:cs="Arial"/>
-          <w:lang w:val="en-US"/>
-        </w:rPr>
-        <w:t>RequestBody @</w:t>
-      </w:r>
-      <w:proofErr w:type="gramEnd"/>
-      <w:r>
-        <w:rPr>
-          <w:rFonts w:ascii="Arial" w:hAnsi="Arial" w:cs="Arial"/>
-          <w:lang w:val="en-US"/>
-        </w:rPr>
-        <w:t xml:space="preserve">Valid Ingredient </w:t>
-      </w:r>
-      <w:proofErr w:type="spellStart"/>
-      <w:r>
-        <w:rPr>
-          <w:rFonts w:ascii="Arial" w:hAnsi="Arial" w:cs="Arial"/>
-          <w:lang w:val="en-US"/>
-        </w:rPr>
-        <w:t>ingredient</w:t>
-      </w:r>
-      <w:proofErr w:type="spellEnd"/>
-      <w:r>
-        <w:rPr>
-          <w:rFonts w:ascii="Arial" w:hAnsi="Arial" w:cs="Arial"/>
-          <w:lang w:val="en-US"/>
-        </w:rPr>
-        <w:t xml:space="preserve">, </w:t>
-      </w:r>
-      <w:proofErr w:type="spellStart"/>
-      <w:r>
-        <w:rPr>
-          <w:rFonts w:ascii="Arial" w:hAnsi="Arial" w:cs="Arial"/>
-          <w:lang w:val="en-US"/>
-        </w:rPr>
-        <w:t>UriComponentsBuilder</w:t>
-      </w:r>
-      <w:proofErr w:type="spellEnd"/>
-      <w:r>
-        <w:rPr>
-          <w:rFonts w:ascii="Arial" w:hAnsi="Arial" w:cs="Arial"/>
-          <w:lang w:val="en-US"/>
-        </w:rPr>
-        <w:t xml:space="preserve"> </w:t>
-      </w:r>
-      <w:proofErr w:type="spellStart"/>
-      <w:r>
-        <w:rPr>
-          <w:rFonts w:ascii="Arial" w:hAnsi="Arial" w:cs="Arial"/>
-          <w:lang w:val="en-US"/>
-        </w:rPr>
-        <w:t>ucb</w:t>
-      </w:r>
-      <w:proofErr w:type="spellEnd"/>
-      <w:r>
-        <w:rPr>
-          <w:rFonts w:ascii="Arial" w:hAnsi="Arial" w:cs="Arial"/>
-          <w:lang w:val="en-US"/>
-        </w:rPr>
-        <w:t>) {</w:t>
-      </w:r>
-    </w:p>
-    <w:p>
-      <w:pPr>
-        <w:spacing w:after="0"/>
-        <w:rPr>
-          <w:rFonts w:ascii="Arial" w:hAnsi="Arial" w:cs="Arial"/>
-          <w:lang w:val="en-US"/>
-        </w:rPr>
-      </w:pPr>
-      <w:r>
-        <w:rPr>
-          <w:rFonts w:ascii="Arial" w:hAnsi="Arial" w:cs="Arial"/>
-          <w:lang w:val="en-US"/>
-        </w:rPr>
-        <w:t xml:space="preserve">    return </w:t>
-      </w:r>
-      <w:proofErr w:type="spellStart"/>
-      <w:r>
-        <w:rPr>
-          <w:rFonts w:ascii="Arial" w:hAnsi="Arial" w:cs="Arial"/>
-          <w:lang w:val="en-US"/>
-        </w:rPr>
-        <w:t>Mono.just</w:t>
-      </w:r>
-      <w:proofErr w:type="spellEnd"/>
-      <w:r>
-        <w:rPr>
-          <w:rFonts w:ascii="Arial" w:hAnsi="Arial" w:cs="Arial"/>
-          <w:lang w:val="en-US"/>
-        </w:rPr>
-        <w:t>(ingredient)</w:t>
-      </w:r>
-    </w:p>
-    <w:p>
-      <w:pPr>
-        <w:spacing w:after="0"/>
-        <w:rPr>
-          <w:rFonts w:ascii="Arial" w:hAnsi="Arial" w:cs="Arial"/>
-          <w:lang w:val="en-US"/>
-        </w:rPr>
-      </w:pPr>
-      <w:r>
-        <w:rPr>
-          <w:rFonts w:ascii="Arial" w:hAnsi="Arial" w:cs="Arial"/>
-          <w:lang w:val="en-US"/>
-        </w:rPr>
-        <w:t xml:space="preserve">        .</w:t>
-      </w:r>
-      <w:proofErr w:type="spellStart"/>
-      <w:r>
-        <w:rPr>
-          <w:rFonts w:ascii="Arial" w:hAnsi="Arial" w:cs="Arial"/>
-          <w:lang w:val="en-US"/>
-        </w:rPr>
-        <w:t>flatMap</w:t>
-      </w:r>
-      <w:proofErr w:type="spellEnd"/>
-      <w:r>
-        <w:rPr>
-          <w:rFonts w:ascii="Arial" w:hAnsi="Arial" w:cs="Arial"/>
-          <w:lang w:val="en-US"/>
-        </w:rPr>
-        <w:t>(repo::save)</w:t>
-      </w:r>
-    </w:p>
-    <w:p>
-      <w:pPr>
-        <w:spacing w:after="0"/>
-        <w:rPr>
-          <w:rFonts w:ascii="Arial" w:hAnsi="Arial" w:cs="Arial"/>
-          <w:lang w:val="en-US"/>
-        </w:rPr>
-      </w:pPr>
-      <w:r>
-        <w:rPr>
-          <w:rFonts w:ascii="Arial" w:hAnsi="Arial" w:cs="Arial"/>
-          <w:lang w:val="en-US"/>
-        </w:rPr>
-        <w:t xml:space="preserve">        .map(</w:t>
-      </w:r>
-      <w:proofErr w:type="spellStart"/>
-      <w:r>
-        <w:rPr>
-          <w:rFonts w:ascii="Arial" w:hAnsi="Arial" w:cs="Arial"/>
-          <w:lang w:val="en-US"/>
-        </w:rPr>
-        <w:t>i</w:t>
-      </w:r>
-      <w:proofErr w:type="spellEnd"/>
-      <w:r>
-        <w:rPr>
-          <w:rFonts w:ascii="Arial" w:hAnsi="Arial" w:cs="Arial"/>
-          <w:lang w:val="en-US"/>
-        </w:rPr>
-        <w:t xml:space="preserve"> -&gt; {</w:t>
-      </w:r>
-    </w:p>
-    <w:p>
-      <w:pPr>
-        <w:spacing w:after="0"/>
-        <w:rPr>
-          <w:rFonts w:ascii="Arial" w:hAnsi="Arial" w:cs="Arial"/>
-          <w:lang w:val="en-US"/>
-        </w:rPr>
-      </w:pPr>
-      <w:r>
-        <w:rPr>
-          <w:rFonts w:ascii="Arial" w:hAnsi="Arial" w:cs="Arial"/>
-          <w:lang w:val="en-US"/>
-        </w:rPr>
-        <w:t xml:space="preserve">          URI location = </w:t>
-      </w:r>
-      <w:proofErr w:type="spellStart"/>
-      <w:r>
-        <w:rPr>
-          <w:rFonts w:ascii="Arial" w:hAnsi="Arial" w:cs="Arial"/>
-          <w:lang w:val="en-US"/>
-        </w:rPr>
-        <w:t>ucb.path</w:t>
-      </w:r>
-      <w:proofErr w:type="spellEnd"/>
-      <w:r>
-        <w:rPr>
-          <w:rFonts w:ascii="Arial" w:hAnsi="Arial" w:cs="Arial"/>
-          <w:lang w:val="en-US"/>
-        </w:rPr>
-        <w:t>("/</w:t>
-      </w:r>
-      <w:proofErr w:type="spellStart"/>
-      <w:r>
-        <w:rPr>
-          <w:rFonts w:ascii="Arial" w:hAnsi="Arial" w:cs="Arial"/>
-          <w:lang w:val="en-US"/>
-        </w:rPr>
-        <w:t>api</w:t>
-      </w:r>
-      <w:proofErr w:type="spellEnd"/>
-      <w:r>
-        <w:rPr>
-          <w:rFonts w:ascii="Arial" w:hAnsi="Arial" w:cs="Arial"/>
-          <w:lang w:val="en-US"/>
-        </w:rPr>
-        <w:t>/ingredients/{id}")</w:t>
-      </w:r>
-    </w:p>
-    <w:p>
-      <w:pPr>
-        <w:spacing w:after="0"/>
-        <w:rPr>
-          <w:rFonts w:ascii="Arial" w:hAnsi="Arial" w:cs="Arial"/>
-          <w:lang w:val="en-US"/>
-        </w:rPr>
-      </w:pPr>
-      <w:r>
-        <w:rPr>
-          <w:rFonts w:ascii="Arial" w:hAnsi="Arial" w:cs="Arial"/>
-          <w:lang w:val="en-US"/>
-        </w:rPr>
-        <w:t xml:space="preserve">            .</w:t>
-      </w:r>
-      <w:proofErr w:type="spellStart"/>
-      <w:r>
-        <w:rPr>
-          <w:rFonts w:ascii="Arial" w:hAnsi="Arial" w:cs="Arial"/>
-          <w:lang w:val="en-US"/>
-        </w:rPr>
-        <w:t>buildAndExpand</w:t>
-      </w:r>
-      <w:proofErr w:type="spellEnd"/>
-      <w:r>
-        <w:rPr>
-          <w:rFonts w:ascii="Arial" w:hAnsi="Arial" w:cs="Arial"/>
-          <w:lang w:val="en-US"/>
-        </w:rPr>
-        <w:t>(</w:t>
-      </w:r>
-      <w:proofErr w:type="spellStart"/>
-      <w:r>
-        <w:rPr>
-          <w:rFonts w:ascii="Arial" w:hAnsi="Arial" w:cs="Arial"/>
-          <w:lang w:val="en-US"/>
-        </w:rPr>
-        <w:t>i.getId</w:t>
-      </w:r>
-      <w:proofErr w:type="spellEnd"/>
-      <w:r>
-        <w:rPr>
-          <w:rFonts w:ascii="Arial" w:hAnsi="Arial" w:cs="Arial"/>
-          <w:lang w:val="en-US"/>
-        </w:rPr>
-        <w:t>()).</w:t>
-      </w:r>
-      <w:proofErr w:type="spellStart"/>
-      <w:r>
-        <w:rPr>
-          <w:rFonts w:ascii="Arial" w:hAnsi="Arial" w:cs="Arial"/>
-          <w:lang w:val="en-US"/>
-        </w:rPr>
-        <w:t>toUri</w:t>
-      </w:r>
-      <w:proofErr w:type="spellEnd"/>
-      <w:r>
-        <w:rPr>
-          <w:rFonts w:ascii="Arial" w:hAnsi="Arial" w:cs="Arial"/>
-          <w:lang w:val="en-US"/>
-        </w:rPr>
-        <w:t>();</w:t>
-      </w:r>
-    </w:p>
-    <w:p>
-      <w:pPr>
-        <w:spacing w:after="0"/>
-        <w:rPr>
-          <w:rFonts w:ascii="Arial" w:hAnsi="Arial" w:cs="Arial"/>
-          <w:lang w:val="en-US"/>
-        </w:rPr>
-      </w:pPr>
-      <w:r>
-        <w:rPr>
-          <w:rFonts w:ascii="Arial" w:hAnsi="Arial" w:cs="Arial"/>
-          <w:lang w:val="en-US"/>
-        </w:rPr>
-        <w:t xml:space="preserve">          </w:t>
-      </w:r>
-      <w:proofErr w:type="gramStart"/>
-      <w:r>
-        <w:rPr>
-          <w:rFonts w:ascii="Arial" w:hAnsi="Arial" w:cs="Arial"/>
-          <w:lang w:val="en-US"/>
-        </w:rPr>
-        <w:t xml:space="preserve">return </w:t>
-      </w:r>
-      <w:proofErr w:type="spellStart"/>
-      <w:r>
-        <w:rPr>
-          <w:rFonts w:ascii="Arial" w:hAnsi="Arial" w:cs="Arial"/>
-          <w:lang w:val="en-US"/>
-        </w:rPr>
-        <w:t>ResponseEntity</w:t>
-      </w:r>
-      <w:proofErr w:type="gramEnd"/>
-      <w:r>
-        <w:rPr>
-          <w:rFonts w:ascii="Arial" w:hAnsi="Arial" w:cs="Arial"/>
-          <w:lang w:val="en-US"/>
-        </w:rPr>
-        <w:t>.created</w:t>
-      </w:r>
-      <w:proofErr w:type="spellEnd"/>
-      <w:r>
-        <w:rPr>
-          <w:rFonts w:ascii="Arial" w:hAnsi="Arial" w:cs="Arial"/>
-          <w:lang w:val="en-US"/>
-        </w:rPr>
-        <w:t>(location).body(</w:t>
-      </w:r>
-      <w:proofErr w:type="spellStart"/>
-      <w:r>
-        <w:rPr>
-          <w:rFonts w:ascii="Arial" w:hAnsi="Arial" w:cs="Arial"/>
-          <w:lang w:val="en-US"/>
-        </w:rPr>
-        <w:t>i</w:t>
-      </w:r>
-      <w:proofErr w:type="spellEnd"/>
-      <w:r>
-        <w:rPr>
-          <w:rFonts w:ascii="Arial" w:hAnsi="Arial" w:cs="Arial"/>
-          <w:lang w:val="en-US"/>
-        </w:rPr>
-        <w:t>);</w:t>
+    </w:p>
+    <w:p>
+      <w:pPr>
+        <w:spacing w:after="0"/>
+        <w:rPr>
+          <w:rFonts w:ascii="Arial" w:hAnsi="Arial" w:cs="Arial"/>
+          <w:lang w:val="en-US"/>
+        </w:rPr>
+      </w:pPr>
+      <w:r>
+        <w:rPr>
+          <w:rFonts w:ascii="Arial" w:hAnsi="Arial" w:cs="Arial"/>
+          <w:lang w:val="en-US"/>
+        </w:rPr>
+        <w:t>public Mono&lt;ResponseEntity&lt;Ingredient&gt;&gt; postIngredient(@RequestBody @Valid Ingredient ingredient, UriComponentsBuilder ucb) {</w:t>
+      </w:r>
+    </w:p>
+    <w:p>
+      <w:pPr>
+        <w:spacing w:after="0"/>
+        <w:rPr>
+          <w:rFonts w:ascii="Arial" w:hAnsi="Arial" w:cs="Arial"/>
+          <w:lang w:val="en-US"/>
+        </w:rPr>
+      </w:pPr>
+      <w:r>
+        <w:rPr>
+          <w:rFonts w:ascii="Arial" w:hAnsi="Arial" w:cs="Arial"/>
+          <w:lang w:val="en-US"/>
+        </w:rPr>
+        <w:t xml:space="preserve">    return Mono.just(ingredient)</w:t>
+      </w:r>
+    </w:p>
+    <w:p>
+      <w:pPr>
+        <w:spacing w:after="0"/>
+        <w:rPr>
+          <w:rFonts w:ascii="Arial" w:hAnsi="Arial" w:cs="Arial"/>
+          <w:lang w:val="en-US"/>
+        </w:rPr>
+      </w:pPr>
+      <w:r>
+        <w:rPr>
+          <w:rFonts w:ascii="Arial" w:hAnsi="Arial" w:cs="Arial"/>
+          <w:lang w:val="en-US"/>
+        </w:rPr>
+        <w:t xml:space="preserve">        .flatMap(repo::save)</w:t>
+      </w:r>
+    </w:p>
+    <w:p>
+      <w:pPr>
+        <w:spacing w:after="0"/>
+        <w:rPr>
+          <w:rFonts w:ascii="Arial" w:hAnsi="Arial" w:cs="Arial"/>
+          <w:lang w:val="en-US"/>
+        </w:rPr>
+      </w:pPr>
+      <w:r>
+        <w:rPr>
+          <w:rFonts w:ascii="Arial" w:hAnsi="Arial" w:cs="Arial"/>
+          <w:lang w:val="en-US"/>
+        </w:rPr>
+        <w:t xml:space="preserve">        .map(i -&gt; {</w:t>
+      </w:r>
+    </w:p>
+    <w:p>
+      <w:pPr>
+        <w:spacing w:after="0"/>
+        <w:rPr>
+          <w:rFonts w:ascii="Arial" w:hAnsi="Arial" w:cs="Arial"/>
+          <w:lang w:val="en-US"/>
+        </w:rPr>
+      </w:pPr>
+      <w:r>
+        <w:rPr>
+          <w:rFonts w:ascii="Arial" w:hAnsi="Arial" w:cs="Arial"/>
+          <w:lang w:val="en-US"/>
+        </w:rPr>
+        <w:t xml:space="preserve">          URI location = ucb.path("/api/ingredients/{id}")</w:t>
+      </w:r>
+    </w:p>
+    <w:p>
+      <w:pPr>
+        <w:spacing w:after="0"/>
+        <w:rPr>
+          <w:rFonts w:ascii="Arial" w:hAnsi="Arial" w:cs="Arial"/>
+          <w:lang w:val="en-US"/>
+        </w:rPr>
+      </w:pPr>
+      <w:r>
+        <w:rPr>
+          <w:rFonts w:ascii="Arial" w:hAnsi="Arial" w:cs="Arial"/>
+          <w:lang w:val="en-US"/>
+        </w:rPr>
+        <w:t xml:space="preserve">            .buildAndExpand(i.getId()).toUri();</w:t>
+      </w:r>
+    </w:p>
+    <w:p>
+      <w:pPr>
+        <w:spacing w:after="0"/>
+        <w:rPr>
+          <w:rFonts w:ascii="Arial" w:hAnsi="Arial" w:cs="Arial"/>
+          <w:lang w:val="en-US"/>
+        </w:rPr>
+      </w:pPr>
+      <w:r>
+        <w:rPr>
+          <w:rFonts w:ascii="Arial" w:hAnsi="Arial" w:cs="Arial"/>
+          <w:lang w:val="en-US"/>
+        </w:rPr>
+        <w:t xml:space="preserve">          return ResponseEntity.created(location).body(i);</w:t>
       </w:r>
     </w:p>
     <w:p>
@@ -2507,7 +1800,7 @@
       <w:pPr>
         <w:pStyle w:val="Ttulo2"/>
       </w:pPr>
-      <w:bookmarkStart w:id="4" w:name="_Toc240576543"/>
+      <w:bookmarkStart w:id="4" w:name="_Toc240624443"/>
       <w:r>
         <w:lastRenderedPageBreak/>
         <w:t>TC-04 – PATCH de órdenes con lista blanca y sin ZIP mutante</w:t>
@@ -2554,286 +1847,85 @@
         </w:rPr>
         <w:t xml:space="preserve">  </w:t>
       </w:r>
-      <w:proofErr w:type="gramStart"/>
-      <w:r>
-        <w:rPr>
-          <w:rFonts w:ascii="Arial" w:hAnsi="Arial" w:cs="Arial"/>
-          <w:lang w:val="en-US"/>
-        </w:rPr>
-        <w:t>@PatchMapping</w:t>
-      </w:r>
-      <w:proofErr w:type="gramEnd"/>
-      <w:r>
-        <w:rPr>
-          <w:rFonts w:ascii="Arial" w:hAnsi="Arial" w:cs="Arial"/>
-          <w:lang w:val="en-US"/>
-        </w:rPr>
-        <w:t>(path="/{orderId}", consumes="application/</w:t>
-      </w:r>
-      <w:proofErr w:type="spellStart"/>
-      <w:r>
-        <w:rPr>
-          <w:rFonts w:ascii="Arial" w:hAnsi="Arial" w:cs="Arial"/>
-          <w:lang w:val="en-US"/>
-        </w:rPr>
-        <w:t>json</w:t>
-      </w:r>
-      <w:proofErr w:type="spellEnd"/>
-      <w:r>
-        <w:rPr>
-          <w:rFonts w:ascii="Arial" w:hAnsi="Arial" w:cs="Arial"/>
-          <w:lang w:val="en-US"/>
-        </w:rPr>
-        <w:t>")</w:t>
-      </w:r>
-    </w:p>
-    <w:p>
-      <w:pPr>
-        <w:spacing w:after="0"/>
-        <w:rPr>
-          <w:rFonts w:ascii="Arial" w:hAnsi="Arial" w:cs="Arial"/>
-          <w:lang w:val="en-US"/>
-        </w:rPr>
-      </w:pPr>
-      <w:r>
-        <w:rPr>
-          <w:rFonts w:ascii="Arial" w:hAnsi="Arial" w:cs="Arial"/>
-          <w:lang w:val="en-US"/>
-        </w:rPr>
-        <w:t xml:space="preserve">  public Mono&lt;</w:t>
-      </w:r>
-      <w:proofErr w:type="spellStart"/>
-      <w:r>
-        <w:rPr>
-          <w:rFonts w:ascii="Arial" w:hAnsi="Arial" w:cs="Arial"/>
-          <w:lang w:val="en-US"/>
-        </w:rPr>
-        <w:t>TacoOrder</w:t>
-      </w:r>
-      <w:proofErr w:type="spellEnd"/>
-      <w:r>
-        <w:rPr>
-          <w:rFonts w:ascii="Arial" w:hAnsi="Arial" w:cs="Arial"/>
-          <w:lang w:val="en-US"/>
-        </w:rPr>
-        <w:t xml:space="preserve">&gt; </w:t>
-      </w:r>
-      <w:proofErr w:type="spellStart"/>
-      <w:r>
-        <w:rPr>
-          <w:rFonts w:ascii="Arial" w:hAnsi="Arial" w:cs="Arial"/>
-          <w:lang w:val="en-US"/>
-        </w:rPr>
-        <w:t>patchOrder</w:t>
-      </w:r>
-      <w:proofErr w:type="spellEnd"/>
-      <w:r>
-        <w:rPr>
-          <w:rFonts w:ascii="Arial" w:hAnsi="Arial" w:cs="Arial"/>
-          <w:lang w:val="en-US"/>
-        </w:rPr>
-        <w:t xml:space="preserve">(@PathVariable("orderId") String </w:t>
-      </w:r>
-      <w:proofErr w:type="spellStart"/>
-      <w:r>
-        <w:rPr>
-          <w:rFonts w:ascii="Arial" w:hAnsi="Arial" w:cs="Arial"/>
-          <w:lang w:val="en-US"/>
-        </w:rPr>
-        <w:t>orderId</w:t>
-      </w:r>
-      <w:proofErr w:type="spellEnd"/>
-      <w:r>
-        <w:rPr>
-          <w:rFonts w:ascii="Arial" w:hAnsi="Arial" w:cs="Arial"/>
-          <w:lang w:val="en-US"/>
-        </w:rPr>
-        <w:t>,</w:t>
-      </w:r>
-    </w:p>
-    <w:p>
-      <w:pPr>
-        <w:spacing w:after="0"/>
-        <w:rPr>
-          <w:rFonts w:ascii="Arial" w:hAnsi="Arial" w:cs="Arial"/>
-          <w:lang w:val="en-US"/>
-        </w:rPr>
-      </w:pPr>
-      <w:r>
-        <w:rPr>
-          <w:rFonts w:ascii="Arial" w:hAnsi="Arial" w:cs="Arial"/>
-          <w:lang w:val="en-US"/>
-        </w:rPr>
-        <w:t xml:space="preserve">                          </w:t>
-      </w:r>
-      <w:proofErr w:type="gramStart"/>
-      <w:r>
-        <w:rPr>
-          <w:rFonts w:ascii="Arial" w:hAnsi="Arial" w:cs="Arial"/>
-          <w:lang w:val="en-US"/>
-        </w:rPr>
-        <w:t>@RequestBody</w:t>
-      </w:r>
-      <w:proofErr w:type="gramEnd"/>
-      <w:r>
-        <w:rPr>
-          <w:rFonts w:ascii="Arial" w:hAnsi="Arial" w:cs="Arial"/>
-          <w:lang w:val="en-US"/>
-        </w:rPr>
-        <w:t xml:space="preserve"> </w:t>
-      </w:r>
-      <w:proofErr w:type="spellStart"/>
-      <w:r>
-        <w:rPr>
-          <w:rFonts w:ascii="Arial" w:hAnsi="Arial" w:cs="Arial"/>
-          <w:lang w:val="en-US"/>
-        </w:rPr>
-        <w:t>OrderPatchRequest</w:t>
-      </w:r>
-      <w:proofErr w:type="spellEnd"/>
-      <w:r>
-        <w:rPr>
-          <w:rFonts w:ascii="Arial" w:hAnsi="Arial" w:cs="Arial"/>
-          <w:lang w:val="en-US"/>
-        </w:rPr>
-        <w:t xml:space="preserve"> patch) {</w:t>
-      </w:r>
-    </w:p>
-    <w:p>
-      <w:pPr>
-        <w:spacing w:after="0"/>
-        <w:rPr>
-          <w:rFonts w:ascii="Arial" w:hAnsi="Arial" w:cs="Arial"/>
-          <w:lang w:val="en-US"/>
-        </w:rPr>
-      </w:pPr>
-    </w:p>
-    <w:p>
-      <w:pPr>
-        <w:spacing w:after="0"/>
-        <w:rPr>
-          <w:rFonts w:ascii="Arial" w:hAnsi="Arial" w:cs="Arial"/>
-          <w:lang w:val="en-US"/>
-        </w:rPr>
-      </w:pPr>
-      <w:r>
-        <w:rPr>
-          <w:rFonts w:ascii="Arial" w:hAnsi="Arial" w:cs="Arial"/>
-          <w:lang w:val="en-US"/>
-        </w:rPr>
-        <w:t xml:space="preserve">    return </w:t>
-      </w:r>
-      <w:proofErr w:type="spellStart"/>
-      <w:r>
-        <w:rPr>
-          <w:rFonts w:ascii="Arial" w:hAnsi="Arial" w:cs="Arial"/>
-          <w:lang w:val="en-US"/>
-        </w:rPr>
-        <w:t>repo.findById</w:t>
-      </w:r>
-      <w:proofErr w:type="spellEnd"/>
-      <w:r>
-        <w:rPr>
-          <w:rFonts w:ascii="Arial" w:hAnsi="Arial" w:cs="Arial"/>
-          <w:lang w:val="en-US"/>
-        </w:rPr>
-        <w:t>(</w:t>
-      </w:r>
-      <w:proofErr w:type="spellStart"/>
-      <w:r>
-        <w:rPr>
-          <w:rFonts w:ascii="Arial" w:hAnsi="Arial" w:cs="Arial"/>
-          <w:lang w:val="en-US"/>
-        </w:rPr>
-        <w:t>orderId</w:t>
-      </w:r>
-      <w:proofErr w:type="spellEnd"/>
-      <w:r>
-        <w:rPr>
-          <w:rFonts w:ascii="Arial" w:hAnsi="Arial" w:cs="Arial"/>
-          <w:lang w:val="en-US"/>
-        </w:rPr>
-        <w:t>)</w:t>
-      </w:r>
-    </w:p>
-    <w:p>
-      <w:pPr>
-        <w:spacing w:after="0"/>
-        <w:rPr>
-          <w:rFonts w:ascii="Arial" w:hAnsi="Arial" w:cs="Arial"/>
-          <w:lang w:val="en-US"/>
-        </w:rPr>
-      </w:pPr>
-      <w:r>
-        <w:rPr>
-          <w:rFonts w:ascii="Arial" w:hAnsi="Arial" w:cs="Arial"/>
-          <w:lang w:val="en-US"/>
-        </w:rPr>
-        <w:t xml:space="preserve">        .</w:t>
-      </w:r>
-      <w:proofErr w:type="spellStart"/>
-      <w:r>
-        <w:rPr>
-          <w:rFonts w:ascii="Arial" w:hAnsi="Arial" w:cs="Arial"/>
-          <w:lang w:val="en-US"/>
-        </w:rPr>
-        <w:t>switchIfEmpty</w:t>
-      </w:r>
-      <w:proofErr w:type="spellEnd"/>
-      <w:r>
-        <w:rPr>
-          <w:rFonts w:ascii="Arial" w:hAnsi="Arial" w:cs="Arial"/>
-          <w:lang w:val="en-US"/>
-        </w:rPr>
-        <w:t>(</w:t>
-      </w:r>
-      <w:proofErr w:type="spellStart"/>
-      <w:r>
-        <w:rPr>
-          <w:rFonts w:ascii="Arial" w:hAnsi="Arial" w:cs="Arial"/>
-          <w:lang w:val="en-US"/>
-        </w:rPr>
-        <w:t>Mono.error</w:t>
-      </w:r>
-      <w:proofErr w:type="spellEnd"/>
-      <w:r>
-        <w:rPr>
-          <w:rFonts w:ascii="Arial" w:hAnsi="Arial" w:cs="Arial"/>
-          <w:lang w:val="en-US"/>
-        </w:rPr>
-        <w:t xml:space="preserve">(new </w:t>
-      </w:r>
-      <w:proofErr w:type="spellStart"/>
-      <w:r>
-        <w:rPr>
-          <w:rFonts w:ascii="Arial" w:hAnsi="Arial" w:cs="Arial"/>
-          <w:lang w:val="en-US"/>
-        </w:rPr>
-        <w:t>ResponseStatusException</w:t>
-      </w:r>
-      <w:proofErr w:type="spellEnd"/>
-      <w:r>
-        <w:rPr>
-          <w:rFonts w:ascii="Arial" w:hAnsi="Arial" w:cs="Arial"/>
-          <w:lang w:val="en-US"/>
-        </w:rPr>
-        <w:t>(</w:t>
-      </w:r>
-      <w:proofErr w:type="spellStart"/>
-      <w:r>
-        <w:rPr>
-          <w:rFonts w:ascii="Arial" w:hAnsi="Arial" w:cs="Arial"/>
-          <w:lang w:val="en-US"/>
-        </w:rPr>
-        <w:t>HttpStatus.NOT_FOUND</w:t>
-      </w:r>
-      <w:proofErr w:type="spellEnd"/>
-      <w:r>
-        <w:rPr>
-          <w:rFonts w:ascii="Arial" w:hAnsi="Arial" w:cs="Arial"/>
-          <w:lang w:val="en-US"/>
-        </w:rPr>
-        <w:t>)))</w:t>
+      <w:r>
+        <w:rPr>
+          <w:rFonts w:ascii="Arial" w:hAnsi="Arial" w:cs="Arial"/>
+          <w:lang w:val="en-US"/>
+        </w:rPr>
+        <w:t>@PatchMapping(path="/{orderId}", consumes="application/json")</w:t>
+      </w:r>
+    </w:p>
+    <w:p>
+      <w:pPr>
+        <w:spacing w:after="0"/>
+        <w:rPr>
+          <w:rFonts w:ascii="Arial" w:hAnsi="Arial" w:cs="Arial"/>
+          <w:lang w:val="en-US"/>
+        </w:rPr>
+      </w:pPr>
+      <w:r>
+        <w:rPr>
+          <w:rFonts w:ascii="Arial" w:hAnsi="Arial" w:cs="Arial"/>
+          <w:lang w:val="en-US"/>
+        </w:rPr>
+        <w:t xml:space="preserve">  public Mono&lt;TacoOrder&gt; patchOrder(@PathVariable("orderId") String orderId,</w:t>
+      </w:r>
+    </w:p>
+    <w:p>
+      <w:pPr>
+        <w:spacing w:after="0"/>
+        <w:rPr>
+          <w:rFonts w:ascii="Arial" w:hAnsi="Arial" w:cs="Arial"/>
+          <w:lang w:val="en-US"/>
+        </w:rPr>
+      </w:pPr>
+      <w:r>
+        <w:rPr>
+          <w:rFonts w:ascii="Arial" w:hAnsi="Arial" w:cs="Arial"/>
+          <w:lang w:val="en-US"/>
+        </w:rPr>
+        <w:t xml:space="preserve">                          @RequestBody OrderPatchRequest patch) {</w:t>
+      </w:r>
+    </w:p>
+    <w:p>
+      <w:pPr>
+        <w:spacing w:after="0"/>
+        <w:rPr>
+          <w:rFonts w:ascii="Arial" w:hAnsi="Arial" w:cs="Arial"/>
+          <w:lang w:val="en-US"/>
+        </w:rPr>
+      </w:pPr>
+    </w:p>
+    <w:p>
+      <w:pPr>
+        <w:spacing w:after="0"/>
+        <w:rPr>
+          <w:rFonts w:ascii="Arial" w:hAnsi="Arial" w:cs="Arial"/>
+          <w:lang w:val="en-US"/>
+        </w:rPr>
+      </w:pPr>
+      <w:r>
+        <w:rPr>
+          <w:rFonts w:ascii="Arial" w:hAnsi="Arial" w:cs="Arial"/>
+          <w:lang w:val="en-US"/>
+        </w:rPr>
+        <w:t xml:space="preserve">    return repo.findById(orderId)</w:t>
+      </w:r>
+    </w:p>
+    <w:p>
+      <w:pPr>
+        <w:spacing w:after="0"/>
+        <w:rPr>
+          <w:rFonts w:ascii="Arial" w:hAnsi="Arial" w:cs="Arial"/>
+          <w:lang w:val="en-US"/>
+        </w:rPr>
+      </w:pPr>
+      <w:r>
+        <w:rPr>
+          <w:rFonts w:ascii="Arial" w:hAnsi="Arial" w:cs="Arial"/>
+          <w:lang w:val="en-US"/>
+        </w:rPr>
+        <w:t xml:space="preserve">        .switchIfEmpty(Mono.error(new ResponseStatusException(HttpStatus.NOT_FOUND)))</w:t>
       </w:r>
     </w:p>
     <w:p>
@@ -2865,71 +1957,23 @@
           <w:rFonts w:ascii="Arial" w:hAnsi="Arial" w:cs="Arial"/>
           <w:lang w:val="en-US"/>
         </w:rPr>
-        <w:t xml:space="preserve">          if (</w:t>
-      </w:r>
-      <w:proofErr w:type="spellStart"/>
-      <w:r>
-        <w:rPr>
-          <w:rFonts w:ascii="Arial" w:hAnsi="Arial" w:cs="Arial"/>
-          <w:lang w:val="en-US"/>
-        </w:rPr>
-        <w:t>patch.getDeliveryName</w:t>
-      </w:r>
-      <w:proofErr w:type="spellEnd"/>
-      <w:r>
-        <w:rPr>
-          <w:rFonts w:ascii="Arial" w:hAnsi="Arial" w:cs="Arial"/>
-          <w:lang w:val="en-US"/>
-        </w:rPr>
-        <w:t>() != null) {</w:t>
-      </w:r>
-    </w:p>
-    <w:p>
-      <w:pPr>
-        <w:spacing w:after="0"/>
-        <w:rPr>
-          <w:rFonts w:ascii="Arial" w:hAnsi="Arial" w:cs="Arial"/>
-          <w:lang w:val="en-US"/>
-        </w:rPr>
-      </w:pPr>
-      <w:r>
-        <w:rPr>
-          <w:rFonts w:ascii="Arial" w:hAnsi="Arial" w:cs="Arial"/>
-          <w:lang w:val="en-US"/>
-        </w:rPr>
-        <w:t xml:space="preserve">            </w:t>
-      </w:r>
-      <w:proofErr w:type="spellStart"/>
-      <w:r>
-        <w:rPr>
-          <w:rFonts w:ascii="Arial" w:hAnsi="Arial" w:cs="Arial"/>
-          <w:lang w:val="en-US"/>
-        </w:rPr>
-        <w:t>order.setDeliveryName</w:t>
-      </w:r>
-      <w:proofErr w:type="spellEnd"/>
-      <w:r>
-        <w:rPr>
-          <w:rFonts w:ascii="Arial" w:hAnsi="Arial" w:cs="Arial"/>
-          <w:lang w:val="en-US"/>
-        </w:rPr>
-        <w:t>(</w:t>
-      </w:r>
-      <w:proofErr w:type="spellStart"/>
-      <w:r>
-        <w:rPr>
-          <w:rFonts w:ascii="Arial" w:hAnsi="Arial" w:cs="Arial"/>
-          <w:lang w:val="en-US"/>
-        </w:rPr>
-        <w:t>patch.getDeliveryName</w:t>
-      </w:r>
-      <w:proofErr w:type="spellEnd"/>
-      <w:r>
-        <w:rPr>
-          <w:rFonts w:ascii="Arial" w:hAnsi="Arial" w:cs="Arial"/>
-          <w:lang w:val="en-US"/>
-        </w:rPr>
-        <w:t>());</w:t>
+        <w:t xml:space="preserve">          if (patch.getDeliveryName() != null) {</w:t>
+      </w:r>
+    </w:p>
+    <w:p>
+      <w:pPr>
+        <w:spacing w:after="0"/>
+        <w:rPr>
+          <w:rFonts w:ascii="Arial" w:hAnsi="Arial" w:cs="Arial"/>
+          <w:lang w:val="en-US"/>
+        </w:rPr>
+      </w:pPr>
+      <w:r>
+        <w:rPr>
+          <w:rFonts w:ascii="Arial" w:hAnsi="Arial" w:cs="Arial"/>
+          <w:lang w:val="en-US"/>
+        </w:rPr>
+        <w:t xml:space="preserve">            order.setDeliveryName(patch.getDeliveryName());</w:t>
       </w:r>
     </w:p>
     <w:p>
@@ -2961,71 +2005,23 @@
           <w:rFonts w:ascii="Arial" w:hAnsi="Arial" w:cs="Arial"/>
           <w:lang w:val="en-US"/>
         </w:rPr>
-        <w:t xml:space="preserve">          if (</w:t>
-      </w:r>
-      <w:proofErr w:type="spellStart"/>
-      <w:r>
-        <w:rPr>
-          <w:rFonts w:ascii="Arial" w:hAnsi="Arial" w:cs="Arial"/>
-          <w:lang w:val="en-US"/>
-        </w:rPr>
-        <w:t>patch.getDeliveryStreet</w:t>
-      </w:r>
-      <w:proofErr w:type="spellEnd"/>
-      <w:r>
-        <w:rPr>
-          <w:rFonts w:ascii="Arial" w:hAnsi="Arial" w:cs="Arial"/>
-          <w:lang w:val="en-US"/>
-        </w:rPr>
-        <w:t>() != null) {</w:t>
-      </w:r>
-    </w:p>
-    <w:p>
-      <w:pPr>
-        <w:spacing w:after="0"/>
-        <w:rPr>
-          <w:rFonts w:ascii="Arial" w:hAnsi="Arial" w:cs="Arial"/>
-          <w:lang w:val="en-US"/>
-        </w:rPr>
-      </w:pPr>
-      <w:r>
-        <w:rPr>
-          <w:rFonts w:ascii="Arial" w:hAnsi="Arial" w:cs="Arial"/>
-          <w:lang w:val="en-US"/>
-        </w:rPr>
-        <w:t xml:space="preserve">            </w:t>
-      </w:r>
-      <w:proofErr w:type="spellStart"/>
-      <w:r>
-        <w:rPr>
-          <w:rFonts w:ascii="Arial" w:hAnsi="Arial" w:cs="Arial"/>
-          <w:lang w:val="en-US"/>
-        </w:rPr>
-        <w:t>order.setDeliveryStreet</w:t>
-      </w:r>
-      <w:proofErr w:type="spellEnd"/>
-      <w:r>
-        <w:rPr>
-          <w:rFonts w:ascii="Arial" w:hAnsi="Arial" w:cs="Arial"/>
-          <w:lang w:val="en-US"/>
-        </w:rPr>
-        <w:t>(</w:t>
-      </w:r>
-      <w:proofErr w:type="spellStart"/>
-      <w:r>
-        <w:rPr>
-          <w:rFonts w:ascii="Arial" w:hAnsi="Arial" w:cs="Arial"/>
-          <w:lang w:val="en-US"/>
-        </w:rPr>
-        <w:t>patch.getDeliveryStreet</w:t>
-      </w:r>
-      <w:proofErr w:type="spellEnd"/>
-      <w:r>
-        <w:rPr>
-          <w:rFonts w:ascii="Arial" w:hAnsi="Arial" w:cs="Arial"/>
-          <w:lang w:val="en-US"/>
-        </w:rPr>
-        <w:t>());</w:t>
+        <w:t xml:space="preserve">          if (patch.getDeliveryStreet() != null) {</w:t>
+      </w:r>
+    </w:p>
+    <w:p>
+      <w:pPr>
+        <w:spacing w:after="0"/>
+        <w:rPr>
+          <w:rFonts w:ascii="Arial" w:hAnsi="Arial" w:cs="Arial"/>
+          <w:lang w:val="en-US"/>
+        </w:rPr>
+      </w:pPr>
+      <w:r>
+        <w:rPr>
+          <w:rFonts w:ascii="Arial" w:hAnsi="Arial" w:cs="Arial"/>
+          <w:lang w:val="en-US"/>
+        </w:rPr>
+        <w:t xml:space="preserve">            order.setDeliveryStreet(patch.getDeliveryStreet());</w:t>
       </w:r>
     </w:p>
     <w:p>
@@ -3057,71 +2053,23 @@
           <w:rFonts w:ascii="Arial" w:hAnsi="Arial" w:cs="Arial"/>
           <w:lang w:val="en-US"/>
         </w:rPr>
-        <w:t xml:space="preserve">          if (</w:t>
-      </w:r>
-      <w:proofErr w:type="spellStart"/>
-      <w:r>
-        <w:rPr>
-          <w:rFonts w:ascii="Arial" w:hAnsi="Arial" w:cs="Arial"/>
-          <w:lang w:val="en-US"/>
-        </w:rPr>
-        <w:t>patch.getDeliveryCity</w:t>
-      </w:r>
-      <w:proofErr w:type="spellEnd"/>
-      <w:r>
-        <w:rPr>
-          <w:rFonts w:ascii="Arial" w:hAnsi="Arial" w:cs="Arial"/>
-          <w:lang w:val="en-US"/>
-        </w:rPr>
-        <w:t>() != null) {</w:t>
-      </w:r>
-    </w:p>
-    <w:p>
-      <w:pPr>
-        <w:spacing w:after="0"/>
-        <w:rPr>
-          <w:rFonts w:ascii="Arial" w:hAnsi="Arial" w:cs="Arial"/>
-          <w:lang w:val="en-US"/>
-        </w:rPr>
-      </w:pPr>
-      <w:r>
-        <w:rPr>
-          <w:rFonts w:ascii="Arial" w:hAnsi="Arial" w:cs="Arial"/>
-          <w:lang w:val="en-US"/>
-        </w:rPr>
-        <w:t xml:space="preserve">            </w:t>
-      </w:r>
-      <w:proofErr w:type="spellStart"/>
-      <w:r>
-        <w:rPr>
-          <w:rFonts w:ascii="Arial" w:hAnsi="Arial" w:cs="Arial"/>
-          <w:lang w:val="en-US"/>
-        </w:rPr>
-        <w:t>order.setDeliveryCity</w:t>
-      </w:r>
-      <w:proofErr w:type="spellEnd"/>
-      <w:r>
-        <w:rPr>
-          <w:rFonts w:ascii="Arial" w:hAnsi="Arial" w:cs="Arial"/>
-          <w:lang w:val="en-US"/>
-        </w:rPr>
-        <w:t>(</w:t>
-      </w:r>
-      <w:proofErr w:type="spellStart"/>
-      <w:r>
-        <w:rPr>
-          <w:rFonts w:ascii="Arial" w:hAnsi="Arial" w:cs="Arial"/>
-          <w:lang w:val="en-US"/>
-        </w:rPr>
-        <w:t>patch.getDeliveryCity</w:t>
-      </w:r>
-      <w:proofErr w:type="spellEnd"/>
-      <w:r>
-        <w:rPr>
-          <w:rFonts w:ascii="Arial" w:hAnsi="Arial" w:cs="Arial"/>
-          <w:lang w:val="en-US"/>
-        </w:rPr>
-        <w:t>());</w:t>
+        <w:t xml:space="preserve">          if (patch.getDeliveryCity() != null) {</w:t>
+      </w:r>
+    </w:p>
+    <w:p>
+      <w:pPr>
+        <w:spacing w:after="0"/>
+        <w:rPr>
+          <w:rFonts w:ascii="Arial" w:hAnsi="Arial" w:cs="Arial"/>
+          <w:lang w:val="en-US"/>
+        </w:rPr>
+      </w:pPr>
+      <w:r>
+        <w:rPr>
+          <w:rFonts w:ascii="Arial" w:hAnsi="Arial" w:cs="Arial"/>
+          <w:lang w:val="en-US"/>
+        </w:rPr>
+        <w:t xml:space="preserve">            order.setDeliveryCity(patch.getDeliveryCity());</w:t>
       </w:r>
     </w:p>
     <w:p>
@@ -3153,71 +2101,23 @@
           <w:rFonts w:ascii="Arial" w:hAnsi="Arial" w:cs="Arial"/>
           <w:lang w:val="en-US"/>
         </w:rPr>
-        <w:t xml:space="preserve">          if (</w:t>
-      </w:r>
-      <w:proofErr w:type="spellStart"/>
-      <w:r>
-        <w:rPr>
-          <w:rFonts w:ascii="Arial" w:hAnsi="Arial" w:cs="Arial"/>
-          <w:lang w:val="en-US"/>
-        </w:rPr>
-        <w:t>patch.getDeliveryState</w:t>
-      </w:r>
-      <w:proofErr w:type="spellEnd"/>
-      <w:r>
-        <w:rPr>
-          <w:rFonts w:ascii="Arial" w:hAnsi="Arial" w:cs="Arial"/>
-          <w:lang w:val="en-US"/>
-        </w:rPr>
-        <w:t>() != null) {</w:t>
-      </w:r>
-    </w:p>
-    <w:p>
-      <w:pPr>
-        <w:spacing w:after="0"/>
-        <w:rPr>
-          <w:rFonts w:ascii="Arial" w:hAnsi="Arial" w:cs="Arial"/>
-          <w:lang w:val="en-US"/>
-        </w:rPr>
-      </w:pPr>
-      <w:r>
-        <w:rPr>
-          <w:rFonts w:ascii="Arial" w:hAnsi="Arial" w:cs="Arial"/>
-          <w:lang w:val="en-US"/>
-        </w:rPr>
-        <w:t xml:space="preserve">            </w:t>
-      </w:r>
-      <w:proofErr w:type="spellStart"/>
-      <w:r>
-        <w:rPr>
-          <w:rFonts w:ascii="Arial" w:hAnsi="Arial" w:cs="Arial"/>
-          <w:lang w:val="en-US"/>
-        </w:rPr>
-        <w:t>order.setDeliveryState</w:t>
-      </w:r>
-      <w:proofErr w:type="spellEnd"/>
-      <w:r>
-        <w:rPr>
-          <w:rFonts w:ascii="Arial" w:hAnsi="Arial" w:cs="Arial"/>
-          <w:lang w:val="en-US"/>
-        </w:rPr>
-        <w:t>(</w:t>
-      </w:r>
-      <w:proofErr w:type="spellStart"/>
-      <w:r>
-        <w:rPr>
-          <w:rFonts w:ascii="Arial" w:hAnsi="Arial" w:cs="Arial"/>
-          <w:lang w:val="en-US"/>
-        </w:rPr>
-        <w:t>patch.getDeliveryState</w:t>
-      </w:r>
-      <w:proofErr w:type="spellEnd"/>
-      <w:r>
-        <w:rPr>
-          <w:rFonts w:ascii="Arial" w:hAnsi="Arial" w:cs="Arial"/>
-          <w:lang w:val="en-US"/>
-        </w:rPr>
-        <w:t>());</w:t>
+        <w:t xml:space="preserve">          if (patch.getDeliveryState() != null) {</w:t>
+      </w:r>
+    </w:p>
+    <w:p>
+      <w:pPr>
+        <w:spacing w:after="0"/>
+        <w:rPr>
+          <w:rFonts w:ascii="Arial" w:hAnsi="Arial" w:cs="Arial"/>
+          <w:lang w:val="en-US"/>
+        </w:rPr>
+      </w:pPr>
+      <w:r>
+        <w:rPr>
+          <w:rFonts w:ascii="Arial" w:hAnsi="Arial" w:cs="Arial"/>
+          <w:lang w:val="en-US"/>
+        </w:rPr>
+        <w:t xml:space="preserve">            order.setDeliveryState(patch.getDeliveryState());</w:t>
       </w:r>
     </w:p>
     <w:p>
@@ -3249,71 +2149,23 @@
           <w:rFonts w:ascii="Arial" w:hAnsi="Arial" w:cs="Arial"/>
           <w:lang w:val="en-US"/>
         </w:rPr>
-        <w:t xml:space="preserve">          if (</w:t>
-      </w:r>
-      <w:proofErr w:type="spellStart"/>
-      <w:r>
-        <w:rPr>
-          <w:rFonts w:ascii="Arial" w:hAnsi="Arial" w:cs="Arial"/>
-          <w:lang w:val="en-US"/>
-        </w:rPr>
-        <w:t>patch.getDeliveryZip</w:t>
-      </w:r>
-      <w:proofErr w:type="spellEnd"/>
-      <w:r>
-        <w:rPr>
-          <w:rFonts w:ascii="Arial" w:hAnsi="Arial" w:cs="Arial"/>
-          <w:lang w:val="en-US"/>
-        </w:rPr>
-        <w:t>() != null) {</w:t>
-      </w:r>
-    </w:p>
-    <w:p>
-      <w:pPr>
-        <w:spacing w:after="0"/>
-        <w:rPr>
-          <w:rFonts w:ascii="Arial" w:hAnsi="Arial" w:cs="Arial"/>
-          <w:lang w:val="en-US"/>
-        </w:rPr>
-      </w:pPr>
-      <w:r>
-        <w:rPr>
-          <w:rFonts w:ascii="Arial" w:hAnsi="Arial" w:cs="Arial"/>
-          <w:lang w:val="en-US"/>
-        </w:rPr>
-        <w:t xml:space="preserve">            </w:t>
-      </w:r>
-      <w:proofErr w:type="spellStart"/>
-      <w:r>
-        <w:rPr>
-          <w:rFonts w:ascii="Arial" w:hAnsi="Arial" w:cs="Arial"/>
-          <w:lang w:val="en-US"/>
-        </w:rPr>
-        <w:t>order.setDeliveryZip</w:t>
-      </w:r>
-      <w:proofErr w:type="spellEnd"/>
-      <w:r>
-        <w:rPr>
-          <w:rFonts w:ascii="Arial" w:hAnsi="Arial" w:cs="Arial"/>
-          <w:lang w:val="en-US"/>
-        </w:rPr>
-        <w:t>(</w:t>
-      </w:r>
-      <w:proofErr w:type="spellStart"/>
-      <w:r>
-        <w:rPr>
-          <w:rFonts w:ascii="Arial" w:hAnsi="Arial" w:cs="Arial"/>
-          <w:lang w:val="en-US"/>
-        </w:rPr>
-        <w:t>patch.getDeliveryZip</w:t>
-      </w:r>
-      <w:proofErr w:type="spellEnd"/>
-      <w:r>
-        <w:rPr>
-          <w:rFonts w:ascii="Arial" w:hAnsi="Arial" w:cs="Arial"/>
-          <w:lang w:val="en-US"/>
-        </w:rPr>
-        <w:t>());</w:t>
+        <w:t xml:space="preserve">          if (patch.getDeliveryZip() != null) {</w:t>
+      </w:r>
+    </w:p>
+    <w:p>
+      <w:pPr>
+        <w:spacing w:after="0"/>
+        <w:rPr>
+          <w:rFonts w:ascii="Arial" w:hAnsi="Arial" w:cs="Arial"/>
+          <w:lang w:val="en-US"/>
+        </w:rPr>
+      </w:pPr>
+      <w:r>
+        <w:rPr>
+          <w:rFonts w:ascii="Arial" w:hAnsi="Arial" w:cs="Arial"/>
+          <w:lang w:val="en-US"/>
+        </w:rPr>
+        <w:t xml:space="preserve">            order.setDeliveryZip(patch.getDeliveryZip());</w:t>
       </w:r>
     </w:p>
     <w:p>
@@ -3380,35 +2232,7 @@
         <w:rPr>
           <w:rFonts w:ascii="Arial" w:hAnsi="Arial" w:cs="Arial"/>
         </w:rPr>
-        <w:t xml:space="preserve">        .</w:t>
-      </w:r>
-      <w:proofErr w:type="spellStart"/>
-      <w:r>
-        <w:rPr>
-          <w:rFonts w:ascii="Arial" w:hAnsi="Arial" w:cs="Arial"/>
-        </w:rPr>
-        <w:t>flatMap</w:t>
-      </w:r>
-      <w:proofErr w:type="spellEnd"/>
-      <w:r>
-        <w:rPr>
-          <w:rFonts w:ascii="Arial" w:hAnsi="Arial" w:cs="Arial"/>
-        </w:rPr>
-        <w:t>(repo::</w:t>
-      </w:r>
-      <w:proofErr w:type="spellStart"/>
-      <w:r>
-        <w:rPr>
-          <w:rFonts w:ascii="Arial" w:hAnsi="Arial" w:cs="Arial"/>
-        </w:rPr>
-        <w:t>save</w:t>
-      </w:r>
-      <w:proofErr w:type="spellEnd"/>
-      <w:r>
-        <w:rPr>
-          <w:rFonts w:ascii="Arial" w:hAnsi="Arial" w:cs="Arial"/>
-        </w:rPr>
-        <w:t>);</w:t>
+        <w:t xml:space="preserve">        .flatMap(repo::save);</w:t>
       </w:r>
     </w:p>
     <w:p>
@@ -3452,7 +2276,6 @@
           <w:lang w:val="en-US"/>
         </w:rPr>
       </w:pPr>
-      <w:proofErr w:type="gramStart"/>
       <w:r>
         <w:rPr>
           <w:rFonts w:ascii="Arial" w:hAnsi="Arial" w:cs="Arial"/>
@@ -3460,198 +2283,101 @@
         </w:rPr>
         <w:t>@Data</w:t>
       </w:r>
-      <w:proofErr w:type="gramEnd"/>
-    </w:p>
-    <w:p>
-      <w:pPr>
-        <w:spacing w:after="0"/>
-        <w:rPr>
-          <w:rFonts w:ascii="Arial" w:hAnsi="Arial" w:cs="Arial"/>
-          <w:lang w:val="en-US"/>
-        </w:rPr>
-      </w:pPr>
-      <w:r>
-        <w:rPr>
-          <w:rFonts w:ascii="Arial" w:hAnsi="Arial" w:cs="Arial"/>
-          <w:lang w:val="en-US"/>
-        </w:rPr>
-        <w:t xml:space="preserve">public class </w:t>
-      </w:r>
-      <w:proofErr w:type="spellStart"/>
-      <w:r>
-        <w:rPr>
-          <w:rFonts w:ascii="Arial" w:hAnsi="Arial" w:cs="Arial"/>
-          <w:lang w:val="en-US"/>
-        </w:rPr>
-        <w:t>OrderPatchRequest</w:t>
-      </w:r>
-      <w:proofErr w:type="spellEnd"/>
-      <w:r>
-        <w:rPr>
-          <w:rFonts w:ascii="Arial" w:hAnsi="Arial" w:cs="Arial"/>
-          <w:lang w:val="en-US"/>
-        </w:rPr>
-        <w:t xml:space="preserve"> {</w:t>
-      </w:r>
-    </w:p>
-    <w:p>
-      <w:pPr>
-        <w:spacing w:after="0"/>
-        <w:rPr>
-          <w:rFonts w:ascii="Arial" w:hAnsi="Arial" w:cs="Arial"/>
-          <w:lang w:val="en-US"/>
-        </w:rPr>
-      </w:pPr>
-      <w:r>
-        <w:rPr>
-          <w:rFonts w:ascii="Arial" w:hAnsi="Arial" w:cs="Arial"/>
-          <w:lang w:val="en-US"/>
-        </w:rPr>
-        <w:t xml:space="preserve">    private String </w:t>
-      </w:r>
-      <w:proofErr w:type="spellStart"/>
-      <w:r>
-        <w:rPr>
-          <w:rFonts w:ascii="Arial" w:hAnsi="Arial" w:cs="Arial"/>
-          <w:lang w:val="en-US"/>
-        </w:rPr>
-        <w:t>deliveryName</w:t>
-      </w:r>
-      <w:proofErr w:type="spellEnd"/>
-      <w:r>
-        <w:rPr>
-          <w:rFonts w:ascii="Arial" w:hAnsi="Arial" w:cs="Arial"/>
-          <w:lang w:val="en-US"/>
-        </w:rPr>
-        <w:t>;</w:t>
-      </w:r>
-    </w:p>
-    <w:p>
-      <w:pPr>
-        <w:spacing w:after="0"/>
-        <w:rPr>
-          <w:rFonts w:ascii="Arial" w:hAnsi="Arial" w:cs="Arial"/>
-          <w:lang w:val="en-US"/>
-        </w:rPr>
-      </w:pPr>
-      <w:r>
-        <w:rPr>
-          <w:rFonts w:ascii="Arial" w:hAnsi="Arial" w:cs="Arial"/>
-          <w:lang w:val="en-US"/>
-        </w:rPr>
-        <w:t xml:space="preserve">    private String </w:t>
-      </w:r>
-      <w:proofErr w:type="spellStart"/>
-      <w:r>
-        <w:rPr>
-          <w:rFonts w:ascii="Arial" w:hAnsi="Arial" w:cs="Arial"/>
-          <w:lang w:val="en-US"/>
-        </w:rPr>
-        <w:t>deliveryStreet</w:t>
-      </w:r>
-      <w:proofErr w:type="spellEnd"/>
-      <w:r>
-        <w:rPr>
-          <w:rFonts w:ascii="Arial" w:hAnsi="Arial" w:cs="Arial"/>
-          <w:lang w:val="en-US"/>
-        </w:rPr>
-        <w:t>;</w:t>
-      </w:r>
-    </w:p>
-    <w:p>
-      <w:pPr>
-        <w:spacing w:after="0"/>
-        <w:rPr>
-          <w:rFonts w:ascii="Arial" w:hAnsi="Arial" w:cs="Arial"/>
-          <w:lang w:val="en-US"/>
-        </w:rPr>
-      </w:pPr>
-      <w:r>
-        <w:rPr>
-          <w:rFonts w:ascii="Arial" w:hAnsi="Arial" w:cs="Arial"/>
-          <w:lang w:val="en-US"/>
-        </w:rPr>
-        <w:t xml:space="preserve">    private String </w:t>
-      </w:r>
-      <w:proofErr w:type="spellStart"/>
-      <w:r>
-        <w:rPr>
-          <w:rFonts w:ascii="Arial" w:hAnsi="Arial" w:cs="Arial"/>
-          <w:lang w:val="en-US"/>
-        </w:rPr>
-        <w:t>deliveryCity</w:t>
-      </w:r>
-      <w:proofErr w:type="spellEnd"/>
-      <w:r>
-        <w:rPr>
-          <w:rFonts w:ascii="Arial" w:hAnsi="Arial" w:cs="Arial"/>
-          <w:lang w:val="en-US"/>
-        </w:rPr>
-        <w:t>;</w:t>
-      </w:r>
-    </w:p>
-    <w:p>
-      <w:pPr>
-        <w:spacing w:after="0"/>
-        <w:rPr>
-          <w:rFonts w:ascii="Arial" w:hAnsi="Arial" w:cs="Arial"/>
-          <w:lang w:val="en-US"/>
-        </w:rPr>
-      </w:pPr>
-      <w:r>
-        <w:rPr>
-          <w:rFonts w:ascii="Arial" w:hAnsi="Arial" w:cs="Arial"/>
-          <w:lang w:val="en-US"/>
-        </w:rPr>
-        <w:t xml:space="preserve">    private String </w:t>
-      </w:r>
-      <w:proofErr w:type="spellStart"/>
-      <w:r>
-        <w:rPr>
-          <w:rFonts w:ascii="Arial" w:hAnsi="Arial" w:cs="Arial"/>
-          <w:lang w:val="en-US"/>
-        </w:rPr>
-        <w:t>deliveryState</w:t>
-      </w:r>
-      <w:proofErr w:type="spellEnd"/>
-      <w:r>
-        <w:rPr>
-          <w:rFonts w:ascii="Arial" w:hAnsi="Arial" w:cs="Arial"/>
-          <w:lang w:val="en-US"/>
-        </w:rPr>
-        <w:t>;</w:t>
-      </w:r>
-    </w:p>
-    <w:p>
-      <w:pPr>
-        <w:spacing w:after="0"/>
-        <w:rPr>
-          <w:rFonts w:ascii="Arial" w:hAnsi="Arial" w:cs="Arial"/>
-          <w:lang w:val="en-US"/>
-        </w:rPr>
-      </w:pPr>
-      <w:r>
-        <w:rPr>
-          <w:rFonts w:ascii="Arial" w:hAnsi="Arial" w:cs="Arial"/>
-          <w:lang w:val="en-US"/>
-        </w:rPr>
-        <w:t xml:space="preserve">    private String </w:t>
-      </w:r>
-      <w:proofErr w:type="spellStart"/>
-      <w:r>
-        <w:rPr>
-          <w:rFonts w:ascii="Arial" w:hAnsi="Arial" w:cs="Arial"/>
-          <w:lang w:val="en-US"/>
-        </w:rPr>
-        <w:t>deliveryZip</w:t>
-      </w:r>
-      <w:proofErr w:type="spellEnd"/>
-      <w:r>
-        <w:rPr>
-          <w:rFonts w:ascii="Arial" w:hAnsi="Arial" w:cs="Arial"/>
-          <w:lang w:val="en-US"/>
-        </w:rPr>
-        <w:t>;</w:t>
+    </w:p>
+    <w:p>
+      <w:pPr>
+        <w:spacing w:after="0"/>
+        <w:rPr>
+          <w:rFonts w:ascii="Arial" w:hAnsi="Arial" w:cs="Arial"/>
+          <w:lang w:val="en-US"/>
+        </w:rPr>
+      </w:pPr>
+      <w:r>
+        <w:rPr>
+          <w:rFonts w:ascii="Arial" w:hAnsi="Arial" w:cs="Arial"/>
+          <w:lang w:val="en-US"/>
+        </w:rPr>
+        <w:t>public class OrderPatchRequest {</w:t>
+      </w:r>
+    </w:p>
+    <w:p>
+      <w:pPr>
+        <w:spacing w:after="0"/>
+        <w:rPr>
+          <w:rFonts w:ascii="Arial" w:hAnsi="Arial" w:cs="Arial"/>
+          <w:lang w:val="en-US"/>
+        </w:rPr>
+      </w:pPr>
+      <w:r>
+        <w:rPr>
+          <w:rFonts w:ascii="Arial" w:hAnsi="Arial" w:cs="Arial"/>
+          <w:lang w:val="en-US"/>
+        </w:rPr>
+        <w:t xml:space="preserve">    private String deliveryName;</w:t>
+      </w:r>
+    </w:p>
+    <w:p>
+      <w:pPr>
+        <w:spacing w:after="0"/>
+        <w:rPr>
+          <w:rFonts w:ascii="Arial" w:hAnsi="Arial" w:cs="Arial"/>
+          <w:lang w:val="en-US"/>
+        </w:rPr>
+      </w:pPr>
+      <w:r>
+        <w:rPr>
+          <w:rFonts w:ascii="Arial" w:hAnsi="Arial" w:cs="Arial"/>
+          <w:lang w:val="en-US"/>
+        </w:rPr>
+        <w:t xml:space="preserve">    private String deliveryStreet;</w:t>
+      </w:r>
+    </w:p>
+    <w:p>
+      <w:pPr>
+        <w:spacing w:after="0"/>
+        <w:rPr>
+          <w:rFonts w:ascii="Arial" w:hAnsi="Arial" w:cs="Arial"/>
+          <w:lang w:val="en-US"/>
+        </w:rPr>
+      </w:pPr>
+      <w:r>
+        <w:rPr>
+          <w:rFonts w:ascii="Arial" w:hAnsi="Arial" w:cs="Arial"/>
+          <w:lang w:val="en-US"/>
+        </w:rPr>
+        <w:t xml:space="preserve">    private String deliveryCity;</w:t>
+      </w:r>
+    </w:p>
+    <w:p>
+      <w:pPr>
+        <w:spacing w:after="0"/>
+        <w:rPr>
+          <w:rFonts w:ascii="Arial" w:hAnsi="Arial" w:cs="Arial"/>
+          <w:lang w:val="en-US"/>
+        </w:rPr>
+      </w:pPr>
+      <w:r>
+        <w:rPr>
+          <w:rFonts w:ascii="Arial" w:hAnsi="Arial" w:cs="Arial"/>
+          <w:lang w:val="en-US"/>
+        </w:rPr>
+        <w:t xml:space="preserve">    private String deliveryState;</w:t>
+      </w:r>
+    </w:p>
+    <w:p>
+      <w:pPr>
+        <w:spacing w:after="0"/>
+        <w:rPr>
+          <w:rFonts w:ascii="Arial" w:hAnsi="Arial" w:cs="Arial"/>
+          <w:lang w:val="en-US"/>
+        </w:rPr>
+      </w:pPr>
+      <w:r>
+        <w:rPr>
+          <w:rFonts w:ascii="Arial" w:hAnsi="Arial" w:cs="Arial"/>
+          <w:lang w:val="en-US"/>
+        </w:rPr>
+        <w:t xml:space="preserve">    private String deliveryZip;</w:t>
       </w:r>
     </w:p>
     <w:p>
@@ -3730,15 +2456,7 @@
     </w:p>
     <w:p>
       <w:r>
-        <w:t xml:space="preserve">Utilizando el </w:t>
-      </w:r>
-      <w:proofErr w:type="spellStart"/>
-      <w:r>
-        <w:t>patch</w:t>
-      </w:r>
-      <w:proofErr w:type="spellEnd"/>
-      <w:r>
-        <w:t xml:space="preserve"> correctamente:</w:t>
+        <w:t>Utilizando el patch correctamente:</w:t>
       </w:r>
     </w:p>
     <w:p>
@@ -3918,7 +2636,6 @@
       <w:r>
         <w:t xml:space="preserve">Verificando que </w:t>
       </w:r>
-      <w:proofErr w:type="spellStart"/>
       <w:r>
         <w:rPr>
           <w:i/>
@@ -3926,11 +2643,9 @@
         </w:rPr>
         <w:t>user</w:t>
       </w:r>
-      <w:proofErr w:type="spellEnd"/>
       <w:r>
         <w:t xml:space="preserve">, </w:t>
       </w:r>
-      <w:proofErr w:type="spellStart"/>
       <w:r>
         <w:rPr>
           <w:i/>
@@ -3938,11 +2653,9 @@
         </w:rPr>
         <w:t>ccNumber</w:t>
       </w:r>
-      <w:proofErr w:type="spellEnd"/>
       <w:r>
         <w:t xml:space="preserve"> y </w:t>
       </w:r>
-      <w:proofErr w:type="spellStart"/>
       <w:r>
         <w:rPr>
           <w:i/>
@@ -3950,7 +2663,6 @@
         </w:rPr>
         <w:t>ccCCV</w:t>
       </w:r>
-      <w:proofErr w:type="spellEnd"/>
       <w:r>
         <w:t xml:space="preserve"> no fueron modificados:</w:t>
       </w:r>
@@ -4012,15 +2724,7 @@
     </w:p>
     <w:p>
       <w:r>
-        <w:t xml:space="preserve">Realizando </w:t>
-      </w:r>
-      <w:proofErr w:type="spellStart"/>
-      <w:r>
-        <w:t>patch</w:t>
-      </w:r>
-      <w:proofErr w:type="spellEnd"/>
-      <w:r>
-        <w:t xml:space="preserve"> a un ID inexistente:</w:t>
+        <w:t>Realizando patch a un ID inexistente:</w:t>
       </w:r>
     </w:p>
     <w:p>
@@ -4078,8 +2782,883 @@
       </w:r>
     </w:p>
     <w:p/>
-    <w:p/>
-    <w:p/>
+    <w:p>
+      <w:pPr>
+        <w:pStyle w:val="Ttulo2"/>
+      </w:pPr>
+      <w:bookmarkStart w:id="5" w:name="_Toc240624444"/>
+      <w:r>
+        <w:lastRenderedPageBreak/>
+        <w:t>TC-05 – PUT y DELETE de órdenes con identidad consistente</w:t>
+      </w:r>
+      <w:bookmarkEnd w:id="5"/>
+    </w:p>
+    <w:p>
+      <w:r>
+        <w:t>OrderApiController.java</w:t>
+      </w:r>
+    </w:p>
+    <w:p>
+      <w:r>
+        <w:t>Put</w:t>
+      </w:r>
+    </w:p>
+    <w:p>
+      <w:pPr>
+        <w:spacing w:after="0"/>
+        <w:rPr>
+          <w:rFonts w:ascii="Arial" w:hAnsi="Arial" w:cs="Arial"/>
+        </w:rPr>
+      </w:pPr>
+      <w:r>
+        <w:rPr>
+          <w:rFonts w:ascii="Arial" w:hAnsi="Arial" w:cs="Arial"/>
+        </w:rPr>
+        <w:t xml:space="preserve">  /*</w:t>
+      </w:r>
+    </w:p>
+    <w:p>
+      <w:pPr>
+        <w:spacing w:after="0"/>
+        <w:rPr>
+          <w:rFonts w:ascii="Arial" w:hAnsi="Arial" w:cs="Arial"/>
+        </w:rPr>
+      </w:pPr>
+      <w:r>
+        <w:rPr>
+          <w:rFonts w:ascii="Arial" w:hAnsi="Arial" w:cs="Arial"/>
+        </w:rPr>
+        <w:t xml:space="preserve">   * TC-05 - PUT y DELETE de ordenes con identidad consistente</w:t>
+      </w:r>
+    </w:p>
+    <w:p>
+      <w:pPr>
+        <w:spacing w:after="0"/>
+        <w:rPr>
+          <w:rFonts w:ascii="Arial" w:hAnsi="Arial" w:cs="Arial"/>
+          <w:lang w:val="en-US"/>
+        </w:rPr>
+      </w:pPr>
+      <w:r>
+        <w:rPr>
+          <w:rFonts w:ascii="Arial" w:hAnsi="Arial" w:cs="Arial"/>
+        </w:rPr>
+        <w:t xml:space="preserve">   </w:t>
+      </w:r>
+      <w:r>
+        <w:rPr>
+          <w:rFonts w:ascii="Arial" w:hAnsi="Arial" w:cs="Arial"/>
+          <w:lang w:val="en-US"/>
+        </w:rPr>
+        <w:t>* caso PUT</w:t>
+      </w:r>
+    </w:p>
+    <w:p>
+      <w:pPr>
+        <w:spacing w:after="0"/>
+        <w:rPr>
+          <w:rFonts w:ascii="Arial" w:hAnsi="Arial" w:cs="Arial"/>
+          <w:lang w:val="en-US"/>
+        </w:rPr>
+      </w:pPr>
+      <w:r>
+        <w:rPr>
+          <w:rFonts w:ascii="Arial" w:hAnsi="Arial" w:cs="Arial"/>
+          <w:lang w:val="en-US"/>
+        </w:rPr>
+        <w:t xml:space="preserve">   */</w:t>
+      </w:r>
+    </w:p>
+    <w:p>
+      <w:pPr>
+        <w:spacing w:after="0"/>
+        <w:rPr>
+          <w:rFonts w:ascii="Arial" w:hAnsi="Arial" w:cs="Arial"/>
+          <w:lang w:val="en-US"/>
+        </w:rPr>
+      </w:pPr>
+      <w:r>
+        <w:rPr>
+          <w:rFonts w:ascii="Arial" w:hAnsi="Arial" w:cs="Arial"/>
+          <w:lang w:val="en-US"/>
+        </w:rPr>
+        <w:t xml:space="preserve">  @PutMapping(path = "/{orderId}", consumes = "application/json")</w:t>
+      </w:r>
+    </w:p>
+    <w:p>
+      <w:pPr>
+        <w:spacing w:after="0"/>
+        <w:rPr>
+          <w:rFonts w:ascii="Arial" w:hAnsi="Arial" w:cs="Arial"/>
+          <w:lang w:val="en-US"/>
+        </w:rPr>
+      </w:pPr>
+      <w:r>
+        <w:rPr>
+          <w:rFonts w:ascii="Arial" w:hAnsi="Arial" w:cs="Arial"/>
+          <w:lang w:val="en-US"/>
+        </w:rPr>
+        <w:t xml:space="preserve">  public Mono&lt;ResponseEntity&lt;TacoOrder&gt;&gt; putOrder(@PathVariable("orderId") String orderId,</w:t>
+      </w:r>
+    </w:p>
+    <w:p>
+      <w:pPr>
+        <w:spacing w:after="0"/>
+        <w:rPr>
+          <w:rFonts w:ascii="Arial" w:hAnsi="Arial" w:cs="Arial"/>
+          <w:lang w:val="en-US"/>
+        </w:rPr>
+      </w:pPr>
+      <w:r>
+        <w:rPr>
+          <w:rFonts w:ascii="Arial" w:hAnsi="Arial" w:cs="Arial"/>
+          <w:lang w:val="en-US"/>
+        </w:rPr>
+        <w:t xml:space="preserve">      @RequestBody TacoOrder order) {</w:t>
+      </w:r>
+    </w:p>
+    <w:p>
+      <w:pPr>
+        <w:spacing w:after="0"/>
+        <w:rPr>
+          <w:rFonts w:ascii="Arial" w:hAnsi="Arial" w:cs="Arial"/>
+          <w:lang w:val="en-US"/>
+        </w:rPr>
+      </w:pPr>
+      <w:r>
+        <w:rPr>
+          <w:rFonts w:ascii="Arial" w:hAnsi="Arial" w:cs="Arial"/>
+          <w:lang w:val="en-US"/>
+        </w:rPr>
+        <w:t xml:space="preserve">    return repo.findById(orderId)</w:t>
+      </w:r>
+    </w:p>
+    <w:p>
+      <w:pPr>
+        <w:spacing w:after="0"/>
+        <w:rPr>
+          <w:rFonts w:ascii="Arial" w:hAnsi="Arial" w:cs="Arial"/>
+          <w:lang w:val="en-US"/>
+        </w:rPr>
+      </w:pPr>
+      <w:r>
+        <w:rPr>
+          <w:rFonts w:ascii="Arial" w:hAnsi="Arial" w:cs="Arial"/>
+          <w:lang w:val="en-US"/>
+        </w:rPr>
+        <w:t xml:space="preserve">        .map(existingOrder -&gt; {</w:t>
+      </w:r>
+    </w:p>
+    <w:p>
+      <w:pPr>
+        <w:spacing w:after="0"/>
+        <w:rPr>
+          <w:rFonts w:ascii="Arial" w:hAnsi="Arial" w:cs="Arial"/>
+          <w:lang w:val="en-US"/>
+        </w:rPr>
+      </w:pPr>
+      <w:r>
+        <w:rPr>
+          <w:rFonts w:ascii="Arial" w:hAnsi="Arial" w:cs="Arial"/>
+          <w:lang w:val="en-US"/>
+        </w:rPr>
+        <w:t xml:space="preserve">          existingOrder.setDeliveryName(order.getDeliveryName());</w:t>
+      </w:r>
+    </w:p>
+    <w:p>
+      <w:pPr>
+        <w:spacing w:after="0"/>
+        <w:rPr>
+          <w:rFonts w:ascii="Arial" w:hAnsi="Arial" w:cs="Arial"/>
+          <w:lang w:val="en-US"/>
+        </w:rPr>
+      </w:pPr>
+      <w:r>
+        <w:rPr>
+          <w:rFonts w:ascii="Arial" w:hAnsi="Arial" w:cs="Arial"/>
+          <w:lang w:val="en-US"/>
+        </w:rPr>
+        <w:t xml:space="preserve">          existingOrder.setDeliveryStreet(order.getDeliveryStreet());</w:t>
+      </w:r>
+    </w:p>
+    <w:p>
+      <w:pPr>
+        <w:spacing w:after="0"/>
+        <w:rPr>
+          <w:rFonts w:ascii="Arial" w:hAnsi="Arial" w:cs="Arial"/>
+          <w:lang w:val="en-US"/>
+        </w:rPr>
+      </w:pPr>
+      <w:r>
+        <w:rPr>
+          <w:rFonts w:ascii="Arial" w:hAnsi="Arial" w:cs="Arial"/>
+          <w:lang w:val="en-US"/>
+        </w:rPr>
+        <w:t xml:space="preserve">          existingOrder.setDeliveryCity(order.getDeliveryCity());</w:t>
+      </w:r>
+    </w:p>
+    <w:p>
+      <w:pPr>
+        <w:spacing w:after="0"/>
+        <w:rPr>
+          <w:rFonts w:ascii="Arial" w:hAnsi="Arial" w:cs="Arial"/>
+          <w:lang w:val="en-US"/>
+        </w:rPr>
+      </w:pPr>
+      <w:r>
+        <w:rPr>
+          <w:rFonts w:ascii="Arial" w:hAnsi="Arial" w:cs="Arial"/>
+          <w:lang w:val="en-US"/>
+        </w:rPr>
+        <w:t xml:space="preserve">          existingOrder.setDeliveryState(order.getDeliveryState());</w:t>
+      </w:r>
+    </w:p>
+    <w:p>
+      <w:pPr>
+        <w:spacing w:after="0"/>
+        <w:rPr>
+          <w:rFonts w:ascii="Arial" w:hAnsi="Arial" w:cs="Arial"/>
+          <w:lang w:val="en-US"/>
+        </w:rPr>
+      </w:pPr>
+      <w:r>
+        <w:rPr>
+          <w:rFonts w:ascii="Arial" w:hAnsi="Arial" w:cs="Arial"/>
+          <w:lang w:val="en-US"/>
+        </w:rPr>
+        <w:t xml:space="preserve">          existingOrder.setDeliveryZip(order.getDeliveryZip());</w:t>
+      </w:r>
+    </w:p>
+    <w:p>
+      <w:pPr>
+        <w:spacing w:after="0"/>
+        <w:rPr>
+          <w:rFonts w:ascii="Arial" w:hAnsi="Arial" w:cs="Arial"/>
+          <w:lang w:val="en-US"/>
+        </w:rPr>
+      </w:pPr>
+      <w:r>
+        <w:rPr>
+          <w:rFonts w:ascii="Arial" w:hAnsi="Arial" w:cs="Arial"/>
+          <w:lang w:val="en-US"/>
+        </w:rPr>
+        <w:t xml:space="preserve">          existingOrder.setTacos(order.getTacos());</w:t>
+      </w:r>
+    </w:p>
+    <w:p>
+      <w:pPr>
+        <w:spacing w:after="0"/>
+        <w:rPr>
+          <w:rFonts w:ascii="Arial" w:hAnsi="Arial" w:cs="Arial"/>
+          <w:lang w:val="en-US"/>
+        </w:rPr>
+      </w:pPr>
+      <w:r>
+        <w:rPr>
+          <w:rFonts w:ascii="Arial" w:hAnsi="Arial" w:cs="Arial"/>
+          <w:lang w:val="en-US"/>
+        </w:rPr>
+        <w:t xml:space="preserve">          return existingOrder;</w:t>
+      </w:r>
+    </w:p>
+    <w:p>
+      <w:pPr>
+        <w:spacing w:after="0"/>
+        <w:rPr>
+          <w:rFonts w:ascii="Arial" w:hAnsi="Arial" w:cs="Arial"/>
+          <w:lang w:val="en-US"/>
+        </w:rPr>
+      </w:pPr>
+      <w:r>
+        <w:rPr>
+          <w:rFonts w:ascii="Arial" w:hAnsi="Arial" w:cs="Arial"/>
+          <w:lang w:val="en-US"/>
+        </w:rPr>
+        <w:t xml:space="preserve">        })</w:t>
+      </w:r>
+    </w:p>
+    <w:p>
+      <w:pPr>
+        <w:spacing w:after="0"/>
+        <w:rPr>
+          <w:rFonts w:ascii="Arial" w:hAnsi="Arial" w:cs="Arial"/>
+          <w:lang w:val="en-US"/>
+        </w:rPr>
+      </w:pPr>
+      <w:r>
+        <w:rPr>
+          <w:rFonts w:ascii="Arial" w:hAnsi="Arial" w:cs="Arial"/>
+          <w:lang w:val="en-US"/>
+        </w:rPr>
+        <w:t xml:space="preserve">        .flatMap(repo::save)</w:t>
+      </w:r>
+    </w:p>
+    <w:p>
+      <w:pPr>
+        <w:spacing w:after="0"/>
+        <w:rPr>
+          <w:rFonts w:ascii="Arial" w:hAnsi="Arial" w:cs="Arial"/>
+          <w:lang w:val="en-US"/>
+        </w:rPr>
+      </w:pPr>
+      <w:r>
+        <w:rPr>
+          <w:rFonts w:ascii="Arial" w:hAnsi="Arial" w:cs="Arial"/>
+          <w:lang w:val="en-US"/>
+        </w:rPr>
+        <w:t xml:space="preserve">        .map(ResponseEntity::ok)</w:t>
+      </w:r>
+    </w:p>
+    <w:p>
+      <w:pPr>
+        <w:spacing w:after="0"/>
+        <w:rPr>
+          <w:rFonts w:ascii="Arial" w:hAnsi="Arial" w:cs="Arial"/>
+          <w:lang w:val="en-US"/>
+        </w:rPr>
+      </w:pPr>
+      <w:r>
+        <w:rPr>
+          <w:rFonts w:ascii="Arial" w:hAnsi="Arial" w:cs="Arial"/>
+          <w:lang w:val="en-US"/>
+        </w:rPr>
+        <w:t xml:space="preserve">        .defaultIfEmpty(ResponseEntity.notFound().build());</w:t>
+      </w:r>
+    </w:p>
+    <w:p>
+      <w:pPr>
+        <w:spacing w:after="0"/>
+        <w:rPr>
+          <w:rFonts w:ascii="Arial" w:hAnsi="Arial" w:cs="Arial"/>
+          <w:lang w:val="en-US"/>
+        </w:rPr>
+      </w:pPr>
+      <w:r>
+        <w:rPr>
+          <w:rFonts w:ascii="Arial" w:hAnsi="Arial" w:cs="Arial"/>
+          <w:lang w:val="en-US"/>
+        </w:rPr>
+        <w:t xml:space="preserve">  }</w:t>
+      </w:r>
+    </w:p>
+    <w:p>
+      <w:pPr>
+        <w:rPr>
+          <w:rFonts w:ascii="Arial" w:hAnsi="Arial" w:cs="Arial"/>
+          <w:lang w:val="en-US"/>
+        </w:rPr>
+      </w:pPr>
+      <w:r>
+        <w:rPr>
+          <w:rFonts w:ascii="Arial" w:hAnsi="Arial" w:cs="Arial"/>
+          <w:lang w:val="en-US"/>
+        </w:rPr>
+        <w:t xml:space="preserve">  // TC-05 - Fin caso PUT</w:t>
+      </w:r>
+    </w:p>
+    <w:p>
+      <w:r>
+        <w:t>Delete</w:t>
+      </w:r>
+    </w:p>
+    <w:p>
+      <w:pPr>
+        <w:spacing w:after="0"/>
+        <w:rPr>
+          <w:rFonts w:ascii="Arial" w:hAnsi="Arial" w:cs="Arial"/>
+        </w:rPr>
+      </w:pPr>
+      <w:r>
+        <w:rPr>
+          <w:rFonts w:ascii="Arial" w:hAnsi="Arial" w:cs="Arial"/>
+        </w:rPr>
+        <w:t xml:space="preserve">  /*</w:t>
+      </w:r>
+    </w:p>
+    <w:p>
+      <w:pPr>
+        <w:spacing w:after="0"/>
+        <w:rPr>
+          <w:rFonts w:ascii="Arial" w:hAnsi="Arial" w:cs="Arial"/>
+        </w:rPr>
+      </w:pPr>
+      <w:r>
+        <w:rPr>
+          <w:rFonts w:ascii="Arial" w:hAnsi="Arial" w:cs="Arial"/>
+        </w:rPr>
+        <w:t xml:space="preserve">   * TC-05 - PUT y DELETE de ordenes con identidad consistente</w:t>
+      </w:r>
+    </w:p>
+    <w:p>
+      <w:pPr>
+        <w:spacing w:after="0"/>
+        <w:rPr>
+          <w:rFonts w:ascii="Arial" w:hAnsi="Arial" w:cs="Arial"/>
+          <w:lang w:val="en-US"/>
+        </w:rPr>
+      </w:pPr>
+      <w:r>
+        <w:rPr>
+          <w:rFonts w:ascii="Arial" w:hAnsi="Arial" w:cs="Arial"/>
+        </w:rPr>
+        <w:t xml:space="preserve">   </w:t>
+      </w:r>
+      <w:r>
+        <w:rPr>
+          <w:rFonts w:ascii="Arial" w:hAnsi="Arial" w:cs="Arial"/>
+          <w:lang w:val="en-US"/>
+        </w:rPr>
+        <w:t>* caso DELETE</w:t>
+      </w:r>
+    </w:p>
+    <w:p>
+      <w:pPr>
+        <w:spacing w:after="0"/>
+        <w:rPr>
+          <w:rFonts w:ascii="Arial" w:hAnsi="Arial" w:cs="Arial"/>
+          <w:lang w:val="en-US"/>
+        </w:rPr>
+      </w:pPr>
+      <w:r>
+        <w:rPr>
+          <w:rFonts w:ascii="Arial" w:hAnsi="Arial" w:cs="Arial"/>
+          <w:lang w:val="en-US"/>
+        </w:rPr>
+        <w:t xml:space="preserve">   */</w:t>
+      </w:r>
+    </w:p>
+    <w:p>
+      <w:pPr>
+        <w:spacing w:after="0"/>
+        <w:rPr>
+          <w:rFonts w:ascii="Arial" w:hAnsi="Arial" w:cs="Arial"/>
+          <w:lang w:val="en-US"/>
+        </w:rPr>
+      </w:pPr>
+      <w:r>
+        <w:rPr>
+          <w:rFonts w:ascii="Arial" w:hAnsi="Arial" w:cs="Arial"/>
+          <w:lang w:val="en-US"/>
+        </w:rPr>
+        <w:t xml:space="preserve">  @DeleteMapping("/{orderId}")</w:t>
+      </w:r>
+    </w:p>
+    <w:p>
+      <w:pPr>
+        <w:spacing w:after="0"/>
+        <w:rPr>
+          <w:rFonts w:ascii="Arial" w:hAnsi="Arial" w:cs="Arial"/>
+          <w:lang w:val="en-US"/>
+        </w:rPr>
+      </w:pPr>
+      <w:r>
+        <w:rPr>
+          <w:rFonts w:ascii="Arial" w:hAnsi="Arial" w:cs="Arial"/>
+          <w:lang w:val="en-US"/>
+        </w:rPr>
+        <w:t xml:space="preserve">  public Mono&lt;ResponseEntity&lt;Void&gt;&gt; deleteOrder(@PathVariable("orderId") String orderId) {</w:t>
+      </w:r>
+    </w:p>
+    <w:p>
+      <w:pPr>
+        <w:spacing w:after="0"/>
+        <w:rPr>
+          <w:rFonts w:ascii="Arial" w:hAnsi="Arial" w:cs="Arial"/>
+          <w:lang w:val="en-US"/>
+        </w:rPr>
+      </w:pPr>
+      <w:r>
+        <w:rPr>
+          <w:rFonts w:ascii="Arial" w:hAnsi="Arial" w:cs="Arial"/>
+          <w:lang w:val="en-US"/>
+        </w:rPr>
+        <w:t xml:space="preserve">    return repo.findById(orderId)</w:t>
+      </w:r>
+    </w:p>
+    <w:p>
+      <w:pPr>
+        <w:spacing w:after="0"/>
+        <w:rPr>
+          <w:rFonts w:ascii="Arial" w:hAnsi="Arial" w:cs="Arial"/>
+          <w:lang w:val="en-US"/>
+        </w:rPr>
+      </w:pPr>
+      <w:r>
+        <w:rPr>
+          <w:rFonts w:ascii="Arial" w:hAnsi="Arial" w:cs="Arial"/>
+          <w:lang w:val="en-US"/>
+        </w:rPr>
+        <w:t xml:space="preserve">        .flatMap(order -&gt; repo.deleteById(order.getId())</w:t>
+      </w:r>
+    </w:p>
+    <w:p>
+      <w:pPr>
+        <w:spacing w:after="0"/>
+        <w:rPr>
+          <w:rFonts w:ascii="Arial" w:hAnsi="Arial" w:cs="Arial"/>
+          <w:lang w:val="en-US"/>
+        </w:rPr>
+      </w:pPr>
+      <w:r>
+        <w:rPr>
+          <w:rFonts w:ascii="Arial" w:hAnsi="Arial" w:cs="Arial"/>
+          <w:lang w:val="en-US"/>
+        </w:rPr>
+        <w:t xml:space="preserve">            .then(Mono.just(ResponseEntity.noContent().&lt;Void&gt;build())))</w:t>
+      </w:r>
+    </w:p>
+    <w:p>
+      <w:pPr>
+        <w:spacing w:after="0"/>
+        <w:rPr>
+          <w:rFonts w:ascii="Arial" w:hAnsi="Arial" w:cs="Arial"/>
+          <w:lang w:val="en-US"/>
+        </w:rPr>
+      </w:pPr>
+      <w:r>
+        <w:rPr>
+          <w:rFonts w:ascii="Arial" w:hAnsi="Arial" w:cs="Arial"/>
+          <w:lang w:val="en-US"/>
+        </w:rPr>
+        <w:t xml:space="preserve">        .defaultIfEmpty(ResponseEntity.notFound().build());</w:t>
+      </w:r>
+    </w:p>
+    <w:p>
+      <w:pPr>
+        <w:spacing w:after="0"/>
+        <w:rPr>
+          <w:rFonts w:ascii="Arial" w:hAnsi="Arial" w:cs="Arial"/>
+          <w:lang w:val="en-US"/>
+        </w:rPr>
+      </w:pPr>
+      <w:r>
+        <w:rPr>
+          <w:rFonts w:ascii="Arial" w:hAnsi="Arial" w:cs="Arial"/>
+          <w:lang w:val="en-US"/>
+        </w:rPr>
+        <w:t xml:space="preserve">  }</w:t>
+      </w:r>
+    </w:p>
+    <w:p>
+      <w:pPr>
+        <w:rPr>
+          <w:rFonts w:ascii="Arial" w:hAnsi="Arial" w:cs="Arial"/>
+          <w:lang w:val="en-US"/>
+        </w:rPr>
+      </w:pPr>
+      <w:r>
+        <w:rPr>
+          <w:rFonts w:ascii="Arial" w:hAnsi="Arial" w:cs="Arial"/>
+          <w:lang w:val="en-US"/>
+        </w:rPr>
+        <w:t xml:space="preserve">  // TC-05 - Fin caso DELETE</w:t>
+      </w:r>
+    </w:p>
+    <w:p>
+      <w:pPr>
+        <w:rPr>
+          <w:lang w:val="en-US"/>
+        </w:rPr>
+      </w:pPr>
+    </w:p>
+    <w:p>
+      <w:r>
+        <w:t>Primero se crea una orden:</w:t>
+      </w:r>
+    </w:p>
+    <w:p>
+      <w:pPr>
+        <w:jc w:val="center"/>
+      </w:pPr>
+      <w:r>
+        <w:rPr>
+          <w:noProof/>
+        </w:rPr>
+        <w:lastRenderedPageBreak/>
+        <w:drawing>
+          <wp:inline distT="0" distB="0" distL="0" distR="0" wp14:anchorId="158D18B5" wp14:editId="18C26472">
+            <wp:extent cx="5655282" cy="3680460"/>
+            <wp:effectExtent l="0" t="0" r="3175" b="0"/>
+            <wp:docPr id="1231968606" name="Imagen 1"/>
+            <wp:cNvGraphicFramePr>
+              <a:graphicFrameLocks xmlns:a="http://schemas.openxmlformats.org/drawingml/2006/main" noChangeAspect="1"/>
+            </wp:cNvGraphicFramePr>
+            <a:graphic xmlns:a="http://schemas.openxmlformats.org/drawingml/2006/main">
+              <a:graphicData uri="http://schemas.openxmlformats.org/drawingml/2006/picture">
+                <pic:pic xmlns:pic="http://schemas.openxmlformats.org/drawingml/2006/picture">
+                  <pic:nvPicPr>
+                    <pic:cNvPr id="1231968606" name=""/>
+                    <pic:cNvPicPr/>
+                  </pic:nvPicPr>
+                  <pic:blipFill rotWithShape="1">
+                    <a:blip r:embed="rId22"/>
+                    <a:srcRect l="25256" t="8445"/>
+                    <a:stretch>
+                      <a:fillRect/>
+                    </a:stretch>
+                  </pic:blipFill>
+                  <pic:spPr bwMode="auto">
+                    <a:xfrm>
+                      <a:off x="0" y="0"/>
+                      <a:ext cx="5670314" cy="3690243"/>
+                    </a:xfrm>
+                    <a:prstGeom prst="rect">
+                      <a:avLst/>
+                    </a:prstGeom>
+                    <a:ln>
+                      <a:noFill/>
+                    </a:ln>
+                    <a:extLst>
+                      <a:ext uri="{53640926-AAD7-44D8-BBD7-CCE9431645EC}">
+                        <a14:shadowObscured xmlns:a14="http://schemas.microsoft.com/office/drawing/2010/main"/>
+                      </a:ext>
+                    </a:extLst>
+                  </pic:spPr>
+                </pic:pic>
+              </a:graphicData>
+            </a:graphic>
+          </wp:inline>
+        </w:drawing>
+      </w:r>
+    </w:p>
+    <w:p>
+      <w:r>
+        <w:t>Actualizando la orden con PUT:</w:t>
+      </w:r>
+    </w:p>
+    <w:p>
+      <w:pPr>
+        <w:jc w:val="center"/>
+      </w:pPr>
+      <w:r>
+        <w:rPr>
+          <w:noProof/>
+        </w:rPr>
+        <w:drawing>
+          <wp:inline distT="0" distB="0" distL="0" distR="0" wp14:anchorId="02BF0C7D" wp14:editId="68B8984E">
+            <wp:extent cx="5686431" cy="3688080"/>
+            <wp:effectExtent l="0" t="0" r="9525" b="7620"/>
+            <wp:docPr id="1420088098" name="Imagen 1"/>
+            <wp:cNvGraphicFramePr>
+              <a:graphicFrameLocks xmlns:a="http://schemas.openxmlformats.org/drawingml/2006/main" noChangeAspect="1"/>
+            </wp:cNvGraphicFramePr>
+            <a:graphic xmlns:a="http://schemas.openxmlformats.org/drawingml/2006/main">
+              <a:graphicData uri="http://schemas.openxmlformats.org/drawingml/2006/picture">
+                <pic:pic xmlns:pic="http://schemas.openxmlformats.org/drawingml/2006/picture">
+                  <pic:nvPicPr>
+                    <pic:cNvPr id="1420088098" name=""/>
+                    <pic:cNvPicPr/>
+                  </pic:nvPicPr>
+                  <pic:blipFill rotWithShape="1">
+                    <a:blip r:embed="rId23"/>
+                    <a:srcRect l="25000" t="8445"/>
+                    <a:stretch>
+                      <a:fillRect/>
+                    </a:stretch>
+                  </pic:blipFill>
+                  <pic:spPr bwMode="auto">
+                    <a:xfrm>
+                      <a:off x="0" y="0"/>
+                      <a:ext cx="5695331" cy="3693852"/>
+                    </a:xfrm>
+                    <a:prstGeom prst="rect">
+                      <a:avLst/>
+                    </a:prstGeom>
+                    <a:ln>
+                      <a:noFill/>
+                    </a:ln>
+                    <a:extLst>
+                      <a:ext uri="{53640926-AAD7-44D8-BBD7-CCE9431645EC}">
+                        <a14:shadowObscured xmlns:a14="http://schemas.microsoft.com/office/drawing/2010/main"/>
+                      </a:ext>
+                    </a:extLst>
+                  </pic:spPr>
+                </pic:pic>
+              </a:graphicData>
+            </a:graphic>
+          </wp:inline>
+        </w:drawing>
+      </w:r>
+    </w:p>
+    <w:p>
+      <w:r>
+        <w:t>Colocando datos que no se pueden modificar:</w:t>
+      </w:r>
+    </w:p>
+    <w:p>
+      <w:pPr>
+        <w:jc w:val="center"/>
+      </w:pPr>
+      <w:r>
+        <w:rPr>
+          <w:noProof/>
+        </w:rPr>
+        <w:lastRenderedPageBreak/>
+        <w:drawing>
+          <wp:inline distT="0" distB="0" distL="0" distR="0" wp14:anchorId="34517C14" wp14:editId="1E731467">
+            <wp:extent cx="5717968" cy="2956560"/>
+            <wp:effectExtent l="0" t="0" r="0" b="0"/>
+            <wp:docPr id="1426260485" name="Imagen 1"/>
+            <wp:cNvGraphicFramePr>
+              <a:graphicFrameLocks xmlns:a="http://schemas.openxmlformats.org/drawingml/2006/main" noChangeAspect="1"/>
+            </wp:cNvGraphicFramePr>
+            <a:graphic xmlns:a="http://schemas.openxmlformats.org/drawingml/2006/main">
+              <a:graphicData uri="http://schemas.openxmlformats.org/drawingml/2006/picture">
+                <pic:pic xmlns:pic="http://schemas.openxmlformats.org/drawingml/2006/picture">
+                  <pic:nvPicPr>
+                    <pic:cNvPr id="1426260485" name=""/>
+                    <pic:cNvPicPr/>
+                  </pic:nvPicPr>
+                  <pic:blipFill rotWithShape="1">
+                    <a:blip r:embed="rId24"/>
+                    <a:srcRect l="24872" t="7963" b="18922"/>
+                    <a:stretch>
+                      <a:fillRect/>
+                    </a:stretch>
+                  </pic:blipFill>
+                  <pic:spPr bwMode="auto">
+                    <a:xfrm>
+                      <a:off x="0" y="0"/>
+                      <a:ext cx="5729793" cy="2962674"/>
+                    </a:xfrm>
+                    <a:prstGeom prst="rect">
+                      <a:avLst/>
+                    </a:prstGeom>
+                    <a:ln>
+                      <a:noFill/>
+                    </a:ln>
+                    <a:extLst>
+                      <a:ext uri="{53640926-AAD7-44D8-BBD7-CCE9431645EC}">
+                        <a14:shadowObscured xmlns:a14="http://schemas.microsoft.com/office/drawing/2010/main"/>
+                      </a:ext>
+                    </a:extLst>
+                  </pic:spPr>
+                </pic:pic>
+              </a:graphicData>
+            </a:graphic>
+          </wp:inline>
+        </w:drawing>
+      </w:r>
+    </w:p>
+    <w:p>
+      <w:r>
+        <w:t>Borrando la orden anterior:</w:t>
+      </w:r>
+    </w:p>
+    <w:p>
+      <w:pPr>
+        <w:jc w:val="center"/>
+      </w:pPr>
+      <w:r>
+        <w:rPr>
+          <w:noProof/>
+        </w:rPr>
+        <w:drawing>
+          <wp:inline distT="0" distB="0" distL="0" distR="0" wp14:anchorId="4E284970" wp14:editId="0DA708A5">
+            <wp:extent cx="5527076" cy="3581400"/>
+            <wp:effectExtent l="0" t="0" r="0" b="0"/>
+            <wp:docPr id="1077160291" name="Imagen 1"/>
+            <wp:cNvGraphicFramePr>
+              <a:graphicFrameLocks xmlns:a="http://schemas.openxmlformats.org/drawingml/2006/main" noChangeAspect="1"/>
+            </wp:cNvGraphicFramePr>
+            <a:graphic xmlns:a="http://schemas.openxmlformats.org/drawingml/2006/main">
+              <a:graphicData uri="http://schemas.openxmlformats.org/drawingml/2006/picture">
+                <pic:pic xmlns:pic="http://schemas.openxmlformats.org/drawingml/2006/picture">
+                  <pic:nvPicPr>
+                    <pic:cNvPr id="1077160291" name=""/>
+                    <pic:cNvPicPr/>
+                  </pic:nvPicPr>
+                  <pic:blipFill rotWithShape="1">
+                    <a:blip r:embed="rId25"/>
+                    <a:srcRect l="25128" t="8687"/>
+                    <a:stretch>
+                      <a:fillRect/>
+                    </a:stretch>
+                  </pic:blipFill>
+                  <pic:spPr bwMode="auto">
+                    <a:xfrm>
+                      <a:off x="0" y="0"/>
+                      <a:ext cx="5534553" cy="3586245"/>
+                    </a:xfrm>
+                    <a:prstGeom prst="rect">
+                      <a:avLst/>
+                    </a:prstGeom>
+                    <a:ln>
+                      <a:noFill/>
+                    </a:ln>
+                    <a:extLst>
+                      <a:ext uri="{53640926-AAD7-44D8-BBD7-CCE9431645EC}">
+                        <a14:shadowObscured xmlns:a14="http://schemas.microsoft.com/office/drawing/2010/main"/>
+                      </a:ext>
+                    </a:extLst>
+                  </pic:spPr>
+                </pic:pic>
+              </a:graphicData>
+            </a:graphic>
+          </wp:inline>
+        </w:drawing>
+      </w:r>
+    </w:p>
+    <w:p>
+      <w:r>
+        <w:t>Verificando si se eliminó:</w:t>
+      </w:r>
+    </w:p>
+    <w:p>
+      <w:pPr>
+        <w:jc w:val="center"/>
+      </w:pPr>
+      <w:r>
+        <w:rPr>
+          <w:noProof/>
+        </w:rPr>
+        <w:lastRenderedPageBreak/>
+        <w:drawing>
+          <wp:inline distT="0" distB="0" distL="0" distR="0" wp14:anchorId="1E603380" wp14:editId="53E97DC6">
+            <wp:extent cx="5524500" cy="3586368"/>
+            <wp:effectExtent l="0" t="0" r="0" b="0"/>
+            <wp:docPr id="331669655" name="Imagen 1"/>
+            <wp:cNvGraphicFramePr>
+              <a:graphicFrameLocks xmlns:a="http://schemas.openxmlformats.org/drawingml/2006/main" noChangeAspect="1"/>
+            </wp:cNvGraphicFramePr>
+            <a:graphic xmlns:a="http://schemas.openxmlformats.org/drawingml/2006/main">
+              <a:graphicData uri="http://schemas.openxmlformats.org/drawingml/2006/picture">
+                <pic:pic xmlns:pic="http://schemas.openxmlformats.org/drawingml/2006/picture">
+                  <pic:nvPicPr>
+                    <pic:cNvPr id="331669655" name=""/>
+                    <pic:cNvPicPr/>
+                  </pic:nvPicPr>
+                  <pic:blipFill rotWithShape="1">
+                    <a:blip r:embed="rId26"/>
+                    <a:srcRect l="24872" t="8205"/>
+                    <a:stretch>
+                      <a:fillRect/>
+                    </a:stretch>
+                  </pic:blipFill>
+                  <pic:spPr bwMode="auto">
+                    <a:xfrm>
+                      <a:off x="0" y="0"/>
+                      <a:ext cx="5534667" cy="3592968"/>
+                    </a:xfrm>
+                    <a:prstGeom prst="rect">
+                      <a:avLst/>
+                    </a:prstGeom>
+                    <a:ln>
+                      <a:noFill/>
+                    </a:ln>
+                    <a:extLst>
+                      <a:ext uri="{53640926-AAD7-44D8-BBD7-CCE9431645EC}">
+                        <a14:shadowObscured xmlns:a14="http://schemas.microsoft.com/office/drawing/2010/main"/>
+                      </a:ext>
+                    </a:extLst>
+                  </pic:spPr>
+                </pic:pic>
+              </a:graphicData>
+            </a:graphic>
+          </wp:inline>
+        </w:drawing>
+      </w:r>
+    </w:p>
     <w:p/>
     <w:p/>
     <w:sectPr>
@@ -4929,6 +4508,7 @@
   <w:style w:type="character" w:default="1" w:styleId="Fuentedeprrafopredeter">
     <w:name w:val="Default Paragraph Font"/>
     <w:uiPriority w:val="1"/>
+    <w:semiHidden/>
     <w:unhideWhenUsed/>
   </w:style>
   <w:style w:type="table" w:default="1" w:styleId="Tablanormal">

</xml_diff>